<commit_message>
main - Light/dark bg for foreground display. Parameter status text colours follow chart colours.
</commit_message>
<xml_diff>
--- a/docs/manual/BatteryCurrent_User_Manual_Preliminary.docx
+++ b/docs/manual/BatteryCurrent_User_Manual_Preliminary.docx
@@ -52,7 +52,12 @@
     </w:p>
     <w:p>
       <w:r>
-        <w:t>BatteryCurrent is an Android overlay utility for monitoring live battery behavior while using the phone normally. The free version focuses on live current measurement, battery temperature, voltage, battery percentage, accumulated charge or energy, and the main zoomable mAh/mWh history graph. Pro features add advanced battery-health interpretation, including optional right-axis overlays, battery capacity estimates, and degradation messaging.</w:t>
+        <w:t>BatteryCurrent is an Android overlay utility for monitoring live battery behavior while using the phone normally. The free version focuses on live current measurement, battery temperature, voltage, battery percentage, accumulated charge or energy, and the main zoomable mAh/mWh history graph. Pro features add advanced battery-health interpretation, including optional right-axis overlays, battery capacity estimates, day-to-day estimate history, and degradation messaging.</w:t>
+      </w:r>
+    </w:p>
+    <w:p>
+      <w:r>
+        <w:t>A distinguishing use for BatteryCurrent is charging-profile monitoring. Because the app records current, voltage, temperature, battery percent, and accumulated charge over time, it can help users see how a phone actually charges, whether smart charging changes the current profile, and whether the observed behavior matches manufacturer claims.</w:t>
       </w:r>
     </w:p>
     <w:p>
@@ -81,7 +86,7 @@
         <w:pStyle w:val="ListBullet"/>
       </w:pPr>
       <w:r>
-        <w:t>Pro: visible capacity estimate, degradation warning message, original-capacity health color coding, and selectable right Y-axis graph overlays.</w:t>
+        <w:t>Pro: visible capacity estimate, 10-day estimate history table, degradation warning message, original-capacity health color coding, and selectable right Y-axis graph overlays.</w:t>
       </w:r>
     </w:p>
     <w:p>
@@ -109,7 +114,7 @@
         <w:ind w:left="540" w:hanging="271"/>
       </w:pPr>
       <w:r>
-        <w:t>The graph popup provides detailed history, zooming, two-finger panning, reset zoom, and control buttons. In Pro mode, it also provides selectable secondary right-axis traces.</w:t>
+        <w:t>The graph popup provides detailed history, zooming, two-finger panning, reset zoom, a graph-only collapse mode, and control buttons. In Pro mode, it also provides selectable secondary right-axis traces and capacity-history tools.</w:t>
       </w:r>
     </w:p>
     <w:p>
@@ -206,91 +211,19 @@
           <w:tcPr>
             <w:tcW w:w="9360" w:type="dxa"/>
             <w:tcBorders>
-              <w:top w:val="single" w:sz="12" w:space="0" w:color="C7D2E1"/>
-              <w:left w:val="single" w:sz="12" w:space="0" w:color="C7D2E1"/>
-              <w:bottom w:val="single" w:sz="12" w:space="0" w:color="C7D2E1"/>
-              <w:right w:val="single" w:sz="12" w:space="0" w:color="C7D2E1"/>
+              <w:top w:val="single" w:sz="10" w:space="0" w:color="B8C2CC"/>
+              <w:left w:val="single" w:sz="10" w:space="0" w:color="B8C2CC"/>
+              <w:bottom w:val="single" w:sz="10" w:space="0" w:color="B8C2CC"/>
+              <w:right w:val="single" w:sz="10" w:space="0" w:color="B8C2CC"/>
             </w:tcBorders>
             <w:shd w:val="clear" w:color="auto" w:fill="F2F4F7"/>
             <w:vAlign w:val="center"/>
           </w:tcPr>
           <w:p>
-            <w:pPr>
-              <w:spacing w:before="360" w:after="360"/>
-              <w:jc w:val="center"/>
-            </w:pPr>
             <w:r>
-              <w:rPr>
-                <w:b/>
-                <w:color w:val="1F4D78"/>
-              </w:rPr>
-              <w:t xml:space="preserve">Foreground display </w:t>
-            </w:r>
-            <w:r>
+              <w:t>Foreground display</w:t>
               <w:br/>
-            </w:r>
-            <w:r>
-              <w:rPr>
-                <w:color w:val="555555"/>
-                <w:sz w:val="20"/>
-              </w:rPr>
-              <w:t>All possible parameters displayed in foreground. User has option to turn on/off selected parameters.</w:t>
-            </w:r>
-            <w:r>
-              <w:rPr>
-                <w:color w:val="555555"/>
-                <w:sz w:val="20"/>
-              </w:rPr>
-              <w:t xml:space="preserve"> </w:t>
-            </w:r>
-            <w:r>
-              <w:rPr>
-                <w:noProof/>
-                <w:color w:val="555555"/>
-                <w:sz w:val="20"/>
-              </w:rPr>
-              <w:drawing>
-                <wp:inline distT="0" distB="0" distL="0" distR="0" wp14:anchorId="6D122BCD" wp14:editId="6D274B16">
-                  <wp:extent cx="5943600" cy="942340"/>
-                  <wp:effectExtent l="0" t="0" r="0" b="0"/>
-                  <wp:docPr id="431186720" name="Picture 1"/>
-                  <wp:cNvGraphicFramePr>
-                    <a:graphicFrameLocks xmlns:a="http://schemas.openxmlformats.org/drawingml/2006/main" noChangeAspect="1"/>
-                  </wp:cNvGraphicFramePr>
-                  <a:graphic xmlns:a="http://schemas.openxmlformats.org/drawingml/2006/main">
-                    <a:graphicData uri="http://schemas.openxmlformats.org/drawingml/2006/picture">
-                      <pic:pic xmlns:pic="http://schemas.openxmlformats.org/drawingml/2006/picture">
-                        <pic:nvPicPr>
-                          <pic:cNvPr id="431186720" name=""/>
-                          <pic:cNvPicPr/>
-                        </pic:nvPicPr>
-                        <pic:blipFill>
-                          <a:blip r:embed="rId8"/>
-                          <a:stretch>
-                            <a:fillRect/>
-                          </a:stretch>
-                        </pic:blipFill>
-                        <pic:spPr>
-                          <a:xfrm>
-                            <a:off x="0" y="0"/>
-                            <a:ext cx="5943600" cy="942340"/>
-                          </a:xfrm>
-                          <a:prstGeom prst="rect">
-                            <a:avLst/>
-                          </a:prstGeom>
-                        </pic:spPr>
-                      </pic:pic>
-                    </a:graphicData>
-                  </a:graphic>
-                </wp:inline>
-              </w:drawing>
-            </w:r>
-            <w:r>
-              <w:rPr>
-                <w:color w:val="555555"/>
-                <w:sz w:val="20"/>
-              </w:rPr>
-              <w:t>overlay with time, current, temperature, voltage, energy or charge, and battery percent.</w:t>
+              <w:t>PLACEHOLDER: replace with updated screenshot showing the current foreground overlay fields and selected display options.</w:t>
             </w:r>
           </w:p>
         </w:tc>
@@ -673,7 +606,43 @@
           </w:tcPr>
           <w:p>
             <w:r>
-              <w:t>A small blinking dot before the version indicates active qualifying battery-capacity event collection.</w:t>
+              <w:t>Legacy description: the capacity status indicator now appears beside the graph title instead of before the version label.</w:t>
+            </w:r>
+          </w:p>
+        </w:tc>
+      </w:tr>
+      <w:tr>
+        <w:tc>
+          <w:tcPr>
+            <w:tcW w:type="dxa" w:w="2700"/>
+            <w:vAlign w:val="center"/>
+            <w:tcBorders>
+              <w:top w:val="single" w:sz="8" w:space="0" w:color="D9E2EC"/>
+              <w:left w:val="single" w:sz="8" w:space="0" w:color="D9E2EC"/>
+              <w:bottom w:val="single" w:sz="8" w:space="0" w:color="D9E2EC"/>
+              <w:right w:val="single" w:sz="8" w:space="0" w:color="D9E2EC"/>
+            </w:tcBorders>
+          </w:tcPr>
+          <w:p>
+            <w:r>
+              <w:t>Capacity status dot</w:t>
+            </w:r>
+          </w:p>
+        </w:tc>
+        <w:tc>
+          <w:tcPr>
+            <w:tcW w:type="dxa" w:w="6660"/>
+            <w:vAlign w:val="center"/>
+            <w:tcBorders>
+              <w:top w:val="single" w:sz="8" w:space="0" w:color="D9E2EC"/>
+              <w:left w:val="single" w:sz="8" w:space="0" w:color="D9E2EC"/>
+              <w:bottom w:val="single" w:sz="8" w:space="0" w:color="D9E2EC"/>
+              <w:right w:val="single" w:sz="8" w:space="0" w:color="D9E2EC"/>
+            </w:tcBorders>
+          </w:tcPr>
+          <w:p>
+            <w:r>
+              <w:t>Shown beside the graph title. Yellow means armed at the threshold range; blinking green means actively recording a qualifying capacity event.</w:t>
             </w:r>
           </w:p>
         </w:tc>
@@ -690,7 +659,7 @@
     </w:p>
     <w:p>
       <w:r>
-        <w:t>Tap the foreground display to open the graph popup. Free mode shows the main accumulated mAh or mWh trace, zoom controls, and app controls. Pro mode adds the optional right-axis selector plus capacity and degradation information.</w:t>
+        <w:t>Tap the foreground display to open the graph popup. Free mode shows the main accumulated mAh or mWh trace, zoom controls, graph-only collapse control, and app controls. Pro mode adds the optional right-axis selector plus capacity and degradation information.</w:t>
       </w:r>
     </w:p>
     <w:tbl>
@@ -1177,6 +1146,114 @@
           </w:p>
         </w:tc>
       </w:tr>
+      <w:tr>
+        <w:tc>
+          <w:tcPr>
+            <w:tcW w:type="dxa" w:w="2700"/>
+            <w:vAlign w:val="center"/>
+            <w:tcBorders>
+              <w:top w:val="single" w:sz="8" w:space="0" w:color="D9E2EC"/>
+              <w:left w:val="single" w:sz="8" w:space="0" w:color="D9E2EC"/>
+              <w:bottom w:val="single" w:sz="8" w:space="0" w:color="D9E2EC"/>
+              <w:right w:val="single" w:sz="8" w:space="0" w:color="D9E2EC"/>
+            </w:tcBorders>
+          </w:tcPr>
+          <w:p>
+            <w:r>
+              <w:t>Collapse arrow</w:t>
+            </w:r>
+          </w:p>
+        </w:tc>
+        <w:tc>
+          <w:tcPr>
+            <w:tcW w:type="dxa" w:w="6660"/>
+            <w:vAlign w:val="center"/>
+            <w:tcBorders>
+              <w:top w:val="single" w:sz="8" w:space="0" w:color="D9E2EC"/>
+              <w:left w:val="single" w:sz="8" w:space="0" w:color="D9E2EC"/>
+              <w:bottom w:val="single" w:sz="8" w:space="0" w:color="D9E2EC"/>
+              <w:right w:val="single" w:sz="8" w:space="0" w:color="D9E2EC"/>
+            </w:tcBorders>
+          </w:tcPr>
+          <w:p>
+            <w:r>
+              <w:t>Small yellow arrow below the graph. Tap to hide or show the menu buttons and capacity controls.</w:t>
+            </w:r>
+          </w:p>
+        </w:tc>
+      </w:tr>
+      <w:tr>
+        <w:tc>
+          <w:tcPr>
+            <w:tcW w:type="dxa" w:w="2700"/>
+            <w:vAlign w:val="center"/>
+            <w:tcBorders>
+              <w:top w:val="single" w:sz="8" w:space="0" w:color="D9E2EC"/>
+              <w:left w:val="single" w:sz="8" w:space="0" w:color="D9E2EC"/>
+              <w:bottom w:val="single" w:sz="8" w:space="0" w:color="D9E2EC"/>
+              <w:right w:val="single" w:sz="8" w:space="0" w:color="D9E2EC"/>
+            </w:tcBorders>
+          </w:tcPr>
+          <w:p>
+            <w:r>
+              <w:t>Capacity history</w:t>
+            </w:r>
+          </w:p>
+        </w:tc>
+        <w:tc>
+          <w:tcPr>
+            <w:tcW w:type="dxa" w:w="6660"/>
+            <w:vAlign w:val="center"/>
+            <w:tcBorders>
+              <w:top w:val="single" w:sz="8" w:space="0" w:color="D9E2EC"/>
+              <w:left w:val="single" w:sz="8" w:space="0" w:color="D9E2EC"/>
+              <w:bottom w:val="single" w:sz="8" w:space="0" w:color="D9E2EC"/>
+              <w:right w:val="single" w:sz="8" w:space="0" w:color="D9E2EC"/>
+            </w:tcBorders>
+          </w:tcPr>
+          <w:p>
+            <w:r>
+              <w:t>Pro feature. Tap the estimated capacity line to show a mini-table of the last 10 daily estimates.</w:t>
+            </w:r>
+          </w:p>
+        </w:tc>
+      </w:tr>
+      <w:tr>
+        <w:tc>
+          <w:tcPr>
+            <w:tcW w:type="dxa" w:w="2700"/>
+            <w:vAlign w:val="center"/>
+            <w:tcBorders>
+              <w:top w:val="single" w:sz="8" w:space="0" w:color="D9E2EC"/>
+              <w:left w:val="single" w:sz="8" w:space="0" w:color="D9E2EC"/>
+              <w:bottom w:val="single" w:sz="8" w:space="0" w:color="D9E2EC"/>
+              <w:right w:val="single" w:sz="8" w:space="0" w:color="D9E2EC"/>
+            </w:tcBorders>
+          </w:tcPr>
+          <w:p>
+            <w:r>
+              <w:t>Batt % thresholds</w:t>
+            </w:r>
+          </w:p>
+        </w:tc>
+        <w:tc>
+          <w:tcPr>
+            <w:tcW w:type="dxa" w:w="6660"/>
+            <w:vAlign w:val="center"/>
+            <w:tcBorders>
+              <w:top w:val="single" w:sz="8" w:space="0" w:color="D9E2EC"/>
+              <w:left w:val="single" w:sz="8" w:space="0" w:color="D9E2EC"/>
+              <w:bottom w:val="single" w:sz="8" w:space="0" w:color="D9E2EC"/>
+              <w:right w:val="single" w:sz="8" w:space="0" w:color="D9E2EC"/>
+            </w:tcBorders>
+          </w:tcPr>
+          <w:p>
+            <w:r>
+              <w:t>Pro graph aid. When Batt % is selected on the right axis, faint dashed lines mark 25% and 75%.</w:t>
+            </w:r>
+          </w:p>
+        </w:tc>
+      </w:tr>
     </w:tbl>
     <w:p/>
     <w:p/>
@@ -1197,109 +1274,19 @@
           <w:tcPr>
             <w:tcW w:w="9360" w:type="dxa"/>
             <w:tcBorders>
-              <w:top w:val="single" w:sz="12" w:space="0" w:color="C7D2E1"/>
-              <w:left w:val="single" w:sz="12" w:space="0" w:color="C7D2E1"/>
-              <w:bottom w:val="single" w:sz="12" w:space="0" w:color="C7D2E1"/>
-              <w:right w:val="single" w:sz="12" w:space="0" w:color="C7D2E1"/>
+              <w:top w:val="single" w:sz="10" w:space="0" w:color="B8C2CC"/>
+              <w:left w:val="single" w:sz="10" w:space="0" w:color="B8C2CC"/>
+              <w:bottom w:val="single" w:sz="10" w:space="0" w:color="B8C2CC"/>
+              <w:right w:val="single" w:sz="10" w:space="0" w:color="B8C2CC"/>
             </w:tcBorders>
             <w:shd w:val="clear" w:color="auto" w:fill="F2F4F7"/>
             <w:vAlign w:val="center"/>
           </w:tcPr>
           <w:p>
-            <w:pPr>
-              <w:spacing w:before="360" w:after="360"/>
-              <w:jc w:val="center"/>
-              <w:rPr>
-                <w:color w:val="555555"/>
-                <w:sz w:val="20"/>
-              </w:rPr>
-            </w:pPr>
             <w:r>
-              <w:rPr>
-                <w:b/>
-                <w:color w:val="1F4D78"/>
-              </w:rPr>
-              <w:lastRenderedPageBreak/>
-              <w:t xml:space="preserve">Graph popup </w:t>
-            </w:r>
-            <w:r>
+              <w:t>Graph popup - expanded controls</w:t>
               <w:br/>
-            </w:r>
-            <w:proofErr w:type="spellStart"/>
-            <w:r>
-              <w:rPr>
-                <w:color w:val="555555"/>
-                <w:sz w:val="20"/>
-              </w:rPr>
-              <w:t>Gtaph</w:t>
-            </w:r>
-            <w:proofErr w:type="spellEnd"/>
-            <w:r>
-              <w:rPr>
-                <w:color w:val="555555"/>
-                <w:sz w:val="20"/>
-              </w:rPr>
-              <w:t xml:space="preserve"> popup and settings controls</w:t>
-            </w:r>
-            <w:r>
-              <w:rPr>
-                <w:color w:val="555555"/>
-                <w:sz w:val="20"/>
-              </w:rPr>
-              <w:t>.</w:t>
-            </w:r>
-            <w:r>
-              <w:rPr>
-                <w:color w:val="555555"/>
-                <w:sz w:val="20"/>
-              </w:rPr>
-              <w:t xml:space="preserve"> Estimated battery capacity is updated daily.</w:t>
-            </w:r>
-          </w:p>
-          <w:p>
-            <w:pPr>
-              <w:spacing w:before="360" w:after="360"/>
-              <w:jc w:val="center"/>
-            </w:pPr>
-            <w:r>
-              <w:rPr>
-                <w:noProof/>
-              </w:rPr>
-              <w:drawing>
-                <wp:inline distT="0" distB="0" distL="0" distR="0" wp14:anchorId="2CC6F0EC" wp14:editId="41A49BF3">
-                  <wp:extent cx="3657600" cy="5058959"/>
-                  <wp:effectExtent l="0" t="0" r="0" b="8890"/>
-                  <wp:docPr id="479247042" name="Picture 1"/>
-                  <wp:cNvGraphicFramePr>
-                    <a:graphicFrameLocks xmlns:a="http://schemas.openxmlformats.org/drawingml/2006/main" noChangeAspect="1"/>
-                  </wp:cNvGraphicFramePr>
-                  <a:graphic xmlns:a="http://schemas.openxmlformats.org/drawingml/2006/main">
-                    <a:graphicData uri="http://schemas.openxmlformats.org/drawingml/2006/picture">
-                      <pic:pic xmlns:pic="http://schemas.openxmlformats.org/drawingml/2006/picture">
-                        <pic:nvPicPr>
-                          <pic:cNvPr id="479247042" name=""/>
-                          <pic:cNvPicPr/>
-                        </pic:nvPicPr>
-                        <pic:blipFill>
-                          <a:blip r:embed="rId9"/>
-                          <a:stretch>
-                            <a:fillRect/>
-                          </a:stretch>
-                        </pic:blipFill>
-                        <pic:spPr>
-                          <a:xfrm>
-                            <a:off x="0" y="0"/>
-                            <a:ext cx="3662058" cy="5065126"/>
-                          </a:xfrm>
-                          <a:prstGeom prst="rect">
-                            <a:avLst/>
-                          </a:prstGeom>
-                        </pic:spPr>
-                      </pic:pic>
-                    </a:graphicData>
-                  </a:graphic>
-                </wp:inline>
-              </w:drawing>
+              <w:t>PLACEHOLDER: replace with updated screenshot showing the current graph popup, title status dot, right-axis selector, menu buttons, and capacity estimate area.</w:t>
             </w:r>
           </w:p>
         </w:tc>
@@ -1336,8 +1323,7 @@
         <w:ind w:left="540" w:hanging="271"/>
       </w:pPr>
       <w:r>
-        <w:lastRenderedPageBreak/>
-        <w:t>Battery percent uses a fixed 0 to 100 scale.</w:t>
+        <w:t>Battery percent uses a fixed 0 to 100 scale. When Batt % is selected, faint dashed threshold lines mark 25% in red and 75% in green.</w:t>
       </w:r>
     </w:p>
     <w:p>
@@ -1390,9 +1376,47 @@
     </w:p>
     <w:p>
       <w:r>
-        <w:t>The popup itself and the graph timeline use different gestures so they do not interfere with each other.</w:t>
+        <w:t>The popup itself and the graph timeline use different gestures so they do not interfere with each other. Use the small yellow arrow below the graph to collapse or expand the menu buttons when you want a cleaner graph-only view.</w:t>
       </w:r>
     </w:p>
+    <w:p>
+      <w:pPr>
+        <w:pStyle w:val="Heading3"/>
+      </w:pPr>
+      <w:r>
+        <w:t>Screenshot placeholder: collapsed graph-only view</w:t>
+      </w:r>
+    </w:p>
+    <w:tbl>
+      <w:tblPr>
+        <w:tblW w:type="auto" w:w="0"/>
+        <w:tblLook w:firstColumn="1" w:firstRow="1" w:lastColumn="0" w:lastRow="0" w:noHBand="0" w:noVBand="1" w:val="04A0"/>
+      </w:tblPr>
+      <w:tblGrid>
+        <w:gridCol w:w="0"/>
+      </w:tblGrid>
+      <w:tr>
+        <w:tc>
+          <w:tcPr>
+            <w:tcW w:type="dxa" w:w="0"/>
+            <w:vAlign w:val="center"/>
+            <w:tcBorders>
+              <w:top w:val="single" w:sz="10" w:space="0" w:color="B8C2CC"/>
+              <w:left w:val="single" w:sz="10" w:space="0" w:color="B8C2CC"/>
+              <w:bottom w:val="single" w:sz="10" w:space="0" w:color="B8C2CC"/>
+              <w:right w:val="single" w:sz="10" w:space="0" w:color="B8C2CC"/>
+            </w:tcBorders>
+          </w:tcPr>
+          <w:p>
+            <w:r>
+              <w:t>Graph popup - collapsed menu view</w:t>
+              <w:br/>
+              <w:t>PLACEHOLDER: replace with screenshot showing the graph popup after tapping the yellow collapse arrow, with menu buttons hidden and the graph kept visible.</w:t>
+            </w:r>
+          </w:p>
+        </w:tc>
+      </w:tr>
+    </w:tbl>
     <w:tbl>
       <w:tblPr>
         <w:tblW w:w="9360" w:type="dxa"/>
@@ -1604,6 +1628,42 @@
           </w:p>
         </w:tc>
       </w:tr>
+      <w:tr>
+        <w:tc>
+          <w:tcPr>
+            <w:tcW w:type="dxa" w:w="2700"/>
+            <w:vAlign w:val="center"/>
+            <w:tcBorders>
+              <w:top w:val="single" w:sz="8" w:space="0" w:color="D9E2EC"/>
+              <w:left w:val="single" w:sz="8" w:space="0" w:color="D9E2EC"/>
+              <w:bottom w:val="single" w:sz="8" w:space="0" w:color="D9E2EC"/>
+              <w:right w:val="single" w:sz="8" w:space="0" w:color="D9E2EC"/>
+            </w:tcBorders>
+          </w:tcPr>
+          <w:p>
+            <w:r>
+              <w:t>Collapse arrow</w:t>
+            </w:r>
+          </w:p>
+        </w:tc>
+        <w:tc>
+          <w:tcPr>
+            <w:tcW w:type="dxa" w:w="6660"/>
+            <w:vAlign w:val="center"/>
+            <w:tcBorders>
+              <w:top w:val="single" w:sz="8" w:space="0" w:color="D9E2EC"/>
+              <w:left w:val="single" w:sz="8" w:space="0" w:color="D9E2EC"/>
+              <w:bottom w:val="single" w:sz="8" w:space="0" w:color="D9E2EC"/>
+              <w:right w:val="single" w:sz="8" w:space="0" w:color="D9E2EC"/>
+            </w:tcBorders>
+          </w:tcPr>
+          <w:p>
+            <w:r>
+              <w:t>Toggles the menu area so the popup can remain open as a graph-focused view.</w:t>
+            </w:r>
+          </w:p>
+        </w:tc>
+      </w:tr>
     </w:tbl>
     <w:p/>
     <w:p>
@@ -1710,7 +1770,7 @@
         <w:ind w:left="540" w:hanging="271"/>
       </w:pPr>
       <w:r>
-        <w:t>A small blinking dot before the version number indicates that a qualifying battery-capacity event is in progress. This dot can appear in Free or Pro mode because collection continues in the background.</w:t>
+        <w:t>A small dot to the left of the BatteryCurrent title indicates capacity-event status. A steady yellow dot means the app is armed at or beyond the 25%/75% threshold range. A blinking green dot means a qualifying battery-capacity event is actively being recorded.</w:t>
       </w:r>
     </w:p>
     <w:p>
@@ -2120,6 +2180,42 @@
           </w:p>
         </w:tc>
       </w:tr>
+      <w:tr>
+        <w:tc>
+          <w:tcPr>
+            <w:tcW w:type="dxa" w:w="2700"/>
+            <w:vAlign w:val="center"/>
+            <w:tcBorders>
+              <w:top w:val="single" w:sz="8" w:space="0" w:color="D9E2EC"/>
+              <w:left w:val="single" w:sz="8" w:space="0" w:color="D9E2EC"/>
+              <w:bottom w:val="single" w:sz="8" w:space="0" w:color="D9E2EC"/>
+              <w:right w:val="single" w:sz="8" w:space="0" w:color="D9E2EC"/>
+            </w:tcBorders>
+          </w:tcPr>
+          <w:p>
+            <w:r>
+              <w:t>Graph-only view is missing buttons</w:t>
+            </w:r>
+          </w:p>
+        </w:tc>
+        <w:tc>
+          <w:tcPr>
+            <w:tcW w:type="dxa" w:w="6660"/>
+            <w:vAlign w:val="center"/>
+            <w:tcBorders>
+              <w:top w:val="single" w:sz="8" w:space="0" w:color="D9E2EC"/>
+              <w:left w:val="single" w:sz="8" w:space="0" w:color="D9E2EC"/>
+              <w:bottom w:val="single" w:sz="8" w:space="0" w:color="D9E2EC"/>
+              <w:right w:val="single" w:sz="8" w:space="0" w:color="D9E2EC"/>
+            </w:tcBorders>
+          </w:tcPr>
+          <w:p>
+            <w:r>
+              <w:t>Tap the small yellow down arrow below the graph to expand the hidden controls again.</w:t>
+            </w:r>
+          </w:p>
+        </w:tc>
+      </w:tr>
     </w:tbl>
     <w:p/>
     <w:p>

</xml_diff>

<commit_message>
main -Battery manual updated (v1.01)
</commit_message>
<xml_diff>
--- a/docs/manual/BatteryCurrent_User_Manual_Preliminary.docx
+++ b/docs/manual/BatteryCurrent_User_Manual_Preliminary.docx
@@ -52,7 +52,7 @@
     </w:p>
     <w:p>
       <w:r>
-        <w:t>BatteryCurrent is an Android overlay utility for monitoring live battery behavior while using the phone normally. The free version focuses on live current measurement, battery temperature, voltage, battery percentage, accumulated charge or energy, and the main zoomable mAh/mWh history graph. Pro features add advanced battery-health interpretation, including optional right-axis overlays, battery capacity estimates, day-to-day estimate history, and degradation messaging.</w:t>
+        <w:t>BatteryCurrent is an Android overlay utility for monitoring live battery behavior while using the phone normally. The free version focuses on live current measurement, battery temperature, voltage, battery percentage, accumulated charge or energy, foreground light/dark contrast control, and the main zoomable mAh/mWh history graph. Pro features add advanced battery-health interpretation, including optional right-axis overlays, rolling-average battery capacity estimates, day-to-day estimate history, and degradation messaging.</w:t>
       </w:r>
     </w:p>
     <w:p>
@@ -134,6 +134,7 @@
         <w:ind w:left="540" w:hanging="271"/>
       </w:pPr>
       <w:r>
+        <w:lastRenderedPageBreak/>
         <w:t>Battery capacity event logging runs in the background for qualifying charge/discharge sessions. Free users see the subtle collection indicator; Pro users can view the capacity and degradation insights.</w:t>
       </w:r>
     </w:p>
@@ -147,11 +148,7 @@
     </w:p>
     <w:p>
       <w:r>
-        <w:t xml:space="preserve">When BatteryCurrent starts, the startup screen appears first. From there, the user can start monitoring, stop monitoring, temporarily enable Pro mode for testing, and optionally enter the phone's original </w:t>
-      </w:r>
-      <w:r>
-        <w:lastRenderedPageBreak/>
-        <w:t>rated battery capacity. On the first run, BatteryCurrent asks for the original capacity in mAh; this can be skipped and edited later.</w:t>
+        <w:t>When BatteryCurrent starts, the startup screen appears first. From there, the user can start monitoring, stop monitoring, temporarily enable Pro mode for testing, choose a light or dark foreground overlay background, and optionally enter the phone's original rated battery capacity. On the first run, BatteryCurrent asks for the original capacity in mAh; this can be skipped and edited later.</w:t>
       </w:r>
     </w:p>
     <w:p>
@@ -201,7 +198,7 @@
         <w:tblLook w:val="04A0" w:firstRow="1" w:lastRow="0" w:firstColumn="1" w:lastColumn="0" w:noHBand="0" w:noVBand="1"/>
       </w:tblPr>
       <w:tblGrid>
-        <w:gridCol w:w="9576"/>
+        <w:gridCol w:w="9360"/>
       </w:tblGrid>
       <w:tr>
         <w:trPr>
@@ -220,10 +217,80 @@
             <w:vAlign w:val="center"/>
           </w:tcPr>
           <w:p>
+            <w:pPr>
+              <w:jc w:val="center"/>
+              <w:rPr>
+                <w:b/>
+                <w:bCs/>
+              </w:rPr>
+            </w:pPr>
             <w:r>
-              <w:t>Foreground display</w:t>
+              <w:rPr>
+                <w:b/>
+                <w:bCs/>
+              </w:rPr>
+              <w:t>Figure 1: Foreground view</w:t>
+            </w:r>
+          </w:p>
+          <w:p>
+            <w:pPr>
+              <w:jc w:val="center"/>
+            </w:pPr>
+            <w:r>
+              <w:drawing>
+                <wp:inline distT="0" distB="0" distL="0" distR="0" wp14:anchorId="2F034866" wp14:editId="2BFD4E58">
+                  <wp:extent cx="2606266" cy="342930"/>
+                  <wp:effectExtent l="0" t="0" r="3810" b="0"/>
+                  <wp:docPr id="1892487653" name="Picture 1"/>
+                  <wp:cNvGraphicFramePr>
+                    <a:graphicFrameLocks xmlns:a="http://schemas.openxmlformats.org/drawingml/2006/main" noChangeAspect="1"/>
+                  </wp:cNvGraphicFramePr>
+                  <a:graphic xmlns:a="http://schemas.openxmlformats.org/drawingml/2006/main">
+                    <a:graphicData uri="http://schemas.openxmlformats.org/drawingml/2006/picture">
+                      <pic:pic xmlns:pic="http://schemas.openxmlformats.org/drawingml/2006/picture">
+                        <pic:nvPicPr>
+                          <pic:cNvPr id="1892487653" name=""/>
+                          <pic:cNvPicPr/>
+                        </pic:nvPicPr>
+                        <pic:blipFill>
+                          <a:blip r:embed="rId8"/>
+                          <a:stretch>
+                            <a:fillRect/>
+                          </a:stretch>
+                        </pic:blipFill>
+                        <pic:spPr>
+                          <a:xfrm>
+                            <a:off x="0" y="0"/>
+                            <a:ext cx="2606266" cy="342930"/>
+                          </a:xfrm>
+                          <a:prstGeom prst="rect">
+                            <a:avLst/>
+                          </a:prstGeom>
+                        </pic:spPr>
+                      </pic:pic>
+                    </a:graphicData>
+                  </a:graphic>
+                </wp:inline>
+              </w:drawing>
+            </w:r>
+            <w:r>
               <w:br/>
-              <w:t>PLACEHOLDER: replace with updated screenshot showing the current foreground overlay fields and selected display options.</w:t>
+            </w:r>
+            <w:proofErr w:type="spellStart"/>
+            <w:r>
+              <w:t>Datestamp</w:t>
+            </w:r>
+            <w:proofErr w:type="spellEnd"/>
+            <w:r>
+              <w:t xml:space="preserve"> Current Temperature Voltage Energy/Charge </w:t>
+            </w:r>
+            <w:proofErr w:type="spellStart"/>
+            <w:r>
+              <w:t>BatteryChg</w:t>
+            </w:r>
+            <w:proofErr w:type="spellEnd"/>
+            <w:r>
+              <w:t>%</w:t>
             </w:r>
           </w:p>
         </w:tc>
@@ -240,7 +307,7 @@
     </w:p>
     <w:p>
       <w:r>
-        <w:t>The foreground display is the small live readout shown over other apps. It can be dragged to a convenient location unless it is locked.</w:t>
+        <w:t>The foreground display is the small live readout shown over other apps. It can be dragged to a convenient location unless it is locked. The display uses the same status colors as the graph, and the startup screen can switch the foreground background between dark and light for contrast against different apps.</w:t>
       </w:r>
     </w:p>
     <w:tbl>
@@ -471,6 +538,7 @@
           </w:tcPr>
           <w:p>
             <w:r>
+              <w:lastRenderedPageBreak/>
               <w:t>Energy / Charge</w:t>
             </w:r>
           </w:p>
@@ -511,6 +579,9 @@
           <w:p>
             <w:r>
               <w:t>Battery</w:t>
+            </w:r>
+            <w:r>
+              <w:t xml:space="preserve"> Charge %</w:t>
             </w:r>
           </w:p>
         </w:tc>
@@ -566,7 +637,7 @@
           </w:tcPr>
           <w:p>
             <w:r>
-              <w:t>Shows the build version, such as v1.00-dev (100) during development or v1.00 (100) for release.</w:t>
+              <w:t>Shows the build version, such as v1.01-dev (101) during development or v1.01 (101) for release.</w:t>
             </w:r>
           </w:p>
         </w:tc>
@@ -588,7 +659,6 @@
           </w:tcPr>
           <w:p>
             <w:r>
-              <w:lastRenderedPageBreak/>
               <w:t>Collection dot</w:t>
             </w:r>
           </w:p>
@@ -606,22 +676,28 @@
           </w:tcPr>
           <w:p>
             <w:r>
-              <w:t>Legacy description: the capacity status indicator now appears beside the graph title instead of before the version label.</w:t>
+              <w:t>T</w:t>
+            </w:r>
+            <w:r>
+              <w:t>he capacity status indicator now appears beside the graph title instead of before the version label.</w:t>
             </w:r>
           </w:p>
         </w:tc>
       </w:tr>
       <w:tr>
+        <w:trPr>
+          <w:jc w:val="center"/>
+        </w:trPr>
         <w:tc>
           <w:tcPr>
-            <w:tcW w:type="dxa" w:w="2700"/>
-            <w:vAlign w:val="center"/>
+            <w:tcW w:w="2700" w:type="dxa"/>
             <w:tcBorders>
               <w:top w:val="single" w:sz="8" w:space="0" w:color="D9E2EC"/>
               <w:left w:val="single" w:sz="8" w:space="0" w:color="D9E2EC"/>
               <w:bottom w:val="single" w:sz="8" w:space="0" w:color="D9E2EC"/>
               <w:right w:val="single" w:sz="8" w:space="0" w:color="D9E2EC"/>
             </w:tcBorders>
+            <w:vAlign w:val="center"/>
           </w:tcPr>
           <w:p>
             <w:r>
@@ -631,18 +707,96 @@
         </w:tc>
         <w:tc>
           <w:tcPr>
-            <w:tcW w:type="dxa" w:w="6660"/>
-            <w:vAlign w:val="center"/>
+            <w:tcW w:w="6660" w:type="dxa"/>
             <w:tcBorders>
               <w:top w:val="single" w:sz="8" w:space="0" w:color="D9E2EC"/>
               <w:left w:val="single" w:sz="8" w:space="0" w:color="D9E2EC"/>
               <w:bottom w:val="single" w:sz="8" w:space="0" w:color="D9E2EC"/>
               <w:right w:val="single" w:sz="8" w:space="0" w:color="D9E2EC"/>
             </w:tcBorders>
+            <w:vAlign w:val="center"/>
           </w:tcPr>
           <w:p>
             <w:r>
               <w:t>Shown beside the graph title. Yellow means armed at the threshold range; blinking green means actively recording a qualifying capacity event.</w:t>
+            </w:r>
+          </w:p>
+        </w:tc>
+      </w:tr>
+      <w:tr>
+        <w:trPr>
+          <w:jc w:val="center"/>
+        </w:trPr>
+        <w:tc>
+          <w:tcPr>
+            <w:tcW w:w="2700" w:type="dxa"/>
+            <w:tcBorders>
+              <w:top w:val="single" w:sz="8" w:space="0" w:color="D9E2EC"/>
+              <w:left w:val="single" w:sz="8" w:space="0" w:color="D9E2EC"/>
+              <w:bottom w:val="single" w:sz="8" w:space="0" w:color="D9E2EC"/>
+              <w:right w:val="single" w:sz="8" w:space="0" w:color="D9E2EC"/>
+            </w:tcBorders>
+            <w:vAlign w:val="center"/>
+          </w:tcPr>
+          <w:p>
+            <w:r>
+              <w:t>Foreground theme</w:t>
+            </w:r>
+          </w:p>
+        </w:tc>
+        <w:tc>
+          <w:tcPr>
+            <w:tcW w:w="6660" w:type="dxa"/>
+            <w:tcBorders>
+              <w:top w:val="single" w:sz="8" w:space="0" w:color="D9E2EC"/>
+              <w:left w:val="single" w:sz="8" w:space="0" w:color="D9E2EC"/>
+              <w:bottom w:val="single" w:sz="8" w:space="0" w:color="D9E2EC"/>
+              <w:right w:val="single" w:sz="8" w:space="0" w:color="D9E2EC"/>
+            </w:tcBorders>
+            <w:vAlign w:val="center"/>
+          </w:tcPr>
+          <w:p>
+            <w:r>
+              <w:t>Startup-screen switch that chooses a dark or light foreground overlay background for better contrast.</w:t>
+            </w:r>
+          </w:p>
+        </w:tc>
+      </w:tr>
+      <w:tr>
+        <w:trPr>
+          <w:jc w:val="center"/>
+        </w:trPr>
+        <w:tc>
+          <w:tcPr>
+            <w:tcW w:w="2700" w:type="dxa"/>
+            <w:tcBorders>
+              <w:top w:val="single" w:sz="8" w:space="0" w:color="D9E2EC"/>
+              <w:left w:val="single" w:sz="8" w:space="0" w:color="D9E2EC"/>
+              <w:bottom w:val="single" w:sz="8" w:space="0" w:color="D9E2EC"/>
+              <w:right w:val="single" w:sz="8" w:space="0" w:color="D9E2EC"/>
+            </w:tcBorders>
+            <w:vAlign w:val="center"/>
+          </w:tcPr>
+          <w:p>
+            <w:r>
+              <w:t>Foreground status dot</w:t>
+            </w:r>
+          </w:p>
+        </w:tc>
+        <w:tc>
+          <w:tcPr>
+            <w:tcW w:w="6660" w:type="dxa"/>
+            <w:tcBorders>
+              <w:top w:val="single" w:sz="8" w:space="0" w:color="D9E2EC"/>
+              <w:left w:val="single" w:sz="8" w:space="0" w:color="D9E2EC"/>
+              <w:bottom w:val="single" w:sz="8" w:space="0" w:color="D9E2EC"/>
+              <w:right w:val="single" w:sz="8" w:space="0" w:color="D9E2EC"/>
+            </w:tcBorders>
+            <w:vAlign w:val="center"/>
+          </w:tcPr>
+          <w:p>
+            <w:r>
+              <w:t>Dot at the right edge of the foreground display. Yellow means armed; slow pulsing green means actively recording a qualifying capacity event.</w:t>
             </w:r>
           </w:p>
         </w:tc>
@@ -1007,6 +1161,7 @@
           </w:tcPr>
           <w:p>
             <w:r>
+              <w:lastRenderedPageBreak/>
               <w:t>Right-axis label</w:t>
             </w:r>
           </w:p>
@@ -1063,7 +1218,7 @@
           </w:tcPr>
           <w:p>
             <w:r>
-              <w:t>Pro feature. Shows the daily estimated battery capacity when enough qualifying event data exists.</w:t>
+              <w:t>Pro feature. Shows the rolling-average estimated battery capacity when enough qualifying event data exists.</w:t>
             </w:r>
           </w:p>
         </w:tc>
@@ -1147,16 +1302,19 @@
         </w:tc>
       </w:tr>
       <w:tr>
+        <w:trPr>
+          <w:jc w:val="center"/>
+        </w:trPr>
         <w:tc>
           <w:tcPr>
-            <w:tcW w:type="dxa" w:w="2700"/>
-            <w:vAlign w:val="center"/>
+            <w:tcW w:w="2700" w:type="dxa"/>
             <w:tcBorders>
               <w:top w:val="single" w:sz="8" w:space="0" w:color="D9E2EC"/>
               <w:left w:val="single" w:sz="8" w:space="0" w:color="D9E2EC"/>
               <w:bottom w:val="single" w:sz="8" w:space="0" w:color="D9E2EC"/>
               <w:right w:val="single" w:sz="8" w:space="0" w:color="D9E2EC"/>
             </w:tcBorders>
+            <w:vAlign w:val="center"/>
           </w:tcPr>
           <w:p>
             <w:r>
@@ -1166,14 +1324,14 @@
         </w:tc>
         <w:tc>
           <w:tcPr>
-            <w:tcW w:type="dxa" w:w="6660"/>
-            <w:vAlign w:val="center"/>
+            <w:tcW w:w="6660" w:type="dxa"/>
             <w:tcBorders>
               <w:top w:val="single" w:sz="8" w:space="0" w:color="D9E2EC"/>
               <w:left w:val="single" w:sz="8" w:space="0" w:color="D9E2EC"/>
               <w:bottom w:val="single" w:sz="8" w:space="0" w:color="D9E2EC"/>
               <w:right w:val="single" w:sz="8" w:space="0" w:color="D9E2EC"/>
             </w:tcBorders>
+            <w:vAlign w:val="center"/>
           </w:tcPr>
           <w:p>
             <w:r>
@@ -1183,16 +1341,19 @@
         </w:tc>
       </w:tr>
       <w:tr>
+        <w:trPr>
+          <w:jc w:val="center"/>
+        </w:trPr>
         <w:tc>
           <w:tcPr>
-            <w:tcW w:type="dxa" w:w="2700"/>
-            <w:vAlign w:val="center"/>
+            <w:tcW w:w="2700" w:type="dxa"/>
             <w:tcBorders>
               <w:top w:val="single" w:sz="8" w:space="0" w:color="D9E2EC"/>
               <w:left w:val="single" w:sz="8" w:space="0" w:color="D9E2EC"/>
               <w:bottom w:val="single" w:sz="8" w:space="0" w:color="D9E2EC"/>
               <w:right w:val="single" w:sz="8" w:space="0" w:color="D9E2EC"/>
             </w:tcBorders>
+            <w:vAlign w:val="center"/>
           </w:tcPr>
           <w:p>
             <w:r>
@@ -1202,14 +1363,14 @@
         </w:tc>
         <w:tc>
           <w:tcPr>
-            <w:tcW w:type="dxa" w:w="6660"/>
-            <w:vAlign w:val="center"/>
+            <w:tcW w:w="6660" w:type="dxa"/>
             <w:tcBorders>
               <w:top w:val="single" w:sz="8" w:space="0" w:color="D9E2EC"/>
               <w:left w:val="single" w:sz="8" w:space="0" w:color="D9E2EC"/>
               <w:bottom w:val="single" w:sz="8" w:space="0" w:color="D9E2EC"/>
               <w:right w:val="single" w:sz="8" w:space="0" w:color="D9E2EC"/>
             </w:tcBorders>
+            <w:vAlign w:val="center"/>
           </w:tcPr>
           <w:p>
             <w:r>
@@ -1219,16 +1380,19 @@
         </w:tc>
       </w:tr>
       <w:tr>
+        <w:trPr>
+          <w:jc w:val="center"/>
+        </w:trPr>
         <w:tc>
           <w:tcPr>
-            <w:tcW w:type="dxa" w:w="2700"/>
-            <w:vAlign w:val="center"/>
+            <w:tcW w:w="2700" w:type="dxa"/>
             <w:tcBorders>
               <w:top w:val="single" w:sz="8" w:space="0" w:color="D9E2EC"/>
               <w:left w:val="single" w:sz="8" w:space="0" w:color="D9E2EC"/>
               <w:bottom w:val="single" w:sz="8" w:space="0" w:color="D9E2EC"/>
               <w:right w:val="single" w:sz="8" w:space="0" w:color="D9E2EC"/>
             </w:tcBorders>
+            <w:vAlign w:val="center"/>
           </w:tcPr>
           <w:p>
             <w:r>
@@ -1238,14 +1402,14 @@
         </w:tc>
         <w:tc>
           <w:tcPr>
-            <w:tcW w:type="dxa" w:w="6660"/>
-            <w:vAlign w:val="center"/>
+            <w:tcW w:w="6660" w:type="dxa"/>
             <w:tcBorders>
               <w:top w:val="single" w:sz="8" w:space="0" w:color="D9E2EC"/>
               <w:left w:val="single" w:sz="8" w:space="0" w:color="D9E2EC"/>
               <w:bottom w:val="single" w:sz="8" w:space="0" w:color="D9E2EC"/>
               <w:right w:val="single" w:sz="8" w:space="0" w:color="D9E2EC"/>
             </w:tcBorders>
+            <w:vAlign w:val="center"/>
           </w:tcPr>
           <w:p>
             <w:r>
@@ -1254,8 +1418,46 @@
           </w:p>
         </w:tc>
       </w:tr>
+      <w:tr>
+        <w:trPr>
+          <w:jc w:val="center"/>
+        </w:trPr>
+        <w:tc>
+          <w:tcPr>
+            <w:tcW w:w="2700" w:type="dxa"/>
+            <w:tcBorders>
+              <w:top w:val="single" w:sz="8" w:space="0" w:color="D9E2EC"/>
+              <w:left w:val="single" w:sz="8" w:space="0" w:color="D9E2EC"/>
+              <w:bottom w:val="single" w:sz="8" w:space="0" w:color="D9E2EC"/>
+              <w:right w:val="single" w:sz="8" w:space="0" w:color="D9E2EC"/>
+            </w:tcBorders>
+            <w:vAlign w:val="center"/>
+          </w:tcPr>
+          <w:p>
+            <w:r>
+              <w:t>Foreground theme</w:t>
+            </w:r>
+          </w:p>
+        </w:tc>
+        <w:tc>
+          <w:tcPr>
+            <w:tcW w:w="6660" w:type="dxa"/>
+            <w:tcBorders>
+              <w:top w:val="single" w:sz="8" w:space="0" w:color="D9E2EC"/>
+              <w:left w:val="single" w:sz="8" w:space="0" w:color="D9E2EC"/>
+              <w:bottom w:val="single" w:sz="8" w:space="0" w:color="D9E2EC"/>
+              <w:right w:val="single" w:sz="8" w:space="0" w:color="D9E2EC"/>
+            </w:tcBorders>
+            <w:vAlign w:val="center"/>
+          </w:tcPr>
+          <w:p>
+            <w:r>
+              <w:t>Startup-screen switch. Use light or dark foreground overlay background depending on what contrasts best with other apps.</w:t>
+            </w:r>
+          </w:p>
+        </w:tc>
+      </w:tr>
     </w:tbl>
-    <w:p/>
     <w:p/>
     <w:tbl>
       <w:tblPr>
@@ -1283,10 +1485,66 @@
             <w:vAlign w:val="center"/>
           </w:tcPr>
           <w:p>
+            <w:pPr>
+              <w:jc w:val="center"/>
+            </w:pPr>
             <w:r>
+              <w:rPr>
+                <w:b/>
+                <w:bCs/>
+              </w:rPr>
+              <w:t xml:space="preserve">Figure 2: </w:t>
+            </w:r>
+            <w:r>
+              <w:rPr>
+                <w:b/>
+                <w:bCs/>
+              </w:rPr>
               <w:t>Graph popup - expanded controls</w:t>
+            </w:r>
+            <w:r>
+              <w:rPr>
+                <w:b/>
+                <w:bCs/>
+              </w:rPr>
               <w:br/>
-              <w:t>PLACEHOLDER: replace with updated screenshot showing the current graph popup, title status dot, right-axis selector, menu buttons, and capacity estimate area.</w:t>
+            </w:r>
+            <w:r>
+              <w:drawing>
+                <wp:inline distT="0" distB="0" distL="0" distR="0" wp14:anchorId="4C2BDF1A" wp14:editId="3CDEB052">
+                  <wp:extent cx="2369938" cy="3413760"/>
+                  <wp:effectExtent l="0" t="0" r="0" b="0"/>
+                  <wp:docPr id="290696599" name="Picture 1"/>
+                  <wp:cNvGraphicFramePr>
+                    <a:graphicFrameLocks xmlns:a="http://schemas.openxmlformats.org/drawingml/2006/main" noChangeAspect="1"/>
+                  </wp:cNvGraphicFramePr>
+                  <a:graphic xmlns:a="http://schemas.openxmlformats.org/drawingml/2006/main">
+                    <a:graphicData uri="http://schemas.openxmlformats.org/drawingml/2006/picture">
+                      <pic:pic xmlns:pic="http://schemas.openxmlformats.org/drawingml/2006/picture">
+                        <pic:nvPicPr>
+                          <pic:cNvPr id="290696599" name=""/>
+                          <pic:cNvPicPr/>
+                        </pic:nvPicPr>
+                        <pic:blipFill>
+                          <a:blip r:embed="rId9"/>
+                          <a:stretch>
+                            <a:fillRect/>
+                          </a:stretch>
+                        </pic:blipFill>
+                        <pic:spPr>
+                          <a:xfrm>
+                            <a:off x="0" y="0"/>
+                            <a:ext cx="2387764" cy="3439437"/>
+                          </a:xfrm>
+                          <a:prstGeom prst="rect">
+                            <a:avLst/>
+                          </a:prstGeom>
+                        </pic:spPr>
+                      </pic:pic>
+                    </a:graphicData>
+                  </a:graphic>
+                </wp:inline>
+              </w:drawing>
             </w:r>
           </w:p>
         </w:tc>
@@ -1382,6 +1640,7 @@
     <w:p>
       <w:pPr>
         <w:pStyle w:val="Heading3"/>
+        <w:jc w:val="center"/>
       </w:pPr>
       <w:r>
         <w:t>Screenshot placeholder: collapsed graph-only view</w:t>
@@ -1389,51 +1648,122 @@
     </w:p>
     <w:tbl>
       <w:tblPr>
-        <w:tblW w:type="auto" w:w="0"/>
-        <w:tblLook w:firstColumn="1" w:firstRow="1" w:lastColumn="0" w:lastRow="0" w:noHBand="0" w:noVBand="1" w:val="04A0"/>
+        <w:tblW w:w="0" w:type="auto"/>
+        <w:jc w:val="center"/>
+        <w:tblLook w:val="04A0" w:firstRow="1" w:lastRow="0" w:firstColumn="1" w:lastColumn="0" w:noHBand="0" w:noVBand="1"/>
       </w:tblPr>
       <w:tblGrid>
-        <w:gridCol w:w="0"/>
+        <w:gridCol w:w="5841"/>
+        <w:gridCol w:w="3339"/>
+        <w:gridCol w:w="396"/>
       </w:tblGrid>
       <w:tr>
+        <w:trPr>
+          <w:gridAfter w:val="1"/>
+          <w:wAfter w:w="396" w:type="dxa"/>
+          <w:jc w:val="center"/>
+        </w:trPr>
         <w:tc>
           <w:tcPr>
-            <w:tcW w:type="dxa" w:w="0"/>
-            <w:vAlign w:val="center"/>
+            <w:tcW w:w="9180" w:type="dxa"/>
+            <w:gridSpan w:val="2"/>
             <w:tcBorders>
               <w:top w:val="single" w:sz="10" w:space="0" w:color="B8C2CC"/>
               <w:left w:val="single" w:sz="10" w:space="0" w:color="B8C2CC"/>
               <w:bottom w:val="single" w:sz="10" w:space="0" w:color="B8C2CC"/>
               <w:right w:val="single" w:sz="10" w:space="0" w:color="B8C2CC"/>
             </w:tcBorders>
+            <w:vAlign w:val="center"/>
           </w:tcPr>
           <w:p>
+            <w:pPr>
+              <w:jc w:val="center"/>
+            </w:pPr>
             <w:r>
+              <w:rPr>
+                <w:b/>
+                <w:bCs/>
+              </w:rPr>
+              <w:t xml:space="preserve">Figure 3: </w:t>
+            </w:r>
+            <w:r>
+              <w:rPr>
+                <w:b/>
+                <w:bCs/>
+              </w:rPr>
               <w:t>Graph popup - collapsed menu view</w:t>
-              <w:br/>
-              <w:t>PLACEHOLDER: replace with screenshot showing the graph popup after tapping the yellow collapse arrow, with menu buttons hidden and the graph kept visible.</w:t>
+            </w:r>
+            <w:r>
+              <w:rPr>
+                <w:b/>
+                <w:bCs/>
+              </w:rPr>
+              <w:t xml:space="preserve"> </w:t>
+            </w:r>
+            <w:r>
+              <w:rPr>
+                <w:b/>
+                <w:bCs/>
+              </w:rPr>
+              <w:t>visible.</w:t>
+            </w:r>
+            <w:r>
+              <w:rPr>
+                <w:noProof/>
+              </w:rPr>
+              <w:t xml:space="preserve"> </w:t>
+            </w:r>
+            <w:r>
+              <w:rPr>
+                <w:b/>
+                <w:bCs/>
+              </w:rPr>
+              <w:drawing>
+                <wp:inline distT="0" distB="0" distL="0" distR="0" wp14:anchorId="539F2EA3" wp14:editId="1CCD0692">
+                  <wp:extent cx="2720576" cy="2530059"/>
+                  <wp:effectExtent l="0" t="0" r="3810" b="3810"/>
+                  <wp:docPr id="2124487323" name="Picture 1"/>
+                  <wp:cNvGraphicFramePr>
+                    <a:graphicFrameLocks xmlns:a="http://schemas.openxmlformats.org/drawingml/2006/main" noChangeAspect="1"/>
+                  </wp:cNvGraphicFramePr>
+                  <a:graphic xmlns:a="http://schemas.openxmlformats.org/drawingml/2006/main">
+                    <a:graphicData uri="http://schemas.openxmlformats.org/drawingml/2006/picture">
+                      <pic:pic xmlns:pic="http://schemas.openxmlformats.org/drawingml/2006/picture">
+                        <pic:nvPicPr>
+                          <pic:cNvPr id="2124487323" name=""/>
+                          <pic:cNvPicPr/>
+                        </pic:nvPicPr>
+                        <pic:blipFill>
+                          <a:blip r:embed="rId10"/>
+                          <a:stretch>
+                            <a:fillRect/>
+                          </a:stretch>
+                        </pic:blipFill>
+                        <pic:spPr>
+                          <a:xfrm>
+                            <a:off x="0" y="0"/>
+                            <a:ext cx="2720576" cy="2530059"/>
+                          </a:xfrm>
+                          <a:prstGeom prst="rect">
+                            <a:avLst/>
+                          </a:prstGeom>
+                        </pic:spPr>
+                      </pic:pic>
+                    </a:graphicData>
+                  </a:graphic>
+                </wp:inline>
+              </w:drawing>
             </w:r>
           </w:p>
         </w:tc>
       </w:tr>
-    </w:tbl>
-    <w:tbl>
-      <w:tblPr>
-        <w:tblW w:w="9360" w:type="dxa"/>
-        <w:jc w:val="center"/>
-        <w:tblLook w:val="04A0" w:firstRow="1" w:lastRow="0" w:firstColumn="1" w:lastColumn="0" w:noHBand="0" w:noVBand="1"/>
-      </w:tblPr>
-      <w:tblGrid>
-        <w:gridCol w:w="2700"/>
-        <w:gridCol w:w="6660"/>
-      </w:tblGrid>
       <w:tr>
         <w:trPr>
           <w:jc w:val="center"/>
         </w:trPr>
         <w:tc>
           <w:tcPr>
-            <w:tcW w:w="2700" w:type="dxa"/>
+            <w:tcW w:w="5841" w:type="dxa"/>
             <w:tcBorders>
               <w:top w:val="single" w:sz="8" w:space="0" w:color="D9E2EC"/>
               <w:left w:val="single" w:sz="8" w:space="0" w:color="D9E2EC"/>
@@ -1447,13 +1777,15 @@
               <w:rPr>
                 <w:b/>
               </w:rPr>
+              <w:lastRenderedPageBreak/>
               <w:t>Item</w:t>
             </w:r>
           </w:p>
         </w:tc>
         <w:tc>
           <w:tcPr>
-            <w:tcW w:w="6660" w:type="dxa"/>
+            <w:tcW w:w="3735" w:type="dxa"/>
+            <w:gridSpan w:val="2"/>
             <w:tcBorders>
               <w:top w:val="single" w:sz="8" w:space="0" w:color="D9E2EC"/>
               <w:left w:val="single" w:sz="8" w:space="0" w:color="D9E2EC"/>
@@ -1478,7 +1810,7 @@
         </w:trPr>
         <w:tc>
           <w:tcPr>
-            <w:tcW w:w="2700" w:type="dxa"/>
+            <w:tcW w:w="5841" w:type="dxa"/>
             <w:tcBorders>
               <w:top w:val="single" w:sz="8" w:space="0" w:color="D9E2EC"/>
               <w:left w:val="single" w:sz="8" w:space="0" w:color="D9E2EC"/>
@@ -1495,7 +1827,8 @@
         </w:tc>
         <w:tc>
           <w:tcPr>
-            <w:tcW w:w="6660" w:type="dxa"/>
+            <w:tcW w:w="3735" w:type="dxa"/>
+            <w:gridSpan w:val="2"/>
             <w:tcBorders>
               <w:top w:val="single" w:sz="8" w:space="0" w:color="D9E2EC"/>
               <w:left w:val="single" w:sz="8" w:space="0" w:color="D9E2EC"/>
@@ -1517,7 +1850,7 @@
         </w:trPr>
         <w:tc>
           <w:tcPr>
-            <w:tcW w:w="2700" w:type="dxa"/>
+            <w:tcW w:w="5841" w:type="dxa"/>
             <w:tcBorders>
               <w:top w:val="single" w:sz="8" w:space="0" w:color="D9E2EC"/>
               <w:left w:val="single" w:sz="8" w:space="0" w:color="D9E2EC"/>
@@ -1534,7 +1867,8 @@
         </w:tc>
         <w:tc>
           <w:tcPr>
-            <w:tcW w:w="6660" w:type="dxa"/>
+            <w:tcW w:w="3735" w:type="dxa"/>
+            <w:gridSpan w:val="2"/>
             <w:tcBorders>
               <w:top w:val="single" w:sz="8" w:space="0" w:color="D9E2EC"/>
               <w:left w:val="single" w:sz="8" w:space="0" w:color="D9E2EC"/>
@@ -1556,7 +1890,7 @@
         </w:trPr>
         <w:tc>
           <w:tcPr>
-            <w:tcW w:w="2700" w:type="dxa"/>
+            <w:tcW w:w="5841" w:type="dxa"/>
             <w:tcBorders>
               <w:top w:val="single" w:sz="8" w:space="0" w:color="D9E2EC"/>
               <w:left w:val="single" w:sz="8" w:space="0" w:color="D9E2EC"/>
@@ -1573,7 +1907,8 @@
         </w:tc>
         <w:tc>
           <w:tcPr>
-            <w:tcW w:w="6660" w:type="dxa"/>
+            <w:tcW w:w="3735" w:type="dxa"/>
+            <w:gridSpan w:val="2"/>
             <w:tcBorders>
               <w:top w:val="single" w:sz="8" w:space="0" w:color="D9E2EC"/>
               <w:left w:val="single" w:sz="8" w:space="0" w:color="D9E2EC"/>
@@ -1595,7 +1930,7 @@
         </w:trPr>
         <w:tc>
           <w:tcPr>
-            <w:tcW w:w="2700" w:type="dxa"/>
+            <w:tcW w:w="5841" w:type="dxa"/>
             <w:tcBorders>
               <w:top w:val="single" w:sz="8" w:space="0" w:color="D9E2EC"/>
               <w:left w:val="single" w:sz="8" w:space="0" w:color="D9E2EC"/>
@@ -1612,7 +1947,8 @@
         </w:tc>
         <w:tc>
           <w:tcPr>
-            <w:tcW w:w="6660" w:type="dxa"/>
+            <w:tcW w:w="3735" w:type="dxa"/>
+            <w:gridSpan w:val="2"/>
             <w:tcBorders>
               <w:top w:val="single" w:sz="8" w:space="0" w:color="D9E2EC"/>
               <w:left w:val="single" w:sz="8" w:space="0" w:color="D9E2EC"/>
@@ -1629,16 +1965,19 @@
         </w:tc>
       </w:tr>
       <w:tr>
+        <w:trPr>
+          <w:jc w:val="center"/>
+        </w:trPr>
         <w:tc>
           <w:tcPr>
-            <w:tcW w:type="dxa" w:w="2700"/>
-            <w:vAlign w:val="center"/>
+            <w:tcW w:w="5841" w:type="dxa"/>
             <w:tcBorders>
               <w:top w:val="single" w:sz="8" w:space="0" w:color="D9E2EC"/>
               <w:left w:val="single" w:sz="8" w:space="0" w:color="D9E2EC"/>
               <w:bottom w:val="single" w:sz="8" w:space="0" w:color="D9E2EC"/>
               <w:right w:val="single" w:sz="8" w:space="0" w:color="D9E2EC"/>
             </w:tcBorders>
+            <w:vAlign w:val="center"/>
           </w:tcPr>
           <w:p>
             <w:r>
@@ -1648,14 +1987,15 @@
         </w:tc>
         <w:tc>
           <w:tcPr>
-            <w:tcW w:type="dxa" w:w="6660"/>
-            <w:vAlign w:val="center"/>
+            <w:tcW w:w="3735" w:type="dxa"/>
+            <w:gridSpan w:val="2"/>
             <w:tcBorders>
               <w:top w:val="single" w:sz="8" w:space="0" w:color="D9E2EC"/>
               <w:left w:val="single" w:sz="8" w:space="0" w:color="D9E2EC"/>
               <w:bottom w:val="single" w:sz="8" w:space="0" w:color="D9E2EC"/>
               <w:right w:val="single" w:sz="8" w:space="0" w:color="D9E2EC"/>
             </w:tcBorders>
+            <w:vAlign w:val="center"/>
           </w:tcPr>
           <w:p>
             <w:r>
@@ -1749,7 +2089,6 @@
         <w:ind w:left="540" w:hanging="271"/>
       </w:pPr>
       <w:r>
-        <w:lastRenderedPageBreak/>
         <w:t>Plugging or unplugging during a qualifying session cancels that session and waits for the next threshold crossing.</w:t>
       </w:r>
     </w:p>
@@ -1760,7 +2099,7 @@
         <w:ind w:left="540" w:hanging="271"/>
       </w:pPr>
       <w:r>
-        <w:t>Daily capacity estimates are stored separately and updated only from completed qualifying events.</w:t>
+        <w:t>Daily capacity estimates are stored separately for day-to-day review, while the displayed capacity estimate uses a rolling average of completed qualifying events to reduce noise.</w:t>
       </w:r>
     </w:p>
     <w:p>
@@ -1770,7 +2109,11 @@
         <w:ind w:left="540" w:hanging="271"/>
       </w:pPr>
       <w:r>
-        <w:t>A small dot to the left of the BatteryCurrent title indicates capacity-event status. A steady yellow dot means the app is armed at or beyond the 25%/75% threshold range. A blinking green dot means a qualifying battery-capacity event is actively being recorded.</w:t>
+        <w:t xml:space="preserve">A small dot indicates capacity-event status. In the graph popup it appears to the left of the BatteryCurrent title; in the foreground display it appears at the right edge of the displayed parameters. A steady yellow dot means the app is armed at or beyond the 25%/75% threshold </w:t>
+      </w:r>
+      <w:r>
+        <w:lastRenderedPageBreak/>
+        <w:t>range. A slow pulsing green dot means a qualifying battery-capacity event is actively being recorded.</w:t>
       </w:r>
     </w:p>
     <w:p>
@@ -1819,7 +2162,7 @@
         <w:ind w:left="540" w:hanging="271"/>
       </w:pPr>
       <w:r>
-        <w:t>Capacity event files are stored as CSV files in the app private folder for later inspection during testing and development.</w:t>
+        <w:t>Capacity event files are stored as CSV files in the app private folder for later inspection during testing and development. The app keeps raw capacity events, daily averages, and a separate moving-average trend file written every 100 completed capacity readings.</w:t>
       </w:r>
     </w:p>
     <w:p>
@@ -2118,7 +2461,6 @@
           </w:tcPr>
           <w:p>
             <w:r>
-              <w:lastRenderedPageBreak/>
               <w:t>Pro features not visible</w:t>
             </w:r>
           </w:p>
@@ -2158,7 +2500,11 @@
           </w:tcPr>
           <w:p>
             <w:r>
-              <w:t>Original capacity was skipped</w:t>
+              <w:t xml:space="preserve">Original capacity was </w:t>
+            </w:r>
+            <w:r>
+              <w:lastRenderedPageBreak/>
+              <w:t>skipped</w:t>
             </w:r>
           </w:p>
         </w:tc>
@@ -2175,43 +2521,130 @@
           </w:tcPr>
           <w:p>
             <w:r>
-              <w:t>Use the startup screen Add/Edit option later if you want the Pro estimate value color-coded against the phone's rated capacity.</w:t>
+              <w:lastRenderedPageBreak/>
+              <w:t xml:space="preserve">Use the startup screen Add/Edit option later if you want the Pro </w:t>
+            </w:r>
+            <w:r>
+              <w:lastRenderedPageBreak/>
+              <w:t>estimate value color-coded against the phone's rated capacity.</w:t>
             </w:r>
           </w:p>
         </w:tc>
       </w:tr>
       <w:tr>
+        <w:trPr>
+          <w:jc w:val="center"/>
+        </w:trPr>
         <w:tc>
           <w:tcPr>
-            <w:tcW w:type="dxa" w:w="2700"/>
-            <w:vAlign w:val="center"/>
+            <w:tcW w:w="2700" w:type="dxa"/>
             <w:tcBorders>
               <w:top w:val="single" w:sz="8" w:space="0" w:color="D9E2EC"/>
               <w:left w:val="single" w:sz="8" w:space="0" w:color="D9E2EC"/>
               <w:bottom w:val="single" w:sz="8" w:space="0" w:color="D9E2EC"/>
               <w:right w:val="single" w:sz="8" w:space="0" w:color="D9E2EC"/>
             </w:tcBorders>
+            <w:vAlign w:val="center"/>
           </w:tcPr>
           <w:p>
             <w:r>
+              <w:lastRenderedPageBreak/>
               <w:t>Graph-only view is missing buttons</w:t>
             </w:r>
           </w:p>
         </w:tc>
         <w:tc>
           <w:tcPr>
-            <w:tcW w:type="dxa" w:w="6660"/>
-            <w:vAlign w:val="center"/>
+            <w:tcW w:w="6660" w:type="dxa"/>
             <w:tcBorders>
               <w:top w:val="single" w:sz="8" w:space="0" w:color="D9E2EC"/>
               <w:left w:val="single" w:sz="8" w:space="0" w:color="D9E2EC"/>
               <w:bottom w:val="single" w:sz="8" w:space="0" w:color="D9E2EC"/>
               <w:right w:val="single" w:sz="8" w:space="0" w:color="D9E2EC"/>
             </w:tcBorders>
+            <w:vAlign w:val="center"/>
           </w:tcPr>
           <w:p>
             <w:r>
               <w:t>Tap the small yellow down arrow below the graph to expand the hidden controls again.</w:t>
+            </w:r>
+          </w:p>
+        </w:tc>
+      </w:tr>
+      <w:tr>
+        <w:trPr>
+          <w:jc w:val="center"/>
+        </w:trPr>
+        <w:tc>
+          <w:tcPr>
+            <w:tcW w:w="2700" w:type="dxa"/>
+            <w:tcBorders>
+              <w:top w:val="single" w:sz="8" w:space="0" w:color="D9E2EC"/>
+              <w:left w:val="single" w:sz="8" w:space="0" w:color="D9E2EC"/>
+              <w:bottom w:val="single" w:sz="8" w:space="0" w:color="D9E2EC"/>
+              <w:right w:val="single" w:sz="8" w:space="0" w:color="D9E2EC"/>
+            </w:tcBorders>
+            <w:vAlign w:val="center"/>
+          </w:tcPr>
+          <w:p>
+            <w:r>
+              <w:t>Foreground display is hard to see</w:t>
+            </w:r>
+          </w:p>
+        </w:tc>
+        <w:tc>
+          <w:tcPr>
+            <w:tcW w:w="6660" w:type="dxa"/>
+            <w:tcBorders>
+              <w:top w:val="single" w:sz="8" w:space="0" w:color="D9E2EC"/>
+              <w:left w:val="single" w:sz="8" w:space="0" w:color="D9E2EC"/>
+              <w:bottom w:val="single" w:sz="8" w:space="0" w:color="D9E2EC"/>
+              <w:right w:val="single" w:sz="8" w:space="0" w:color="D9E2EC"/>
+            </w:tcBorders>
+            <w:vAlign w:val="center"/>
+          </w:tcPr>
+          <w:p>
+            <w:r>
+              <w:t>Return to the startup screen and toggle Light foreground background to choose the contrast mode that works best over the current app.</w:t>
+            </w:r>
+          </w:p>
+        </w:tc>
+      </w:tr>
+      <w:tr>
+        <w:trPr>
+          <w:jc w:val="center"/>
+        </w:trPr>
+        <w:tc>
+          <w:tcPr>
+            <w:tcW w:w="2700" w:type="dxa"/>
+            <w:tcBorders>
+              <w:top w:val="single" w:sz="8" w:space="0" w:color="D9E2EC"/>
+              <w:left w:val="single" w:sz="8" w:space="0" w:color="D9E2EC"/>
+              <w:bottom w:val="single" w:sz="8" w:space="0" w:color="D9E2EC"/>
+              <w:right w:val="single" w:sz="8" w:space="0" w:color="D9E2EC"/>
+            </w:tcBorders>
+            <w:vAlign w:val="center"/>
+          </w:tcPr>
+          <w:p>
+            <w:r>
+              <w:t>Capacity estimate seems noisy</w:t>
+            </w:r>
+          </w:p>
+        </w:tc>
+        <w:tc>
+          <w:tcPr>
+            <w:tcW w:w="6660" w:type="dxa"/>
+            <w:tcBorders>
+              <w:top w:val="single" w:sz="8" w:space="0" w:color="D9E2EC"/>
+              <w:left w:val="single" w:sz="8" w:space="0" w:color="D9E2EC"/>
+              <w:bottom w:val="single" w:sz="8" w:space="0" w:color="D9E2EC"/>
+              <w:right w:val="single" w:sz="8" w:space="0" w:color="D9E2EC"/>
+            </w:tcBorders>
+            <w:vAlign w:val="center"/>
+          </w:tcPr>
+          <w:p>
+            <w:r>
+              <w:t>Individual daily values can vary with load and temperature. The displayed estimate uses a rolling average, and long-term degradation checks use 100-reading moving-average snapshots.</w:t>
             </w:r>
           </w:p>
         </w:tc>
@@ -2232,7 +2665,7 @@
       </w:r>
     </w:p>
     <w:sectPr>
-      <w:footerReference w:type="default" r:id="rId10"/>
+      <w:footerReference w:type="default" r:id="rId11"/>
       <w:pgSz w:w="12240" w:h="15840"/>
       <w:pgMar w:top="1440" w:right="1440" w:bottom="1440" w:left="1440" w:header="708" w:footer="708" w:gutter="0"/>
       <w:cols w:space="720"/>
@@ -2286,7 +2719,14 @@
         <w:color w:val="777777"/>
         <w:sz w:val="18"/>
       </w:rPr>
-      <w:t xml:space="preserve"> v03</w:t>
+      <w:t xml:space="preserve"> </w:t>
+    </w:r>
+    <w:r>
+      <w:rPr>
+        <w:color w:val="777777"/>
+        <w:sz w:val="18"/>
+      </w:rPr>
+      <w:t>v1.01</w:t>
     </w:r>
   </w:p>
 </w:ftr>

</xml_diff>

<commit_message>
main v1.02 - Replaced the battery estimates with FD measured values and uses normal estimates to nudge this value using trends. Manual updated.
</commit_message>
<xml_diff>
--- a/docs/manual/BatteryCurrent_User_Manual_Preliminary.docx
+++ b/docs/manual/BatteryCurrent_User_Manual_Preliminary.docx
@@ -39,7 +39,7 @@
         <w:t xml:space="preserve">Draft status: </w:t>
       </w:r>
       <w:r>
-        <w:t xml:space="preserve">This manual is intended as a first-pass guide. </w:t>
+        <w:t>This manual is intended as a first-pass guide. Screenshot placeholders are included for later replacement or annotation.</w:t>
       </w:r>
     </w:p>
     <w:p>
@@ -52,49 +52,7 @@
     </w:p>
     <w:p>
       <w:r>
-        <w:t>BatteryCurrent is an Android overlay utility for monitoring live battery behavior while using the phone normally. The free version focuses on live current measurement, battery temperature, voltage, battery percentage, accumulated charge or energy, foreground light/dark contrast control, and the main zoomable mAh/mWh history graph. Pro features add advanced battery-health interpretation, including optional right-axis overlays, rolling-average battery capacity estimates, day-to-day estimate history, and degradation messaging.</w:t>
-      </w:r>
-    </w:p>
-    <w:p>
-      <w:r>
-        <w:t>A distinguishing use for BatteryCurrent is charging-profile monitoring. Because the app records current, voltage, temperature, battery percent, and accumulated charge over time, it can help users see how a phone actually charges, whether smart charging changes the current profile, and whether the observed behavior matches manufacturer claims.</w:t>
-      </w:r>
-    </w:p>
-    <w:p>
-      <w:pPr>
-        <w:pStyle w:val="Heading2"/>
-      </w:pPr>
-      <w:r>
-        <w:t>Free and Pro Editions</w:t>
-      </w:r>
-    </w:p>
-    <w:p>
-      <w:r>
-        <w:t>BatteryCurrent is designed so the basic current measurement is not crippled. Pro features focus on interpretation, comparison, and long-term battery-health insight.</w:t>
-      </w:r>
-    </w:p>
-    <w:p>
-      <w:pPr>
-        <w:pStyle w:val="ListBullet"/>
-      </w:pPr>
-      <w:r>
-        <w:t>Free: floating display, foreground field selection, current/temperature/voltage/battery readout, mAh/mWh totals, main graph, zoom and pan, background mode, notification access, and private capacity-event collection.</w:t>
-      </w:r>
-    </w:p>
-    <w:p>
-      <w:pPr>
-        <w:pStyle w:val="ListBullet"/>
-      </w:pPr>
-      <w:r>
-        <w:t>Pro: visible capacity estimate, 10-day estimate history table, degradation warning message, original-capacity health color coding, and selectable right Y-axis graph overlays.</w:t>
-      </w:r>
-    </w:p>
-    <w:p>
-      <w:pPr>
-        <w:pStyle w:val="ListBullet"/>
-      </w:pPr>
-      <w:r>
-        <w:t>Free mode still collects battery health event data privately so Pro insights can become useful after an upgrade.</w:t>
+        <w:t>BatteryCurrent is an Android overlay utility for monitoring live battery behavior while using the phone normally. It shows charging or discharging current, battery temperature, voltage, accumulated charge or energy, battery percentage, and a live history graph.</w:t>
       </w:r>
     </w:p>
     <w:p>
@@ -114,7 +72,7 @@
         <w:ind w:left="540" w:hanging="271"/>
       </w:pPr>
       <w:r>
-        <w:t>The graph popup provides detailed history, zooming, two-finger panning, reset zoom, a graph-only collapse mode, and control buttons. In Pro mode, it also provides selectable secondary right-axis traces and capacity-history tools.</w:t>
+        <w:t>The graph popup provides detailed history, zooming, selectable secondary traces, and control buttons.</w:t>
       </w:r>
     </w:p>
     <w:p>
@@ -134,8 +92,7 @@
         <w:ind w:left="540" w:hanging="271"/>
       </w:pPr>
       <w:r>
-        <w:lastRenderedPageBreak/>
-        <w:t>Battery capacity event logging runs in the background for qualifying charge/discharge sessions. Free users see the subtle collection indicator; Pro users can view the capacity and degradation insights.</w:t>
+        <w:t>Battery capacity event logging is handled in the background when qualifying charge or discharge sessions occur.</w:t>
       </w:r>
     </w:p>
     <w:p>
@@ -148,7 +105,7 @@
     </w:p>
     <w:p>
       <w:r>
-        <w:t>When BatteryCurrent starts, the startup screen appears first. From there, the user can start monitoring, stop monitoring, temporarily enable Pro mode for testing, choose a light or dark foreground overlay background, and optionally enter the phone's original rated battery capacity. On the first run, BatteryCurrent asks for the original capacity in mAh; this can be skipped and edited later.</w:t>
+        <w:t>When BatteryCurrent starts, the startup page provides monitoring controls, foreground display options, original battery capacity entry, and a full-discharge test launcher. Starting monitoring opens the foreground display and shows the current live values. On the first run the foreground display opens near the center of the display. On later runs it reopens at the last dragged position.</w:t>
       </w:r>
     </w:p>
     <w:p>
@@ -168,7 +125,7 @@
         <w:ind w:left="540" w:hanging="271"/>
       </w:pPr>
       <w:r>
-        <w:t>If prompted, enter the phone's original rated battery capacity in mAh, or skip it and add it later.</w:t>
+        <w:t>Grant the overlay permission if Android asks for it.</w:t>
       </w:r>
     </w:p>
     <w:p>
@@ -178,7 +135,7 @@
         <w:ind w:left="540" w:hanging="271"/>
       </w:pPr>
       <w:r>
-        <w:t>Tap Start Monitoring and grant the overlay permission if Android asks for it.</w:t>
+        <w:t>Use Start monitoring to show the foreground display, or use Full discharge test when performing a controlled full-discharge measurement.</w:t>
       </w:r>
     </w:p>
     <w:p>
@@ -188,9 +145,317 @@
         <w:ind w:left="540" w:hanging="271"/>
       </w:pPr>
       <w:r>
-        <w:t>Confirm that the foreground display appears and updates with live battery values, then tap it to open the graph popup.</w:t>
+        <w:t>Tap the foreground display to open the graph popup.</w:t>
       </w:r>
     </w:p>
+    <w:tbl>
+      <w:tblPr>
+        <w:tblW w:w="9360" w:type="dxa"/>
+        <w:jc w:val="center"/>
+        <w:tblLook w:val="04A0" w:firstRow="1" w:lastRow="0" w:firstColumn="1" w:lastColumn="0" w:noHBand="0" w:noVBand="1"/>
+      </w:tblPr>
+      <w:tblGrid>
+        <w:gridCol w:w="2700"/>
+        <w:gridCol w:w="6660"/>
+      </w:tblGrid>
+      <w:tr>
+        <w:trPr>
+          <w:jc w:val="center"/>
+        </w:trPr>
+        <w:tc>
+          <w:tcPr>
+            <w:tcW w:w="2700" w:type="dxa"/>
+            <w:tcBorders>
+              <w:top w:val="single" w:sz="8" w:space="0" w:color="D9E2EC"/>
+              <w:left w:val="single" w:sz="8" w:space="0" w:color="D9E2EC"/>
+              <w:bottom w:val="single" w:sz="8" w:space="0" w:color="D9E2EC"/>
+              <w:right w:val="single" w:sz="8" w:space="0" w:color="D9E2EC"/>
+            </w:tcBorders>
+            <w:shd w:val="clear" w:color="auto" w:fill="E8EEF5"/>
+          </w:tcPr>
+          <w:p>
+            <w:r>
+              <w:rPr>
+                <w:b/>
+              </w:rPr>
+              <w:t>Item</w:t>
+            </w:r>
+          </w:p>
+        </w:tc>
+        <w:tc>
+          <w:tcPr>
+            <w:tcW w:w="6660" w:type="dxa"/>
+            <w:tcBorders>
+              <w:top w:val="single" w:sz="8" w:space="0" w:color="D9E2EC"/>
+              <w:left w:val="single" w:sz="8" w:space="0" w:color="D9E2EC"/>
+              <w:bottom w:val="single" w:sz="8" w:space="0" w:color="D9E2EC"/>
+              <w:right w:val="single" w:sz="8" w:space="0" w:color="D9E2EC"/>
+            </w:tcBorders>
+            <w:shd w:val="clear" w:color="auto" w:fill="E8EEF5"/>
+          </w:tcPr>
+          <w:p>
+            <w:r>
+              <w:rPr>
+                <w:b/>
+              </w:rPr>
+              <w:t>What it does</w:t>
+            </w:r>
+          </w:p>
+        </w:tc>
+      </w:tr>
+      <w:tr>
+        <w:trPr>
+          <w:jc w:val="center"/>
+        </w:trPr>
+        <w:tc>
+          <w:tcPr>
+            <w:tcW w:w="2700" w:type="dxa"/>
+            <w:tcBorders>
+              <w:top w:val="single" w:sz="8" w:space="0" w:color="D9E2EC"/>
+              <w:left w:val="single" w:sz="8" w:space="0" w:color="D9E2EC"/>
+              <w:bottom w:val="single" w:sz="8" w:space="0" w:color="D9E2EC"/>
+              <w:right w:val="single" w:sz="8" w:space="0" w:color="D9E2EC"/>
+            </w:tcBorders>
+            <w:vAlign w:val="center"/>
+          </w:tcPr>
+          <w:p>
+            <w:r>
+              <w:t>X button</w:t>
+            </w:r>
+          </w:p>
+        </w:tc>
+        <w:tc>
+          <w:tcPr>
+            <w:tcW w:w="6660" w:type="dxa"/>
+            <w:tcBorders>
+              <w:top w:val="single" w:sz="8" w:space="0" w:color="D9E2EC"/>
+              <w:left w:val="single" w:sz="8" w:space="0" w:color="D9E2EC"/>
+              <w:bottom w:val="single" w:sz="8" w:space="0" w:color="D9E2EC"/>
+              <w:right w:val="single" w:sz="8" w:space="0" w:color="D9E2EC"/>
+            </w:tcBorders>
+            <w:vAlign w:val="center"/>
+          </w:tcPr>
+          <w:p>
+            <w:r>
+              <w:t>Closes the startup page without changing the monitoring state.</w:t>
+            </w:r>
+          </w:p>
+        </w:tc>
+      </w:tr>
+      <w:tr>
+        <w:trPr>
+          <w:jc w:val="center"/>
+        </w:trPr>
+        <w:tc>
+          <w:tcPr>
+            <w:tcW w:w="2700" w:type="dxa"/>
+            <w:tcBorders>
+              <w:top w:val="single" w:sz="8" w:space="0" w:color="D9E2EC"/>
+              <w:left w:val="single" w:sz="8" w:space="0" w:color="D9E2EC"/>
+              <w:bottom w:val="single" w:sz="8" w:space="0" w:color="D9E2EC"/>
+              <w:right w:val="single" w:sz="8" w:space="0" w:color="D9E2EC"/>
+            </w:tcBorders>
+            <w:vAlign w:val="center"/>
+          </w:tcPr>
+          <w:p>
+            <w:r>
+              <w:t>Reset foreground display</w:t>
+            </w:r>
+          </w:p>
+        </w:tc>
+        <w:tc>
+          <w:tcPr>
+            <w:tcW w:w="6660" w:type="dxa"/>
+            <w:tcBorders>
+              <w:top w:val="single" w:sz="8" w:space="0" w:color="D9E2EC"/>
+              <w:left w:val="single" w:sz="8" w:space="0" w:color="D9E2EC"/>
+              <w:bottom w:val="single" w:sz="8" w:space="0" w:color="D9E2EC"/>
+              <w:right w:val="single" w:sz="8" w:space="0" w:color="D9E2EC"/>
+            </w:tcBorders>
+            <w:vAlign w:val="center"/>
+          </w:tcPr>
+          <w:p>
+            <w:r>
+              <w:t>Moves the floating display back to the center if it was dragged to an unreachable edge.</w:t>
+            </w:r>
+          </w:p>
+        </w:tc>
+      </w:tr>
+      <w:tr>
+        <w:trPr>
+          <w:jc w:val="center"/>
+        </w:trPr>
+        <w:tc>
+          <w:tcPr>
+            <w:tcW w:w="2700" w:type="dxa"/>
+            <w:tcBorders>
+              <w:top w:val="single" w:sz="8" w:space="0" w:color="D9E2EC"/>
+              <w:left w:val="single" w:sz="8" w:space="0" w:color="D9E2EC"/>
+              <w:bottom w:val="single" w:sz="8" w:space="0" w:color="D9E2EC"/>
+              <w:right w:val="single" w:sz="8" w:space="0" w:color="D9E2EC"/>
+            </w:tcBorders>
+            <w:vAlign w:val="center"/>
+          </w:tcPr>
+          <w:p>
+            <w:r>
+              <w:t>Full discharge test</w:t>
+            </w:r>
+          </w:p>
+        </w:tc>
+        <w:tc>
+          <w:tcPr>
+            <w:tcW w:w="6660" w:type="dxa"/>
+            <w:tcBorders>
+              <w:top w:val="single" w:sz="8" w:space="0" w:color="D9E2EC"/>
+              <w:left w:val="single" w:sz="8" w:space="0" w:color="D9E2EC"/>
+              <w:bottom w:val="single" w:sz="8" w:space="0" w:color="D9E2EC"/>
+              <w:right w:val="single" w:sz="8" w:space="0" w:color="D9E2EC"/>
+            </w:tcBorders>
+            <w:vAlign w:val="center"/>
+          </w:tcPr>
+          <w:p>
+            <w:r>
+              <w:t>Starts the guided full-discharge</w:t>
+            </w:r>
+            <w:r>
+              <w:t xml:space="preserve"> (FD)</w:t>
+            </w:r>
+            <w:r>
+              <w:t xml:space="preserve"> test flow. The button reads Start </w:t>
+            </w:r>
+            <w:r>
+              <w:lastRenderedPageBreak/>
+              <w:t>when inactive and ON while armed or running.</w:t>
+            </w:r>
+          </w:p>
+        </w:tc>
+      </w:tr>
+      <w:tr>
+        <w:trPr>
+          <w:jc w:val="center"/>
+        </w:trPr>
+        <w:tc>
+          <w:tcPr>
+            <w:tcW w:w="2700" w:type="dxa"/>
+            <w:tcBorders>
+              <w:top w:val="single" w:sz="8" w:space="0" w:color="D9E2EC"/>
+              <w:left w:val="single" w:sz="8" w:space="0" w:color="D9E2EC"/>
+              <w:bottom w:val="single" w:sz="8" w:space="0" w:color="D9E2EC"/>
+              <w:right w:val="single" w:sz="8" w:space="0" w:color="D9E2EC"/>
+            </w:tcBorders>
+            <w:vAlign w:val="center"/>
+          </w:tcPr>
+          <w:p>
+            <w:r>
+              <w:lastRenderedPageBreak/>
+              <w:t>Light</w:t>
+            </w:r>
+            <w:r>
+              <w:t xml:space="preserve"> </w:t>
+            </w:r>
+            <w:r>
+              <w:t>theme foreground display</w:t>
+            </w:r>
+          </w:p>
+        </w:tc>
+        <w:tc>
+          <w:tcPr>
+            <w:tcW w:w="6660" w:type="dxa"/>
+            <w:tcBorders>
+              <w:top w:val="single" w:sz="8" w:space="0" w:color="D9E2EC"/>
+              <w:left w:val="single" w:sz="8" w:space="0" w:color="D9E2EC"/>
+              <w:bottom w:val="single" w:sz="8" w:space="0" w:color="D9E2EC"/>
+              <w:right w:val="single" w:sz="8" w:space="0" w:color="D9E2EC"/>
+            </w:tcBorders>
+            <w:vAlign w:val="center"/>
+          </w:tcPr>
+          <w:p>
+            <w:r>
+              <w:t>Switches the foreground overlay background for better contrast on different app backgrounds.</w:t>
+            </w:r>
+          </w:p>
+        </w:tc>
+      </w:tr>
+      <w:tr>
+        <w:trPr>
+          <w:jc w:val="center"/>
+        </w:trPr>
+        <w:tc>
+          <w:tcPr>
+            <w:tcW w:w="2700" w:type="dxa"/>
+            <w:tcBorders>
+              <w:top w:val="single" w:sz="8" w:space="0" w:color="D9E2EC"/>
+              <w:left w:val="single" w:sz="8" w:space="0" w:color="D9E2EC"/>
+              <w:bottom w:val="single" w:sz="8" w:space="0" w:color="D9E2EC"/>
+              <w:right w:val="single" w:sz="8" w:space="0" w:color="D9E2EC"/>
+            </w:tcBorders>
+            <w:vAlign w:val="center"/>
+          </w:tcPr>
+          <w:p>
+            <w:r>
+              <w:t>Original capacity</w:t>
+            </w:r>
+          </w:p>
+        </w:tc>
+        <w:tc>
+          <w:tcPr>
+            <w:tcW w:w="6660" w:type="dxa"/>
+            <w:tcBorders>
+              <w:top w:val="single" w:sz="8" w:space="0" w:color="D9E2EC"/>
+              <w:left w:val="single" w:sz="8" w:space="0" w:color="D9E2EC"/>
+              <w:bottom w:val="single" w:sz="8" w:space="0" w:color="D9E2EC"/>
+              <w:right w:val="single" w:sz="8" w:space="0" w:color="D9E2EC"/>
+            </w:tcBorders>
+            <w:vAlign w:val="center"/>
+          </w:tcPr>
+          <w:p>
+            <w:r>
+              <w:t>Stores the phone's rated battery capacity so the app can color capacity estimates relative to the original rating.</w:t>
+            </w:r>
+          </w:p>
+        </w:tc>
+      </w:tr>
+      <w:tr>
+        <w:trPr>
+          <w:jc w:val="center"/>
+        </w:trPr>
+        <w:tc>
+          <w:tcPr>
+            <w:tcW w:w="2700" w:type="dxa"/>
+            <w:tcBorders>
+              <w:top w:val="single" w:sz="8" w:space="0" w:color="D9E2EC"/>
+              <w:left w:val="single" w:sz="8" w:space="0" w:color="D9E2EC"/>
+              <w:bottom w:val="single" w:sz="8" w:space="0" w:color="D9E2EC"/>
+              <w:right w:val="single" w:sz="8" w:space="0" w:color="D9E2EC"/>
+            </w:tcBorders>
+            <w:vAlign w:val="center"/>
+          </w:tcPr>
+          <w:p>
+            <w:r>
+              <w:t>Monitor</w:t>
+            </w:r>
+          </w:p>
+        </w:tc>
+        <w:tc>
+          <w:tcPr>
+            <w:tcW w:w="6660" w:type="dxa"/>
+            <w:tcBorders>
+              <w:top w:val="single" w:sz="8" w:space="0" w:color="D9E2EC"/>
+              <w:left w:val="single" w:sz="8" w:space="0" w:color="D9E2EC"/>
+              <w:bottom w:val="single" w:sz="8" w:space="0" w:color="D9E2EC"/>
+              <w:right w:val="single" w:sz="8" w:space="0" w:color="D9E2EC"/>
+            </w:tcBorders>
+            <w:vAlign w:val="center"/>
+          </w:tcPr>
+          <w:p>
+            <w:r>
+              <w:t>Starts or stops the normal monitoring service.</w:t>
+            </w:r>
+          </w:p>
+        </w:tc>
+      </w:tr>
+    </w:tbl>
+    <w:p/>
     <w:tbl>
       <w:tblPr>
         <w:tblW w:w="9360" w:type="dxa"/>
@@ -208,89 +473,87 @@
           <w:tcPr>
             <w:tcW w:w="9360" w:type="dxa"/>
             <w:tcBorders>
-              <w:top w:val="single" w:sz="10" w:space="0" w:color="B8C2CC"/>
-              <w:left w:val="single" w:sz="10" w:space="0" w:color="B8C2CC"/>
-              <w:bottom w:val="single" w:sz="10" w:space="0" w:color="B8C2CC"/>
-              <w:right w:val="single" w:sz="10" w:space="0" w:color="B8C2CC"/>
+              <w:top w:val="single" w:sz="12" w:space="0" w:color="C7D2E1"/>
+              <w:left w:val="single" w:sz="12" w:space="0" w:color="C7D2E1"/>
+              <w:bottom w:val="single" w:sz="12" w:space="0" w:color="C7D2E1"/>
+              <w:right w:val="single" w:sz="12" w:space="0" w:color="C7D2E1"/>
             </w:tcBorders>
             <w:shd w:val="clear" w:color="auto" w:fill="F2F4F7"/>
             <w:vAlign w:val="center"/>
           </w:tcPr>
           <w:p>
             <w:pPr>
+              <w:spacing w:before="360" w:after="360"/>
               <w:jc w:val="center"/>
-              <w:rPr>
-                <w:b/>
-                <w:bCs/>
-              </w:rPr>
             </w:pPr>
             <w:r>
               <w:rPr>
                 <w:b/>
-                <w:bCs/>
+                <w:color w:val="1F4D78"/>
               </w:rPr>
-              <w:t>Figure 1: Foreground view</w:t>
-            </w:r>
-          </w:p>
-          <w:p>
-            <w:pPr>
-              <w:jc w:val="center"/>
-            </w:pPr>
-            <w:r>
-              <w:drawing>
-                <wp:inline distT="0" distB="0" distL="0" distR="0" wp14:anchorId="2F034866" wp14:editId="2BFD4E58">
-                  <wp:extent cx="2606266" cy="342930"/>
-                  <wp:effectExtent l="0" t="0" r="3810" b="0"/>
-                  <wp:docPr id="1892487653" name="Picture 1"/>
-                  <wp:cNvGraphicFramePr>
-                    <a:graphicFrameLocks xmlns:a="http://schemas.openxmlformats.org/drawingml/2006/main" noChangeAspect="1"/>
-                  </wp:cNvGraphicFramePr>
-                  <a:graphic xmlns:a="http://schemas.openxmlformats.org/drawingml/2006/main">
-                    <a:graphicData uri="http://schemas.openxmlformats.org/drawingml/2006/picture">
-                      <pic:pic xmlns:pic="http://schemas.openxmlformats.org/drawingml/2006/picture">
-                        <pic:nvPicPr>
-                          <pic:cNvPr id="1892487653" name=""/>
-                          <pic:cNvPicPr/>
-                        </pic:nvPicPr>
-                        <pic:blipFill>
-                          <a:blip r:embed="rId8"/>
-                          <a:stretch>
-                            <a:fillRect/>
-                          </a:stretch>
-                        </pic:blipFill>
-                        <pic:spPr>
-                          <a:xfrm>
-                            <a:off x="0" y="0"/>
-                            <a:ext cx="2606266" cy="342930"/>
-                          </a:xfrm>
-                          <a:prstGeom prst="rect">
-                            <a:avLst/>
-                          </a:prstGeom>
-                        </pic:spPr>
-                      </pic:pic>
-                    </a:graphicData>
-                  </a:graphic>
-                </wp:inline>
-              </w:drawing>
+              <w:t>[ Screenshot placeholder: Startup screen ]</w:t>
             </w:r>
             <w:r>
               <w:br/>
             </w:r>
-            <w:proofErr w:type="spellStart"/>
             <w:r>
-              <w:t>Datestamp</w:t>
+              <w:rPr>
+                <w:color w:val="555555"/>
+                <w:sz w:val="20"/>
+              </w:rPr>
+              <w:t>Insert a screenshot showing the startup page with Start monitoring, Full discharge test, foreground display reset, original capacity, and close X.</w:t>
             </w:r>
-            <w:proofErr w:type="spellEnd"/>
+          </w:p>
+        </w:tc>
+      </w:tr>
+    </w:tbl>
+    <w:p/>
+    <w:tbl>
+      <w:tblPr>
+        <w:tblW w:w="9360" w:type="dxa"/>
+        <w:jc w:val="center"/>
+        <w:tblLook w:val="04A0" w:firstRow="1" w:lastRow="0" w:firstColumn="1" w:lastColumn="0" w:noHBand="0" w:noVBand="1"/>
+      </w:tblPr>
+      <w:tblGrid>
+        <w:gridCol w:w="9360"/>
+      </w:tblGrid>
+      <w:tr>
+        <w:trPr>
+          <w:jc w:val="center"/>
+        </w:trPr>
+        <w:tc>
+          <w:tcPr>
+            <w:tcW w:w="9360" w:type="dxa"/>
+            <w:tcBorders>
+              <w:top w:val="single" w:sz="12" w:space="0" w:color="C7D2E1"/>
+              <w:left w:val="single" w:sz="12" w:space="0" w:color="C7D2E1"/>
+              <w:bottom w:val="single" w:sz="12" w:space="0" w:color="C7D2E1"/>
+              <w:right w:val="single" w:sz="12" w:space="0" w:color="C7D2E1"/>
+            </w:tcBorders>
+            <w:shd w:val="clear" w:color="auto" w:fill="F2F4F7"/>
+            <w:vAlign w:val="center"/>
+          </w:tcPr>
+          <w:p>
+            <w:pPr>
+              <w:spacing w:before="360" w:after="360"/>
+              <w:jc w:val="center"/>
+            </w:pPr>
             <w:r>
-              <w:t xml:space="preserve"> Current Temperature Voltage Energy/Charge </w:t>
+              <w:rPr>
+                <w:b/>
+                <w:color w:val="1F4D78"/>
+              </w:rPr>
+              <w:t>[ Screenshot placeholder: Foreground display ]</w:t>
             </w:r>
-            <w:proofErr w:type="spellStart"/>
             <w:r>
-              <w:t>BatteryChg</w:t>
+              <w:br/>
             </w:r>
-            <w:proofErr w:type="spellEnd"/>
             <w:r>
-              <w:t>%</w:t>
+              <w:rPr>
+                <w:color w:val="555555"/>
+                <w:sz w:val="20"/>
+              </w:rPr>
+              <w:t>Insert a screenshot showing the small floating overlay with time, current, temperature, voltage, energy or charge, and battery percent.</w:t>
             </w:r>
           </w:p>
         </w:tc>
@@ -307,7 +570,7 @@
     </w:p>
     <w:p>
       <w:r>
-        <w:t>The foreground display is the small live readout shown over other apps. It can be dragged to a convenient location unless it is locked. The display uses the same status colors as the graph, and the startup screen can switch the foreground background between dark and light for contrast against different apps.</w:t>
+        <w:t>The foreground display is the small live readout shown over other apps. It can be dragged to a convenient location unless it is locked.</w:t>
       </w:r>
     </w:p>
     <w:tbl>
@@ -538,7 +801,6 @@
           </w:tcPr>
           <w:p>
             <w:r>
-              <w:lastRenderedPageBreak/>
               <w:t>Energy / Charge</w:t>
             </w:r>
           </w:p>
@@ -578,10 +840,8 @@
           </w:tcPr>
           <w:p>
             <w:r>
+              <w:lastRenderedPageBreak/>
               <w:t>Battery</w:t>
-            </w:r>
-            <w:r>
-              <w:t xml:space="preserve"> Charge %</w:t>
             </w:r>
           </w:p>
         </w:tc>
@@ -620,7 +880,7 @@
           </w:tcPr>
           <w:p>
             <w:r>
-              <w:t>Version</w:t>
+              <w:t>FD prefix</w:t>
             </w:r>
           </w:p>
         </w:tc>
@@ -637,7 +897,7 @@
           </w:tcPr>
           <w:p>
             <w:r>
-              <w:t>Shows the build version, such as v1.01-dev (101) during development or v1.01 (101) for release.</w:t>
+              <w:t>Appears during a full-discharge test so the user knows the stricter test mode is active.</w:t>
             </w:r>
           </w:p>
         </w:tc>
@@ -659,7 +919,7 @@
           </w:tcPr>
           <w:p>
             <w:r>
-              <w:t>Collection dot</w:t>
+              <w:t>Status dot</w:t>
             </w:r>
           </w:p>
         </w:tc>
@@ -676,127 +936,10 @@
           </w:tcPr>
           <w:p>
             <w:r>
-              <w:t>T</w:t>
+              <w:t>A yellow dot means a capacity event is armed. A blinking green dot means a normal capacity event is recording. A blinking red dot means a full-discharge test is active.</w:t>
             </w:r>
             <w:r>
-              <w:t>he capacity status indicator now appears beside the graph title instead of before the version label.</w:t>
-            </w:r>
-          </w:p>
-        </w:tc>
-      </w:tr>
-      <w:tr>
-        <w:trPr>
-          <w:jc w:val="center"/>
-        </w:trPr>
-        <w:tc>
-          <w:tcPr>
-            <w:tcW w:w="2700" w:type="dxa"/>
-            <w:tcBorders>
-              <w:top w:val="single" w:sz="8" w:space="0" w:color="D9E2EC"/>
-              <w:left w:val="single" w:sz="8" w:space="0" w:color="D9E2EC"/>
-              <w:bottom w:val="single" w:sz="8" w:space="0" w:color="D9E2EC"/>
-              <w:right w:val="single" w:sz="8" w:space="0" w:color="D9E2EC"/>
-            </w:tcBorders>
-            <w:vAlign w:val="center"/>
-          </w:tcPr>
-          <w:p>
-            <w:r>
-              <w:t>Capacity status dot</w:t>
-            </w:r>
-          </w:p>
-        </w:tc>
-        <w:tc>
-          <w:tcPr>
-            <w:tcW w:w="6660" w:type="dxa"/>
-            <w:tcBorders>
-              <w:top w:val="single" w:sz="8" w:space="0" w:color="D9E2EC"/>
-              <w:left w:val="single" w:sz="8" w:space="0" w:color="D9E2EC"/>
-              <w:bottom w:val="single" w:sz="8" w:space="0" w:color="D9E2EC"/>
-              <w:right w:val="single" w:sz="8" w:space="0" w:color="D9E2EC"/>
-            </w:tcBorders>
-            <w:vAlign w:val="center"/>
-          </w:tcPr>
-          <w:p>
-            <w:r>
-              <w:t>Shown beside the graph title. Yellow means armed at the threshold range; blinking green means actively recording a qualifying capacity event.</w:t>
-            </w:r>
-          </w:p>
-        </w:tc>
-      </w:tr>
-      <w:tr>
-        <w:trPr>
-          <w:jc w:val="center"/>
-        </w:trPr>
-        <w:tc>
-          <w:tcPr>
-            <w:tcW w:w="2700" w:type="dxa"/>
-            <w:tcBorders>
-              <w:top w:val="single" w:sz="8" w:space="0" w:color="D9E2EC"/>
-              <w:left w:val="single" w:sz="8" w:space="0" w:color="D9E2EC"/>
-              <w:bottom w:val="single" w:sz="8" w:space="0" w:color="D9E2EC"/>
-              <w:right w:val="single" w:sz="8" w:space="0" w:color="D9E2EC"/>
-            </w:tcBorders>
-            <w:vAlign w:val="center"/>
-          </w:tcPr>
-          <w:p>
-            <w:r>
-              <w:t>Foreground theme</w:t>
-            </w:r>
-          </w:p>
-        </w:tc>
-        <w:tc>
-          <w:tcPr>
-            <w:tcW w:w="6660" w:type="dxa"/>
-            <w:tcBorders>
-              <w:top w:val="single" w:sz="8" w:space="0" w:color="D9E2EC"/>
-              <w:left w:val="single" w:sz="8" w:space="0" w:color="D9E2EC"/>
-              <w:bottom w:val="single" w:sz="8" w:space="0" w:color="D9E2EC"/>
-              <w:right w:val="single" w:sz="8" w:space="0" w:color="D9E2EC"/>
-            </w:tcBorders>
-            <w:vAlign w:val="center"/>
-          </w:tcPr>
-          <w:p>
-            <w:r>
-              <w:t>Startup-screen switch that chooses a dark or light foreground overlay background for better contrast.</w:t>
-            </w:r>
-          </w:p>
-        </w:tc>
-      </w:tr>
-      <w:tr>
-        <w:trPr>
-          <w:jc w:val="center"/>
-        </w:trPr>
-        <w:tc>
-          <w:tcPr>
-            <w:tcW w:w="2700" w:type="dxa"/>
-            <w:tcBorders>
-              <w:top w:val="single" w:sz="8" w:space="0" w:color="D9E2EC"/>
-              <w:left w:val="single" w:sz="8" w:space="0" w:color="D9E2EC"/>
-              <w:bottom w:val="single" w:sz="8" w:space="0" w:color="D9E2EC"/>
-              <w:right w:val="single" w:sz="8" w:space="0" w:color="D9E2EC"/>
-            </w:tcBorders>
-            <w:vAlign w:val="center"/>
-          </w:tcPr>
-          <w:p>
-            <w:r>
-              <w:t>Foreground status dot</w:t>
-            </w:r>
-          </w:p>
-        </w:tc>
-        <w:tc>
-          <w:tcPr>
-            <w:tcW w:w="6660" w:type="dxa"/>
-            <w:tcBorders>
-              <w:top w:val="single" w:sz="8" w:space="0" w:color="D9E2EC"/>
-              <w:left w:val="single" w:sz="8" w:space="0" w:color="D9E2EC"/>
-              <w:bottom w:val="single" w:sz="8" w:space="0" w:color="D9E2EC"/>
-              <w:right w:val="single" w:sz="8" w:space="0" w:color="D9E2EC"/>
-            </w:tcBorders>
-            <w:vAlign w:val="center"/>
-          </w:tcPr>
-          <w:p>
-            <w:r>
-              <w:t>Dot at the right edge of the foreground display. Yellow means armed; slow pulsing green means actively recording a qualifying capacity event.</w:t>
+              <w:t xml:space="preserve"> </w:t>
             </w:r>
           </w:p>
         </w:tc>
@@ -813,7 +956,7 @@
     </w:p>
     <w:p>
       <w:r>
-        <w:t>Tap the foreground display to open the graph popup. Free mode shows the main accumulated mAh or mWh trace, zoom controls, graph-only collapse control, and app controls. Pro mode adds the optional right-axis selector plus capacity and degradation information.</w:t>
+        <w:t>Tap the foreground display to open the graph popup. The popup shows the main accumulated mAh or mWh trace and an optional right-axis trace.</w:t>
       </w:r>
     </w:p>
     <w:tbl>
@@ -888,7 +1031,16 @@
           </w:tcPr>
           <w:p>
             <w:r>
-              <w:t>x button</w:t>
+              <w:t>[</w:t>
+            </w:r>
+            <w:r>
+              <w:t>x</w:t>
+            </w:r>
+            <w:r>
+              <w:t>]</w:t>
+            </w:r>
+            <w:r>
+              <w:t xml:space="preserve"> button</w:t>
             </w:r>
           </w:p>
         </w:tc>
@@ -1102,6 +1254,9 @@
             <w:r>
               <w:t>Resets the accumulated mAh or mWh value to zero and starts a new graph timeline.</w:t>
             </w:r>
+            <w:r>
+              <w:t xml:space="preserve"> Any running measurement is terminated.</w:t>
+            </w:r>
           </w:p>
         </w:tc>
       </w:tr>
@@ -1161,8 +1316,7 @@
           </w:tcPr>
           <w:p>
             <w:r>
-              <w:lastRenderedPageBreak/>
-              <w:t>Right-axis label</w:t>
+              <w:t>Display toggles</w:t>
             </w:r>
           </w:p>
         </w:tc>
@@ -1179,7 +1333,7 @@
           </w:tcPr>
           <w:p>
             <w:r>
-              <w:t>Pro feature. Tap the grey boxed label to select Batt %, Temp, Volt, or mA as a secondary trace.</w:t>
+              <w:t>Turn individual foreground-display fields on or off. The notification keeps showing the full live value set.</w:t>
             </w:r>
           </w:p>
         </w:tc>
@@ -1201,7 +1355,7 @@
           </w:tcPr>
           <w:p>
             <w:r>
-              <w:t>Estimated capacity</w:t>
+              <w:t>SOC Curve</w:t>
             </w:r>
           </w:p>
         </w:tc>
@@ -1218,85 +1372,7 @@
           </w:tcPr>
           <w:p>
             <w:r>
-              <w:t>Pro feature. Shows the rolling-average estimated battery capacity when enough qualifying event data exists.</w:t>
-            </w:r>
-          </w:p>
-        </w:tc>
-      </w:tr>
-      <w:tr>
-        <w:trPr>
-          <w:jc w:val="center"/>
-        </w:trPr>
-        <w:tc>
-          <w:tcPr>
-            <w:tcW w:w="2700" w:type="dxa"/>
-            <w:tcBorders>
-              <w:top w:val="single" w:sz="8" w:space="0" w:color="D9E2EC"/>
-              <w:left w:val="single" w:sz="8" w:space="0" w:color="D9E2EC"/>
-              <w:bottom w:val="single" w:sz="8" w:space="0" w:color="D9E2EC"/>
-              <w:right w:val="single" w:sz="8" w:space="0" w:color="D9E2EC"/>
-            </w:tcBorders>
-            <w:vAlign w:val="center"/>
-          </w:tcPr>
-          <w:p>
-            <w:r>
-              <w:t>Original capacity</w:t>
-            </w:r>
-          </w:p>
-        </w:tc>
-        <w:tc>
-          <w:tcPr>
-            <w:tcW w:w="6660" w:type="dxa"/>
-            <w:tcBorders>
-              <w:top w:val="single" w:sz="8" w:space="0" w:color="D9E2EC"/>
-              <w:left w:val="single" w:sz="8" w:space="0" w:color="D9E2EC"/>
-              <w:bottom w:val="single" w:sz="8" w:space="0" w:color="D9E2EC"/>
-              <w:right w:val="single" w:sz="8" w:space="0" w:color="D9E2EC"/>
-            </w:tcBorders>
-            <w:vAlign w:val="center"/>
-          </w:tcPr>
-          <w:p>
-            <w:r>
-              <w:t>Optional startup setting. Used to color-code the estimated capacity value against the phone's rated capacity.</w:t>
-            </w:r>
-          </w:p>
-        </w:tc>
-      </w:tr>
-      <w:tr>
-        <w:trPr>
-          <w:jc w:val="center"/>
-        </w:trPr>
-        <w:tc>
-          <w:tcPr>
-            <w:tcW w:w="2700" w:type="dxa"/>
-            <w:tcBorders>
-              <w:top w:val="single" w:sz="8" w:space="0" w:color="D9E2EC"/>
-              <w:left w:val="single" w:sz="8" w:space="0" w:color="D9E2EC"/>
-              <w:bottom w:val="single" w:sz="8" w:space="0" w:color="D9E2EC"/>
-              <w:right w:val="single" w:sz="8" w:space="0" w:color="D9E2EC"/>
-            </w:tcBorders>
-            <w:vAlign w:val="center"/>
-          </w:tcPr>
-          <w:p>
-            <w:r>
-              <w:t>Temporary Pro</w:t>
-            </w:r>
-          </w:p>
-        </w:tc>
-        <w:tc>
-          <w:tcPr>
-            <w:tcW w:w="6660" w:type="dxa"/>
-            <w:tcBorders>
-              <w:top w:val="single" w:sz="8" w:space="0" w:color="D9E2EC"/>
-              <w:left w:val="single" w:sz="8" w:space="0" w:color="D9E2EC"/>
-              <w:bottom w:val="single" w:sz="8" w:space="0" w:color="D9E2EC"/>
-              <w:right w:val="single" w:sz="8" w:space="0" w:color="D9E2EC"/>
-            </w:tcBorders>
-            <w:vAlign w:val="center"/>
-          </w:tcPr>
-          <w:p>
-            <w:r>
-              <w:t>Startup-screen testing switch used to preview Pro behavior during development.</w:t>
+              <w:t>Opens the learned state-of-charge linearity view.</w:t>
             </w:r>
           </w:p>
         </w:tc>
@@ -1335,124 +1411,7 @@
           </w:tcPr>
           <w:p>
             <w:r>
-              <w:t>Small yellow arrow below the graph. Tap to hide or show the menu buttons and capacity controls.</w:t>
-            </w:r>
-          </w:p>
-        </w:tc>
-      </w:tr>
-      <w:tr>
-        <w:trPr>
-          <w:jc w:val="center"/>
-        </w:trPr>
-        <w:tc>
-          <w:tcPr>
-            <w:tcW w:w="2700" w:type="dxa"/>
-            <w:tcBorders>
-              <w:top w:val="single" w:sz="8" w:space="0" w:color="D9E2EC"/>
-              <w:left w:val="single" w:sz="8" w:space="0" w:color="D9E2EC"/>
-              <w:bottom w:val="single" w:sz="8" w:space="0" w:color="D9E2EC"/>
-              <w:right w:val="single" w:sz="8" w:space="0" w:color="D9E2EC"/>
-            </w:tcBorders>
-            <w:vAlign w:val="center"/>
-          </w:tcPr>
-          <w:p>
-            <w:r>
-              <w:t>Capacity history</w:t>
-            </w:r>
-          </w:p>
-        </w:tc>
-        <w:tc>
-          <w:tcPr>
-            <w:tcW w:w="6660" w:type="dxa"/>
-            <w:tcBorders>
-              <w:top w:val="single" w:sz="8" w:space="0" w:color="D9E2EC"/>
-              <w:left w:val="single" w:sz="8" w:space="0" w:color="D9E2EC"/>
-              <w:bottom w:val="single" w:sz="8" w:space="0" w:color="D9E2EC"/>
-              <w:right w:val="single" w:sz="8" w:space="0" w:color="D9E2EC"/>
-            </w:tcBorders>
-            <w:vAlign w:val="center"/>
-          </w:tcPr>
-          <w:p>
-            <w:r>
-              <w:t>Pro feature. Tap the estimated capacity line to show a mini-table of the last 10 daily estimates.</w:t>
-            </w:r>
-          </w:p>
-        </w:tc>
-      </w:tr>
-      <w:tr>
-        <w:trPr>
-          <w:jc w:val="center"/>
-        </w:trPr>
-        <w:tc>
-          <w:tcPr>
-            <w:tcW w:w="2700" w:type="dxa"/>
-            <w:tcBorders>
-              <w:top w:val="single" w:sz="8" w:space="0" w:color="D9E2EC"/>
-              <w:left w:val="single" w:sz="8" w:space="0" w:color="D9E2EC"/>
-              <w:bottom w:val="single" w:sz="8" w:space="0" w:color="D9E2EC"/>
-              <w:right w:val="single" w:sz="8" w:space="0" w:color="D9E2EC"/>
-            </w:tcBorders>
-            <w:vAlign w:val="center"/>
-          </w:tcPr>
-          <w:p>
-            <w:r>
-              <w:t>Batt % thresholds</w:t>
-            </w:r>
-          </w:p>
-        </w:tc>
-        <w:tc>
-          <w:tcPr>
-            <w:tcW w:w="6660" w:type="dxa"/>
-            <w:tcBorders>
-              <w:top w:val="single" w:sz="8" w:space="0" w:color="D9E2EC"/>
-              <w:left w:val="single" w:sz="8" w:space="0" w:color="D9E2EC"/>
-              <w:bottom w:val="single" w:sz="8" w:space="0" w:color="D9E2EC"/>
-              <w:right w:val="single" w:sz="8" w:space="0" w:color="D9E2EC"/>
-            </w:tcBorders>
-            <w:vAlign w:val="center"/>
-          </w:tcPr>
-          <w:p>
-            <w:r>
-              <w:t>Pro graph aid. When Batt % is selected on the right axis, faint dashed lines mark 25% and 75%.</w:t>
-            </w:r>
-          </w:p>
-        </w:tc>
-      </w:tr>
-      <w:tr>
-        <w:trPr>
-          <w:jc w:val="center"/>
-        </w:trPr>
-        <w:tc>
-          <w:tcPr>
-            <w:tcW w:w="2700" w:type="dxa"/>
-            <w:tcBorders>
-              <w:top w:val="single" w:sz="8" w:space="0" w:color="D9E2EC"/>
-              <w:left w:val="single" w:sz="8" w:space="0" w:color="D9E2EC"/>
-              <w:bottom w:val="single" w:sz="8" w:space="0" w:color="D9E2EC"/>
-              <w:right w:val="single" w:sz="8" w:space="0" w:color="D9E2EC"/>
-            </w:tcBorders>
-            <w:vAlign w:val="center"/>
-          </w:tcPr>
-          <w:p>
-            <w:r>
-              <w:t>Foreground theme</w:t>
-            </w:r>
-          </w:p>
-        </w:tc>
-        <w:tc>
-          <w:tcPr>
-            <w:tcW w:w="6660" w:type="dxa"/>
-            <w:tcBorders>
-              <w:top w:val="single" w:sz="8" w:space="0" w:color="D9E2EC"/>
-              <w:left w:val="single" w:sz="8" w:space="0" w:color="D9E2EC"/>
-              <w:bottom w:val="single" w:sz="8" w:space="0" w:color="D9E2EC"/>
-              <w:right w:val="single" w:sz="8" w:space="0" w:color="D9E2EC"/>
-            </w:tcBorders>
-            <w:vAlign w:val="center"/>
-          </w:tcPr>
-          <w:p>
-            <w:r>
-              <w:t>Startup-screen switch. Use light or dark foreground overlay background depending on what contrasts best with other apps.</w:t>
+              <w:t>Collapses or expands the menu buttons so the user can leave only the graph visible.</w:t>
             </w:r>
           </w:p>
         </w:tc>
@@ -1476,75 +1435,88 @@
           <w:tcPr>
             <w:tcW w:w="9360" w:type="dxa"/>
             <w:tcBorders>
-              <w:top w:val="single" w:sz="10" w:space="0" w:color="B8C2CC"/>
-              <w:left w:val="single" w:sz="10" w:space="0" w:color="B8C2CC"/>
-              <w:bottom w:val="single" w:sz="10" w:space="0" w:color="B8C2CC"/>
-              <w:right w:val="single" w:sz="10" w:space="0" w:color="B8C2CC"/>
+              <w:top w:val="single" w:sz="12" w:space="0" w:color="C7D2E1"/>
+              <w:left w:val="single" w:sz="12" w:space="0" w:color="C7D2E1"/>
+              <w:bottom w:val="single" w:sz="12" w:space="0" w:color="C7D2E1"/>
+              <w:right w:val="single" w:sz="12" w:space="0" w:color="C7D2E1"/>
             </w:tcBorders>
             <w:shd w:val="clear" w:color="auto" w:fill="F2F4F7"/>
             <w:vAlign w:val="center"/>
           </w:tcPr>
           <w:p>
             <w:pPr>
+              <w:spacing w:before="360" w:after="360"/>
               <w:jc w:val="center"/>
             </w:pPr>
             <w:r>
               <w:rPr>
                 <w:b/>
-                <w:bCs/>
+                <w:color w:val="1F4D78"/>
               </w:rPr>
-              <w:t xml:space="preserve">Figure 2: </w:t>
+              <w:t>[ Screenshot placeholder: Graph popup ]</w:t>
+            </w:r>
+            <w:r>
+              <w:br/>
             </w:r>
             <w:r>
               <w:rPr>
+                <w:color w:val="555555"/>
+                <w:sz w:val="20"/>
+              </w:rPr>
+              <w:lastRenderedPageBreak/>
+              <w:t>Insert a screenshot showing the graph popup, controls, right-axis selector, FD/adjusted capacity line, and Reset Zoom button if visible.</w:t>
+            </w:r>
+          </w:p>
+        </w:tc>
+      </w:tr>
+    </w:tbl>
+    <w:p/>
+    <w:tbl>
+      <w:tblPr>
+        <w:tblW w:w="9360" w:type="dxa"/>
+        <w:jc w:val="center"/>
+        <w:tblLook w:val="04A0" w:firstRow="1" w:lastRow="0" w:firstColumn="1" w:lastColumn="0" w:noHBand="0" w:noVBand="1"/>
+      </w:tblPr>
+      <w:tblGrid>
+        <w:gridCol w:w="9360"/>
+      </w:tblGrid>
+      <w:tr>
+        <w:trPr>
+          <w:jc w:val="center"/>
+        </w:trPr>
+        <w:tc>
+          <w:tcPr>
+            <w:tcW w:w="9360" w:type="dxa"/>
+            <w:tcBorders>
+              <w:top w:val="single" w:sz="12" w:space="0" w:color="C7D2E1"/>
+              <w:left w:val="single" w:sz="12" w:space="0" w:color="C7D2E1"/>
+              <w:bottom w:val="single" w:sz="12" w:space="0" w:color="C7D2E1"/>
+              <w:right w:val="single" w:sz="12" w:space="0" w:color="C7D2E1"/>
+            </w:tcBorders>
+            <w:shd w:val="clear" w:color="auto" w:fill="F2F4F7"/>
+            <w:vAlign w:val="center"/>
+          </w:tcPr>
+          <w:p>
+            <w:pPr>
+              <w:spacing w:before="360" w:after="360"/>
+              <w:jc w:val="center"/>
+            </w:pPr>
+            <w:r>
+              <w:rPr>
                 <w:b/>
-                <w:bCs/>
+                <w:color w:val="1F4D78"/>
               </w:rPr>
-              <w:t>Graph popup - expanded controls</w:t>
+              <w:t>[ Screenshot placeholder: Collapsed graph menu ]</w:t>
+            </w:r>
+            <w:r>
+              <w:br/>
             </w:r>
             <w:r>
               <w:rPr>
-                <w:b/>
-                <w:bCs/>
+                <w:color w:val="555555"/>
+                <w:sz w:val="20"/>
               </w:rPr>
-              <w:br/>
-            </w:r>
-            <w:r>
-              <w:drawing>
-                <wp:inline distT="0" distB="0" distL="0" distR="0" wp14:anchorId="4C2BDF1A" wp14:editId="3CDEB052">
-                  <wp:extent cx="2369938" cy="3413760"/>
-                  <wp:effectExtent l="0" t="0" r="0" b="0"/>
-                  <wp:docPr id="290696599" name="Picture 1"/>
-                  <wp:cNvGraphicFramePr>
-                    <a:graphicFrameLocks xmlns:a="http://schemas.openxmlformats.org/drawingml/2006/main" noChangeAspect="1"/>
-                  </wp:cNvGraphicFramePr>
-                  <a:graphic xmlns:a="http://schemas.openxmlformats.org/drawingml/2006/main">
-                    <a:graphicData uri="http://schemas.openxmlformats.org/drawingml/2006/picture">
-                      <pic:pic xmlns:pic="http://schemas.openxmlformats.org/drawingml/2006/picture">
-                        <pic:nvPicPr>
-                          <pic:cNvPr id="290696599" name=""/>
-                          <pic:cNvPicPr/>
-                        </pic:nvPicPr>
-                        <pic:blipFill>
-                          <a:blip r:embed="rId9"/>
-                          <a:stretch>
-                            <a:fillRect/>
-                          </a:stretch>
-                        </pic:blipFill>
-                        <pic:spPr>
-                          <a:xfrm>
-                            <a:off x="0" y="0"/>
-                            <a:ext cx="2387764" cy="3439437"/>
-                          </a:xfrm>
-                          <a:prstGeom prst="rect">
-                            <a:avLst/>
-                          </a:prstGeom>
-                        </pic:spPr>
-                      </pic:pic>
-                    </a:graphicData>
-                  </a:graphic>
-                </wp:inline>
-              </w:drawing>
+              <w:t>Insert a screenshot showing the graph popup with the button menu collapsed so only the graph and compact summary remain visible.</w:t>
             </w:r>
           </w:p>
         </w:tc>
@@ -1561,7 +1533,7 @@
     </w:p>
     <w:p>
       <w:r>
-        <w:t>The left axis shows accumulated mAh or mWh. Rising green sections indicate increasing accumulated value; falling red sections indicate decreasing accumulated value. In Pro mode, the right axis can show battery percent, temperature, voltage, or current.</w:t>
+        <w:t>The left axis shows accumulated mAh or mWh. Rising green sections indicate increasing accumulated value; falling red sections indicate decreasing accumulated value. The right axis is selectable and can show battery percent, temperature, voltage, or current. The graph can also be used to verify charging profiles, such as smart charging behavior and manufacturer charging claims.</w:t>
       </w:r>
     </w:p>
     <w:p>
@@ -1571,7 +1543,7 @@
         <w:ind w:left="540" w:hanging="271"/>
       </w:pPr>
       <w:r>
-        <w:t>In Pro mode, tap the grey right-axis label to cycle through Batt %, Temp, Volt, and mA.</w:t>
+        <w:t>Tap the grey right-axis label to cycle through Batt %, Temp, Volt, and mA.</w:t>
       </w:r>
     </w:p>
     <w:p>
@@ -1581,7 +1553,7 @@
         <w:ind w:left="540" w:hanging="271"/>
       </w:pPr>
       <w:r>
-        <w:t>Battery percent uses a fixed 0 to 100 scale. When Batt % is selected, faint dashed threshold lines mark 25% in red and 75% in green.</w:t>
+        <w:t>Battery percent, voltage, temperature, and current auto-scale for the visible data. Battery percent can extend above 100% only when manually zoomed.</w:t>
       </w:r>
     </w:p>
     <w:p>
@@ -1591,27 +1563,7 @@
         <w:ind w:left="540" w:hanging="271"/>
       </w:pPr>
       <w:r>
-        <w:t>Voltage uses a fixed 3.5 V to 4.5 V scale.</w:t>
-      </w:r>
-    </w:p>
-    <w:p>
-      <w:pPr>
-        <w:pStyle w:val="ListBullet"/>
-        <w:spacing w:after="80"/>
-        <w:ind w:left="540" w:hanging="271"/>
-      </w:pPr>
-      <w:r>
-        <w:t>Temperature and current auto-scale based on the visible data.</w:t>
-      </w:r>
-    </w:p>
-    <w:p>
-      <w:pPr>
-        <w:pStyle w:val="ListBullet"/>
-        <w:spacing w:after="80"/>
-        <w:ind w:left="540" w:hanging="271"/>
-      </w:pPr>
-      <w:r>
-        <w:t>For Pro mA mode, positive current is blue and negative current is yellow, with a dashed zero-current reference line.</w:t>
+        <w:t>For mA mode, positive current is blue and negative current is yellow, with a dashed zero-current reference line.</w:t>
       </w:r>
     </w:p>
     <w:p>
@@ -1626,6 +1578,16 @@
     </w:p>
     <w:p>
       <w:pPr>
+        <w:pStyle w:val="ListBullet"/>
+        <w:spacing w:after="80"/>
+        <w:ind w:left="540" w:hanging="271"/>
+      </w:pPr>
+      <w:r>
+        <w:t>When Batt % is selected, faint reference lines mark the 25% and 75% capacity-event thresholds.</w:t>
+      </w:r>
+    </w:p>
+    <w:p>
+      <w:pPr>
         <w:pStyle w:val="Heading1"/>
       </w:pPr>
       <w:r>
@@ -1634,136 +1596,26 @@
     </w:p>
     <w:p>
       <w:r>
-        <w:t>The popup itself and the graph timeline use different gestures so they do not interfere with each other. Use the small yellow arrow below the graph to collapse or expand the menu buttons when you want a cleaner graph-only view.</w:t>
-      </w:r>
-    </w:p>
-    <w:p>
-      <w:pPr>
-        <w:pStyle w:val="Heading3"/>
-        <w:jc w:val="center"/>
-      </w:pPr>
-      <w:r>
-        <w:t>Screenshot placeholder: collapsed graph-only view</w:t>
+        <w:t>The popup itself and graph zooming use deliberate controls so the user can move the popup without accidentally changing the graph scale.</w:t>
       </w:r>
     </w:p>
     <w:tbl>
       <w:tblPr>
-        <w:tblW w:w="0" w:type="auto"/>
+        <w:tblW w:w="9360" w:type="dxa"/>
         <w:jc w:val="center"/>
         <w:tblLook w:val="04A0" w:firstRow="1" w:lastRow="0" w:firstColumn="1" w:lastColumn="0" w:noHBand="0" w:noVBand="1"/>
       </w:tblPr>
       <w:tblGrid>
-        <w:gridCol w:w="5841"/>
-        <w:gridCol w:w="3339"/>
-        <w:gridCol w:w="396"/>
+        <w:gridCol w:w="2700"/>
+        <w:gridCol w:w="6660"/>
       </w:tblGrid>
-      <w:tr>
-        <w:trPr>
-          <w:gridAfter w:val="1"/>
-          <w:wAfter w:w="396" w:type="dxa"/>
-          <w:jc w:val="center"/>
-        </w:trPr>
-        <w:tc>
-          <w:tcPr>
-            <w:tcW w:w="9180" w:type="dxa"/>
-            <w:gridSpan w:val="2"/>
-            <w:tcBorders>
-              <w:top w:val="single" w:sz="10" w:space="0" w:color="B8C2CC"/>
-              <w:left w:val="single" w:sz="10" w:space="0" w:color="B8C2CC"/>
-              <w:bottom w:val="single" w:sz="10" w:space="0" w:color="B8C2CC"/>
-              <w:right w:val="single" w:sz="10" w:space="0" w:color="B8C2CC"/>
-            </w:tcBorders>
-            <w:vAlign w:val="center"/>
-          </w:tcPr>
-          <w:p>
-            <w:pPr>
-              <w:jc w:val="center"/>
-            </w:pPr>
-            <w:r>
-              <w:rPr>
-                <w:b/>
-                <w:bCs/>
-              </w:rPr>
-              <w:t xml:space="preserve">Figure 3: </w:t>
-            </w:r>
-            <w:r>
-              <w:rPr>
-                <w:b/>
-                <w:bCs/>
-              </w:rPr>
-              <w:t>Graph popup - collapsed menu view</w:t>
-            </w:r>
-            <w:r>
-              <w:rPr>
-                <w:b/>
-                <w:bCs/>
-              </w:rPr>
-              <w:t xml:space="preserve"> </w:t>
-            </w:r>
-            <w:r>
-              <w:rPr>
-                <w:b/>
-                <w:bCs/>
-              </w:rPr>
-              <w:t>visible.</w:t>
-            </w:r>
-            <w:r>
-              <w:rPr>
-                <w:noProof/>
-              </w:rPr>
-              <w:t xml:space="preserve"> </w:t>
-            </w:r>
-            <w:r>
-              <w:rPr>
-                <w:b/>
-                <w:bCs/>
-              </w:rPr>
-              <w:drawing>
-                <wp:inline distT="0" distB="0" distL="0" distR="0" wp14:anchorId="539F2EA3" wp14:editId="1CCD0692">
-                  <wp:extent cx="2720576" cy="2530059"/>
-                  <wp:effectExtent l="0" t="0" r="3810" b="3810"/>
-                  <wp:docPr id="2124487323" name="Picture 1"/>
-                  <wp:cNvGraphicFramePr>
-                    <a:graphicFrameLocks xmlns:a="http://schemas.openxmlformats.org/drawingml/2006/main" noChangeAspect="1"/>
-                  </wp:cNvGraphicFramePr>
-                  <a:graphic xmlns:a="http://schemas.openxmlformats.org/drawingml/2006/main">
-                    <a:graphicData uri="http://schemas.openxmlformats.org/drawingml/2006/picture">
-                      <pic:pic xmlns:pic="http://schemas.openxmlformats.org/drawingml/2006/picture">
-                        <pic:nvPicPr>
-                          <pic:cNvPr id="2124487323" name=""/>
-                          <pic:cNvPicPr/>
-                        </pic:nvPicPr>
-                        <pic:blipFill>
-                          <a:blip r:embed="rId10"/>
-                          <a:stretch>
-                            <a:fillRect/>
-                          </a:stretch>
-                        </pic:blipFill>
-                        <pic:spPr>
-                          <a:xfrm>
-                            <a:off x="0" y="0"/>
-                            <a:ext cx="2720576" cy="2530059"/>
-                          </a:xfrm>
-                          <a:prstGeom prst="rect">
-                            <a:avLst/>
-                          </a:prstGeom>
-                        </pic:spPr>
-                      </pic:pic>
-                    </a:graphicData>
-                  </a:graphic>
-                </wp:inline>
-              </w:drawing>
-            </w:r>
-          </w:p>
-        </w:tc>
-      </w:tr>
       <w:tr>
         <w:trPr>
           <w:jc w:val="center"/>
         </w:trPr>
         <w:tc>
           <w:tcPr>
-            <w:tcW w:w="5841" w:type="dxa"/>
+            <w:tcW w:w="2700" w:type="dxa"/>
             <w:tcBorders>
               <w:top w:val="single" w:sz="8" w:space="0" w:color="D9E2EC"/>
               <w:left w:val="single" w:sz="8" w:space="0" w:color="D9E2EC"/>
@@ -1777,15 +1629,13 @@
               <w:rPr>
                 <w:b/>
               </w:rPr>
-              <w:lastRenderedPageBreak/>
               <w:t>Item</w:t>
             </w:r>
           </w:p>
         </w:tc>
         <w:tc>
           <w:tcPr>
-            <w:tcW w:w="3735" w:type="dxa"/>
-            <w:gridSpan w:val="2"/>
+            <w:tcW w:w="6660" w:type="dxa"/>
             <w:tcBorders>
               <w:top w:val="single" w:sz="8" w:space="0" w:color="D9E2EC"/>
               <w:left w:val="single" w:sz="8" w:space="0" w:color="D9E2EC"/>
@@ -1810,7 +1660,7 @@
         </w:trPr>
         <w:tc>
           <w:tcPr>
-            <w:tcW w:w="5841" w:type="dxa"/>
+            <w:tcW w:w="2700" w:type="dxa"/>
             <w:tcBorders>
               <w:top w:val="single" w:sz="8" w:space="0" w:color="D9E2EC"/>
               <w:left w:val="single" w:sz="8" w:space="0" w:color="D9E2EC"/>
@@ -1827,8 +1677,7 @@
         </w:tc>
         <w:tc>
           <w:tcPr>
-            <w:tcW w:w="3735" w:type="dxa"/>
-            <w:gridSpan w:val="2"/>
+            <w:tcW w:w="6660" w:type="dxa"/>
             <w:tcBorders>
               <w:top w:val="single" w:sz="8" w:space="0" w:color="D9E2EC"/>
               <w:left w:val="single" w:sz="8" w:space="0" w:color="D9E2EC"/>
@@ -1850,7 +1699,7 @@
         </w:trPr>
         <w:tc>
           <w:tcPr>
-            <w:tcW w:w="5841" w:type="dxa"/>
+            <w:tcW w:w="2700" w:type="dxa"/>
             <w:tcBorders>
               <w:top w:val="single" w:sz="8" w:space="0" w:color="D9E2EC"/>
               <w:left w:val="single" w:sz="8" w:space="0" w:color="D9E2EC"/>
@@ -1861,14 +1710,13 @@
           </w:tcPr>
           <w:p>
             <w:r>
-              <w:t>Two-finger pinch</w:t>
+              <w:t>X-axis zoom button</w:t>
             </w:r>
           </w:p>
         </w:tc>
         <w:tc>
           <w:tcPr>
-            <w:tcW w:w="3735" w:type="dxa"/>
-            <w:gridSpan w:val="2"/>
+            <w:tcW w:w="6660" w:type="dxa"/>
             <w:tcBorders>
               <w:top w:val="single" w:sz="8" w:space="0" w:color="D9E2EC"/>
               <w:left w:val="single" w:sz="8" w:space="0" w:color="D9E2EC"/>
@@ -1879,7 +1727,7 @@
           </w:tcPr>
           <w:p>
             <w:r>
-              <w:t>Zooms the graph timeline in or out.</w:t>
+              <w:t>Selects horizontal time zoom. The selected zoom axis is highlighted.</w:t>
             </w:r>
           </w:p>
         </w:tc>
@@ -1890,7 +1738,86 @@
         </w:trPr>
         <w:tc>
           <w:tcPr>
-            <w:tcW w:w="5841" w:type="dxa"/>
+            <w:tcW w:w="2700" w:type="dxa"/>
+            <w:tcBorders>
+              <w:top w:val="single" w:sz="8" w:space="0" w:color="D9E2EC"/>
+              <w:left w:val="single" w:sz="8" w:space="0" w:color="D9E2EC"/>
+              <w:bottom w:val="single" w:sz="8" w:space="0" w:color="D9E2EC"/>
+              <w:right w:val="single" w:sz="8" w:space="0" w:color="D9E2EC"/>
+            </w:tcBorders>
+            <w:vAlign w:val="center"/>
+          </w:tcPr>
+          <w:p>
+            <w:r>
+              <w:t>Y-axis zoom button</w:t>
+            </w:r>
+          </w:p>
+        </w:tc>
+        <w:tc>
+          <w:tcPr>
+            <w:tcW w:w="6660" w:type="dxa"/>
+            <w:tcBorders>
+              <w:top w:val="single" w:sz="8" w:space="0" w:color="D9E2EC"/>
+              <w:left w:val="single" w:sz="8" w:space="0" w:color="D9E2EC"/>
+              <w:bottom w:val="single" w:sz="8" w:space="0" w:color="D9E2EC"/>
+              <w:right w:val="single" w:sz="8" w:space="0" w:color="D9E2EC"/>
+            </w:tcBorders>
+            <w:vAlign w:val="center"/>
+          </w:tcPr>
+          <w:p>
+            <w:r>
+              <w:t>Selects vertical/right-axis zoom. Use this when the right-axis trace needs more detail.</w:t>
+            </w:r>
+          </w:p>
+        </w:tc>
+      </w:tr>
+      <w:tr>
+        <w:trPr>
+          <w:jc w:val="center"/>
+        </w:trPr>
+        <w:tc>
+          <w:tcPr>
+            <w:tcW w:w="2700" w:type="dxa"/>
+            <w:tcBorders>
+              <w:top w:val="single" w:sz="8" w:space="0" w:color="D9E2EC"/>
+              <w:left w:val="single" w:sz="8" w:space="0" w:color="D9E2EC"/>
+              <w:bottom w:val="single" w:sz="8" w:space="0" w:color="D9E2EC"/>
+              <w:right w:val="single" w:sz="8" w:space="0" w:color="D9E2EC"/>
+            </w:tcBorders>
+            <w:vAlign w:val="center"/>
+          </w:tcPr>
+          <w:p>
+            <w:r>
+              <w:lastRenderedPageBreak/>
+              <w:t>Two-finger pinch</w:t>
+            </w:r>
+          </w:p>
+        </w:tc>
+        <w:tc>
+          <w:tcPr>
+            <w:tcW w:w="6660" w:type="dxa"/>
+            <w:tcBorders>
+              <w:top w:val="single" w:sz="8" w:space="0" w:color="D9E2EC"/>
+              <w:left w:val="single" w:sz="8" w:space="0" w:color="D9E2EC"/>
+              <w:bottom w:val="single" w:sz="8" w:space="0" w:color="D9E2EC"/>
+              <w:right w:val="single" w:sz="8" w:space="0" w:color="D9E2EC"/>
+            </w:tcBorders>
+            <w:vAlign w:val="center"/>
+          </w:tcPr>
+          <w:p>
+            <w:r>
+              <w:t>Zooms the selected axis. Pinch gestures can be performed over the popup area for easier control.</w:t>
+            </w:r>
+          </w:p>
+        </w:tc>
+      </w:tr>
+      <w:tr>
+        <w:trPr>
+          <w:jc w:val="center"/>
+        </w:trPr>
+        <w:tc>
+          <w:tcPr>
+            <w:tcW w:w="2700" w:type="dxa"/>
             <w:tcBorders>
               <w:top w:val="single" w:sz="8" w:space="0" w:color="D9E2EC"/>
               <w:left w:val="single" w:sz="8" w:space="0" w:color="D9E2EC"/>
@@ -1907,8 +1834,7 @@
         </w:tc>
         <w:tc>
           <w:tcPr>
-            <w:tcW w:w="3735" w:type="dxa"/>
-            <w:gridSpan w:val="2"/>
+            <w:tcW w:w="6660" w:type="dxa"/>
             <w:tcBorders>
               <w:top w:val="single" w:sz="8" w:space="0" w:color="D9E2EC"/>
               <w:left w:val="single" w:sz="8" w:space="0" w:color="D9E2EC"/>
@@ -1919,7 +1845,7 @@
           </w:tcPr>
           <w:p>
             <w:r>
-              <w:t>Pans the visible graph timeline.</w:t>
+              <w:t>Pans the selected zoomed axis while the popup itself remains fixed during zoom mode.</w:t>
             </w:r>
           </w:p>
         </w:tc>
@@ -1930,7 +1856,7 @@
         </w:trPr>
         <w:tc>
           <w:tcPr>
-            <w:tcW w:w="5841" w:type="dxa"/>
+            <w:tcW w:w="2700" w:type="dxa"/>
             <w:tcBorders>
               <w:top w:val="single" w:sz="8" w:space="0" w:color="D9E2EC"/>
               <w:left w:val="single" w:sz="8" w:space="0" w:color="D9E2EC"/>
@@ -1947,8 +1873,7 @@
         </w:tc>
         <w:tc>
           <w:tcPr>
-            <w:tcW w:w="3735" w:type="dxa"/>
-            <w:gridSpan w:val="2"/>
+            <w:tcW w:w="6660" w:type="dxa"/>
             <w:tcBorders>
               <w:top w:val="single" w:sz="8" w:space="0" w:color="D9E2EC"/>
               <w:left w:val="single" w:sz="8" w:space="0" w:color="D9E2EC"/>
@@ -1959,47 +1884,7 @@
           </w:tcPr>
           <w:p>
             <w:r>
-              <w:t>Appears inside the graph after zooming or panning. Tap it to return to the normal auto view.</w:t>
-            </w:r>
-          </w:p>
-        </w:tc>
-      </w:tr>
-      <w:tr>
-        <w:trPr>
-          <w:jc w:val="center"/>
-        </w:trPr>
-        <w:tc>
-          <w:tcPr>
-            <w:tcW w:w="5841" w:type="dxa"/>
-            <w:tcBorders>
-              <w:top w:val="single" w:sz="8" w:space="0" w:color="D9E2EC"/>
-              <w:left w:val="single" w:sz="8" w:space="0" w:color="D9E2EC"/>
-              <w:bottom w:val="single" w:sz="8" w:space="0" w:color="D9E2EC"/>
-              <w:right w:val="single" w:sz="8" w:space="0" w:color="D9E2EC"/>
-            </w:tcBorders>
-            <w:vAlign w:val="center"/>
-          </w:tcPr>
-          <w:p>
-            <w:r>
-              <w:t>Collapse arrow</w:t>
-            </w:r>
-          </w:p>
-        </w:tc>
-        <w:tc>
-          <w:tcPr>
-            <w:tcW w:w="3735" w:type="dxa"/>
-            <w:gridSpan w:val="2"/>
-            <w:tcBorders>
-              <w:top w:val="single" w:sz="8" w:space="0" w:color="D9E2EC"/>
-              <w:left w:val="single" w:sz="8" w:space="0" w:color="D9E2EC"/>
-              <w:bottom w:val="single" w:sz="8" w:space="0" w:color="D9E2EC"/>
-              <w:right w:val="single" w:sz="8" w:space="0" w:color="D9E2EC"/>
-            </w:tcBorders>
-            <w:vAlign w:val="center"/>
-          </w:tcPr>
-          <w:p>
-            <w:r>
-              <w:t>Toggles the menu area so the popup can remain open as a graph-focused view.</w:t>
+              <w:t>Appears after zooming or panning. Tap it to return both axes to the normal auto view.</w:t>
             </w:r>
           </w:p>
         </w:tc>
@@ -2059,7 +1944,7 @@
     </w:p>
     <w:p>
       <w:r>
-        <w:t>BatteryCurrent records qualifying charge and discharge sessions in the app private folder. The simplified capacity approach records completed sessions that span the useful 25% to 75% battery range. Collection can happen in Free mode, but the estimate and degradation insight are shown only when Pro is enabled.</w:t>
+        <w:t>BatteryCurrent records qualifying charge and discharge sessions in the app private folder. Normal capacity estimates use completed sessions that span the useful 25% to 75% battery range. These estimates are stored and used as trend data, but they play a secondary role once a full-discharge result exists.</w:t>
       </w:r>
     </w:p>
     <w:p>
@@ -2099,7 +1984,7 @@
         <w:ind w:left="540" w:hanging="271"/>
       </w:pPr>
       <w:r>
-        <w:t>Daily capacity estimates are stored separately for day-to-day review, while the displayed capacity estimate uses a rolling average of completed qualifying events to reduce noise.</w:t>
+        <w:t>Daily capacity estimates are stored separately and updated only from completed qualifying events.</w:t>
       </w:r>
     </w:p>
     <w:p>
@@ -2109,27 +1994,17 @@
         <w:ind w:left="540" w:hanging="271"/>
       </w:pPr>
       <w:r>
-        <w:t xml:space="preserve">A small dot indicates capacity-event status. In the graph popup it appears to the left of the BatteryCurrent title; in the foreground display it appears at the right edge of the displayed parameters. A steady yellow dot means the app is armed at or beyond the 25%/75% threshold </w:t>
-      </w:r>
-      <w:r>
-        <w:lastRenderedPageBreak/>
-        <w:t>range. A slow pulsing green dot means a qualifying battery-capacity event is actively being recorded.</w:t>
+        <w:t>The chart capacity line shows the raw full-discharge capacity and an adjusted value when a full-discharge result exists.</w:t>
       </w:r>
     </w:p>
     <w:p>
       <w:pPr>
         <w:pStyle w:val="ListBullet"/>
+        <w:spacing w:after="80"/>
+        <w:ind w:left="540" w:hanging="271"/>
       </w:pPr>
       <w:r>
-        <w:t>If an original rated battery capacity is entered, the Pro estimate value is color-coded: green up to 10% reduction, amber above 10%, orange above 20%, and red above 30%.</w:t>
-      </w:r>
-    </w:p>
-    <w:p>
-      <w:pPr>
-        <w:pStyle w:val="ListBullet"/>
-      </w:pPr>
-      <w:r>
-        <w:t>If no original capacity is entered, the estimate value stays green because the app has no reference value for health comparison.</w:t>
+        <w:t>If no full-discharge result exists yet, the chart falls back to showing the 25%-75% extrapolated estimate.</w:t>
       </w:r>
     </w:p>
     <w:p>
@@ -2137,12 +2012,300 @@
         <w:pStyle w:val="Heading1"/>
       </w:pPr>
       <w:r>
-        <w:t>9. Data and Privacy</w:t>
+        <w:lastRenderedPageBreak/>
+        <w:t>9. Full Discharge Test</w:t>
       </w:r>
     </w:p>
     <w:p>
       <w:r>
-        <w:t>BatteryCurrent stores its measurement history and battery capacity event files in the app private data area. The app is intended to monitor battery behavior locally. Normal users cannot browse these private files from the app UI, and Pro-only values are exposed through the app only when Pro is enabled.</w:t>
+        <w:t>The full-discharge test is the most accurate battery-capacity measurement mode. It is intended for occasional controlled testing, not daily use.</w:t>
+      </w:r>
+    </w:p>
+    <w:p>
+      <w:pPr>
+        <w:pStyle w:val="ListNumber"/>
+        <w:spacing w:after="80"/>
+        <w:ind w:left="540" w:hanging="271"/>
+      </w:pPr>
+      <w:r>
+        <w:t>Charge the phone until Android reports 100% and the charging current has settled near 0 mA.</w:t>
+      </w:r>
+    </w:p>
+    <w:p>
+      <w:pPr>
+        <w:pStyle w:val="ListNumber"/>
+        <w:spacing w:after="80"/>
+        <w:ind w:left="540" w:hanging="271"/>
+      </w:pPr>
+      <w:r>
+        <w:t>Open BatteryCurrent and tap Full discharge test.</w:t>
+      </w:r>
+    </w:p>
+    <w:p>
+      <w:pPr>
+        <w:pStyle w:val="ListNumber"/>
+        <w:spacing w:after="80"/>
+        <w:ind w:left="540" w:hanging="271"/>
+      </w:pPr>
+      <w:r>
+        <w:t>Read the instructions, disconnect the charger, then press Reset in the dialog.</w:t>
+      </w:r>
+    </w:p>
+    <w:p>
+      <w:pPr>
+        <w:pStyle w:val="ListNumber"/>
+        <w:spacing w:after="80"/>
+        <w:ind w:left="540" w:hanging="271"/>
+      </w:pPr>
+      <w:r>
+        <w:t>The startup page closes, the graph opens, and the graph/mAh reading resets to zero.</w:t>
+      </w:r>
+    </w:p>
+    <w:p>
+      <w:pPr>
+        <w:pStyle w:val="ListNumber"/>
+        <w:spacing w:after="80"/>
+        <w:ind w:left="540" w:hanging="271"/>
+      </w:pPr>
+      <w:r>
+        <w:t>The actual full-discharge measurement starts about 10 seconds after Reset, allowing the phone to settle after unplugging.</w:t>
+      </w:r>
+    </w:p>
+    <w:p>
+      <w:pPr>
+        <w:pStyle w:val="ListNumber"/>
+        <w:spacing w:after="80"/>
+        <w:ind w:left="540" w:hanging="271"/>
+      </w:pPr>
+      <w:r>
+        <w:t>Leave monitoring running until the phone discharges to 15%. The app then records the completed test.</w:t>
+      </w:r>
+    </w:p>
+    <w:p>
+      <w:pPr>
+        <w:pStyle w:val="ListBullet"/>
+        <w:spacing w:after="80"/>
+        <w:ind w:left="540" w:hanging="271"/>
+      </w:pPr>
+      <w:r>
+        <w:t>If the charger is still connected when Reset is pressed, the app warns the user to disconnect it and does not start the test.</w:t>
+      </w:r>
+    </w:p>
+    <w:p>
+      <w:pPr>
+        <w:pStyle w:val="ListBullet"/>
+        <w:spacing w:after="80"/>
+        <w:ind w:left="540" w:hanging="271"/>
+      </w:pPr>
+      <w:r>
+        <w:t xml:space="preserve">If the charger is connected, the service is stopped, or the measurement is interrupted, the test is stopped </w:t>
+      </w:r>
+      <w:r>
+        <w:t>and any data accumulated is discarded</w:t>
+      </w:r>
+      <w:r>
+        <w:t>.</w:t>
+      </w:r>
+    </w:p>
+    <w:p>
+      <w:pPr>
+        <w:pStyle w:val="ListBullet"/>
+        <w:spacing w:after="80"/>
+        <w:ind w:left="540" w:hanging="271"/>
+      </w:pPr>
+      <w:r>
+        <w:t>The full-discharge capacity estimate is calculated as discharged mAh divided by 0.85 because the test spans 100% to 15%.</w:t>
+      </w:r>
+    </w:p>
+    <w:p>
+      <w:pPr>
+        <w:pStyle w:val="ListBullet"/>
+        <w:spacing w:after="80"/>
+        <w:ind w:left="540" w:hanging="271"/>
+      </w:pPr>
+      <w:r>
+        <w:t>The chart shows Full Discharge battery capacity [date]: raw mAh and Adj: adjusted mAh. The adjusted value uses the stored 25%-75% trend to nudge the raw full-discharge anchor until the next full-discharge test.</w:t>
+      </w:r>
+    </w:p>
+    <w:tbl>
+      <w:tblPr>
+        <w:tblW w:w="9360" w:type="dxa"/>
+        <w:jc w:val="center"/>
+        <w:tblLook w:val="04A0" w:firstRow="1" w:lastRow="0" w:firstColumn="1" w:lastColumn="0" w:noHBand="0" w:noVBand="1"/>
+      </w:tblPr>
+      <w:tblGrid>
+        <w:gridCol w:w="9360"/>
+      </w:tblGrid>
+      <w:tr>
+        <w:trPr>
+          <w:jc w:val="center"/>
+        </w:trPr>
+        <w:tc>
+          <w:tcPr>
+            <w:tcW w:w="9360" w:type="dxa"/>
+            <w:tcBorders>
+              <w:top w:val="single" w:sz="12" w:space="0" w:color="C7D2E1"/>
+              <w:left w:val="single" w:sz="12" w:space="0" w:color="C7D2E1"/>
+              <w:bottom w:val="single" w:sz="12" w:space="0" w:color="C7D2E1"/>
+              <w:right w:val="single" w:sz="12" w:space="0" w:color="C7D2E1"/>
+            </w:tcBorders>
+            <w:shd w:val="clear" w:color="auto" w:fill="F2F4F7"/>
+            <w:vAlign w:val="center"/>
+          </w:tcPr>
+          <w:p>
+            <w:pPr>
+              <w:spacing w:before="360" w:after="360"/>
+              <w:jc w:val="center"/>
+            </w:pPr>
+            <w:r>
+              <w:rPr>
+                <w:b/>
+                <w:color w:val="1F4D78"/>
+              </w:rPr>
+              <w:t>[ Screenshot placeholder: Full discharge test dialog ]</w:t>
+            </w:r>
+            <w:r>
+              <w:br/>
+            </w:r>
+            <w:r>
+              <w:rPr>
+                <w:color w:val="555555"/>
+                <w:sz w:val="20"/>
+              </w:rPr>
+              <w:t>Insert a screenshot showing the full-discharge instructions with Reset and Cancel buttons.</w:t>
+            </w:r>
+          </w:p>
+        </w:tc>
+      </w:tr>
+    </w:tbl>
+    <w:p/>
+    <w:p>
+      <w:pPr>
+        <w:pStyle w:val="Heading1"/>
+      </w:pPr>
+      <w:r>
+        <w:t>10. SOC Curve and Load Sensitivity</w:t>
+      </w:r>
+    </w:p>
+    <w:p>
+      <w:r>
+        <w:t>The SOC Curve view helps diagnose how linear the phone's reported battery percentage is compared with measured mAh use.</w:t>
+      </w:r>
+    </w:p>
+    <w:p>
+      <w:pPr>
+        <w:pStyle w:val="ListBullet"/>
+        <w:spacing w:after="80"/>
+        <w:ind w:left="540" w:hanging="271"/>
+      </w:pPr>
+      <w:r>
+        <w:t>SOC bucket data is collected during normal discharge, including during a full-discharge test.</w:t>
+      </w:r>
+    </w:p>
+    <w:p>
+      <w:pPr>
+        <w:pStyle w:val="ListBullet"/>
+        <w:spacing w:after="80"/>
+        <w:ind w:left="540" w:hanging="271"/>
+      </w:pPr>
+      <w:r>
+        <w:t>The SOC curve plots individual bucket samples as dots and draws a piecewise linear line through the average for each bucket.</w:t>
+      </w:r>
+    </w:p>
+    <w:p>
+      <w:pPr>
+        <w:pStyle w:val="ListBullet"/>
+        <w:spacing w:after="80"/>
+        <w:ind w:left="540" w:hanging="271"/>
+      </w:pPr>
+      <w:r>
+        <w:t>Outlier points can reveal noisy battery-percentage reporting, load effects, or areas where the phone's fuel gauge is less linear.</w:t>
+      </w:r>
+    </w:p>
+    <w:p>
+      <w:pPr>
+        <w:pStyle w:val="ListBullet"/>
+        <w:spacing w:after="80"/>
+        <w:ind w:left="540" w:hanging="271"/>
+      </w:pPr>
+      <w:r>
+        <w:lastRenderedPageBreak/>
+        <w:t>The load sensitivity line reports k and a short comment such as k=1.00 (excellent), k=1.12 (mild), k=1.22 (noticeable), k=1.35 (high sag), or k&gt;1.50 (check data).</w:t>
+      </w:r>
+    </w:p>
+    <w:p>
+      <w:pPr>
+        <w:pStyle w:val="ListBullet"/>
+        <w:spacing w:after="80"/>
+        <w:ind w:left="540" w:hanging="271"/>
+      </w:pPr>
+      <w:r>
+        <w:t>This load-sensitivity value is best treated as a phone-specific load sensitivity index, not a laboratory Peukert constant.</w:t>
+      </w:r>
+    </w:p>
+    <w:tbl>
+      <w:tblPr>
+        <w:tblW w:w="9360" w:type="dxa"/>
+        <w:jc w:val="center"/>
+        <w:tblLook w:val="04A0" w:firstRow="1" w:lastRow="0" w:firstColumn="1" w:lastColumn="0" w:noHBand="0" w:noVBand="1"/>
+      </w:tblPr>
+      <w:tblGrid>
+        <w:gridCol w:w="9360"/>
+      </w:tblGrid>
+      <w:tr>
+        <w:trPr>
+          <w:jc w:val="center"/>
+        </w:trPr>
+        <w:tc>
+          <w:tcPr>
+            <w:tcW w:w="9360" w:type="dxa"/>
+            <w:tcBorders>
+              <w:top w:val="single" w:sz="12" w:space="0" w:color="C7D2E1"/>
+              <w:left w:val="single" w:sz="12" w:space="0" w:color="C7D2E1"/>
+              <w:bottom w:val="single" w:sz="12" w:space="0" w:color="C7D2E1"/>
+              <w:right w:val="single" w:sz="12" w:space="0" w:color="C7D2E1"/>
+            </w:tcBorders>
+            <w:shd w:val="clear" w:color="auto" w:fill="F2F4F7"/>
+            <w:vAlign w:val="center"/>
+          </w:tcPr>
+          <w:p>
+            <w:pPr>
+              <w:spacing w:before="360" w:after="360"/>
+              <w:jc w:val="center"/>
+            </w:pPr>
+            <w:r>
+              <w:rPr>
+                <w:b/>
+                <w:color w:val="1F4D78"/>
+              </w:rPr>
+              <w:t>[ Screenshot placeholder: SOC curve popup ]</w:t>
+            </w:r>
+            <w:r>
+              <w:br/>
+            </w:r>
+            <w:r>
+              <w:rPr>
+                <w:color w:val="555555"/>
+                <w:sz w:val="20"/>
+              </w:rPr>
+              <w:t>Insert a screenshot showing SOC bucket dots, the averaged piecewise line, and the deviation axis.</w:t>
+            </w:r>
+          </w:p>
+        </w:tc>
+      </w:tr>
+    </w:tbl>
+    <w:p/>
+    <w:p>
+      <w:pPr>
+        <w:pStyle w:val="Heading1"/>
+      </w:pPr>
+      <w:r>
+        <w:t>11. Data and Privacy</w:t>
+      </w:r>
+    </w:p>
+    <w:p>
+      <w:r>
+        <w:t>BatteryCurrent stores its measurement history and battery capacity event files in the app private data area. The app is intended to monitor battery behavior locally. It does not need cloud storage for normal operation.</w:t>
       </w:r>
     </w:p>
     <w:p>
@@ -2162,7 +2325,17 @@
         <w:ind w:left="540" w:hanging="271"/>
       </w:pPr>
       <w:r>
-        <w:t>Capacity event files are stored as CSV files in the app private folder for later inspection during testing and development. The app keeps raw capacity events, daily averages, and a separate moving-average trend file written every 100 completed capacity readings.</w:t>
+        <w:t>Capacity event, full-discharge, SOC bucket, and moving-average files are stored as CSV files for later inspection.</w:t>
+      </w:r>
+    </w:p>
+    <w:p>
+      <w:pPr>
+        <w:pStyle w:val="ListBullet"/>
+        <w:spacing w:after="80"/>
+        <w:ind w:left="540" w:hanging="271"/>
+      </w:pPr>
+      <w:r>
+        <w:t>Private app data should survive normal in-place app updates, but uninstalling the app or installing with a mismatched signing key can remove the stored data.</w:t>
       </w:r>
     </w:p>
     <w:p>
@@ -2180,7 +2353,7 @@
         <w:pStyle w:val="Heading1"/>
       </w:pPr>
       <w:r>
-        <w:t>10. Troubleshooting</w:t>
+        <w:t>12. Troubleshooting</w:t>
       </w:r>
     </w:p>
     <w:tbl>
@@ -2311,7 +2484,7 @@
           </w:tcPr>
           <w:p>
             <w:r>
-              <w:t>Open the graph popup and tap Unlock.</w:t>
+              <w:t>Use Reset foreground display to centre from the startup page, or open the graph popup and tap Unlock if the overlay is locked.</w:t>
             </w:r>
           </w:p>
         </w:tc>
@@ -2350,10 +2523,7 @@
           </w:tcPr>
           <w:p>
             <w:r>
-              <w:t>Use two-finger pinch to zoom in</w:t>
-            </w:r>
-            <w:r>
-              <w:t>.</w:t>
+              <w:t>Use the X or Y zoom controls, pinch to zoom the selected axis, or collapse the menu buttons.</w:t>
             </w:r>
           </w:p>
         </w:tc>
@@ -2375,15 +2545,7 @@
           </w:tcPr>
           <w:p>
             <w:r>
-              <w:t xml:space="preserve">No capacity </w:t>
-            </w:r>
-            <w:proofErr w:type="gramStart"/>
-            <w:r>
-              <w:t>estimate</w:t>
-            </w:r>
-            <w:proofErr w:type="gramEnd"/>
-            <w:r>
-              <w:t xml:space="preserve"> yet</w:t>
+              <w:t>No capacity estimate yet</w:t>
             </w:r>
           </w:p>
         </w:tc>
@@ -2400,7 +2562,129 @@
           </w:tcPr>
           <w:p>
             <w:r>
-              <w:t>Capacity estimates are visible in Pro mode after completed qualifying charge or discharge sessions. Free mode may still be collecting the underlying event data.</w:t>
+              <w:t>The app needs completed qualifying charge or discharge sessions before daily estimates are available.</w:t>
+            </w:r>
+          </w:p>
+        </w:tc>
+      </w:tr>
+      <w:tr>
+        <w:trPr>
+          <w:jc w:val="center"/>
+        </w:trPr>
+        <w:tc>
+          <w:tcPr>
+            <w:tcW w:w="2700" w:type="dxa"/>
+            <w:tcBorders>
+              <w:top w:val="single" w:sz="8" w:space="0" w:color="D9E2EC"/>
+              <w:left w:val="single" w:sz="8" w:space="0" w:color="D9E2EC"/>
+              <w:bottom w:val="single" w:sz="8" w:space="0" w:color="D9E2EC"/>
+              <w:right w:val="single" w:sz="8" w:space="0" w:color="D9E2EC"/>
+            </w:tcBorders>
+            <w:vAlign w:val="center"/>
+          </w:tcPr>
+          <w:p>
+            <w:r>
+              <w:t>No full-discharge result yet</w:t>
+            </w:r>
+          </w:p>
+        </w:tc>
+        <w:tc>
+          <w:tcPr>
+            <w:tcW w:w="6660" w:type="dxa"/>
+            <w:tcBorders>
+              <w:top w:val="single" w:sz="8" w:space="0" w:color="D9E2EC"/>
+              <w:left w:val="single" w:sz="8" w:space="0" w:color="D9E2EC"/>
+              <w:bottom w:val="single" w:sz="8" w:space="0" w:color="D9E2EC"/>
+              <w:right w:val="single" w:sz="8" w:space="0" w:color="D9E2EC"/>
+            </w:tcBorders>
+            <w:vAlign w:val="center"/>
+          </w:tcPr>
+          <w:p>
+            <w:r>
+              <w:t xml:space="preserve">Run the guided full-discharge test from 100% down to 15%. Until then, </w:t>
+            </w:r>
+            <w:r>
+              <w:lastRenderedPageBreak/>
+              <w:t>the chart uses the 25%-75% estimate when available.</w:t>
+            </w:r>
+          </w:p>
+        </w:tc>
+      </w:tr>
+      <w:tr>
+        <w:trPr>
+          <w:jc w:val="center"/>
+        </w:trPr>
+        <w:tc>
+          <w:tcPr>
+            <w:tcW w:w="2700" w:type="dxa"/>
+            <w:tcBorders>
+              <w:top w:val="single" w:sz="8" w:space="0" w:color="D9E2EC"/>
+              <w:left w:val="single" w:sz="8" w:space="0" w:color="D9E2EC"/>
+              <w:bottom w:val="single" w:sz="8" w:space="0" w:color="D9E2EC"/>
+              <w:right w:val="single" w:sz="8" w:space="0" w:color="D9E2EC"/>
+            </w:tcBorders>
+            <w:vAlign w:val="center"/>
+          </w:tcPr>
+          <w:p>
+            <w:r>
+              <w:lastRenderedPageBreak/>
+              <w:t>Full-discharge test will not start</w:t>
+            </w:r>
+          </w:p>
+        </w:tc>
+        <w:tc>
+          <w:tcPr>
+            <w:tcW w:w="6660" w:type="dxa"/>
+            <w:tcBorders>
+              <w:top w:val="single" w:sz="8" w:space="0" w:color="D9E2EC"/>
+              <w:left w:val="single" w:sz="8" w:space="0" w:color="D9E2EC"/>
+              <w:bottom w:val="single" w:sz="8" w:space="0" w:color="D9E2EC"/>
+              <w:right w:val="single" w:sz="8" w:space="0" w:color="D9E2EC"/>
+            </w:tcBorders>
+            <w:vAlign w:val="center"/>
+          </w:tcPr>
+          <w:p>
+            <w:r>
+              <w:t>Disconnect the charger and confirm the battery reads 100%, then press Reset in the full-discharge dialog.</w:t>
+            </w:r>
+          </w:p>
+        </w:tc>
+      </w:tr>
+      <w:tr>
+        <w:trPr>
+          <w:jc w:val="center"/>
+        </w:trPr>
+        <w:tc>
+          <w:tcPr>
+            <w:tcW w:w="2700" w:type="dxa"/>
+            <w:tcBorders>
+              <w:top w:val="single" w:sz="8" w:space="0" w:color="D9E2EC"/>
+              <w:left w:val="single" w:sz="8" w:space="0" w:color="D9E2EC"/>
+              <w:bottom w:val="single" w:sz="8" w:space="0" w:color="D9E2EC"/>
+              <w:right w:val="single" w:sz="8" w:space="0" w:color="D9E2EC"/>
+            </w:tcBorders>
+            <w:vAlign w:val="center"/>
+          </w:tcPr>
+          <w:p>
+            <w:r>
+              <w:t>Monitor button looks stale</w:t>
+            </w:r>
+          </w:p>
+        </w:tc>
+        <w:tc>
+          <w:tcPr>
+            <w:tcW w:w="6660" w:type="dxa"/>
+            <w:tcBorders>
+              <w:top w:val="single" w:sz="8" w:space="0" w:color="D9E2EC"/>
+              <w:left w:val="single" w:sz="8" w:space="0" w:color="D9E2EC"/>
+              <w:bottom w:val="single" w:sz="8" w:space="0" w:color="D9E2EC"/>
+              <w:right w:val="single" w:sz="8" w:space="0" w:color="D9E2EC"/>
+            </w:tcBorders>
+            <w:vAlign w:val="center"/>
+          </w:tcPr>
+          <w:p>
+            <w:r>
+              <w:t>The startup page checks the live service heartbeat. If Android killed the service, the button returns to Start/OFF when reopened.</w:t>
             </w:r>
           </w:p>
         </w:tc>
@@ -2444,211 +2728,6 @@
           </w:p>
         </w:tc>
       </w:tr>
-      <w:tr>
-        <w:trPr>
-          <w:jc w:val="center"/>
-        </w:trPr>
-        <w:tc>
-          <w:tcPr>
-            <w:tcW w:w="2700" w:type="dxa"/>
-            <w:tcBorders>
-              <w:top w:val="single" w:sz="8" w:space="0" w:color="D9E2EC"/>
-              <w:left w:val="single" w:sz="8" w:space="0" w:color="D9E2EC"/>
-              <w:bottom w:val="single" w:sz="8" w:space="0" w:color="D9E2EC"/>
-              <w:right w:val="single" w:sz="8" w:space="0" w:color="D9E2EC"/>
-            </w:tcBorders>
-            <w:vAlign w:val="center"/>
-          </w:tcPr>
-          <w:p>
-            <w:r>
-              <w:t>Pro features not visible</w:t>
-            </w:r>
-          </w:p>
-        </w:tc>
-        <w:tc>
-          <w:tcPr>
-            <w:tcW w:w="6660" w:type="dxa"/>
-            <w:tcBorders>
-              <w:top w:val="single" w:sz="8" w:space="0" w:color="D9E2EC"/>
-              <w:left w:val="single" w:sz="8" w:space="0" w:color="D9E2EC"/>
-              <w:bottom w:val="single" w:sz="8" w:space="0" w:color="D9E2EC"/>
-              <w:right w:val="single" w:sz="8" w:space="0" w:color="D9E2EC"/>
-            </w:tcBorders>
-            <w:vAlign w:val="center"/>
-          </w:tcPr>
-          <w:p>
-            <w:r>
-              <w:t>Enable temporary Pro mode on the startup screen for testing, or use the Pro version when that becomes available.</w:t>
-            </w:r>
-          </w:p>
-        </w:tc>
-      </w:tr>
-      <w:tr>
-        <w:trPr>
-          <w:jc w:val="center"/>
-        </w:trPr>
-        <w:tc>
-          <w:tcPr>
-            <w:tcW w:w="2700" w:type="dxa"/>
-            <w:tcBorders>
-              <w:top w:val="single" w:sz="8" w:space="0" w:color="D9E2EC"/>
-              <w:left w:val="single" w:sz="8" w:space="0" w:color="D9E2EC"/>
-              <w:bottom w:val="single" w:sz="8" w:space="0" w:color="D9E2EC"/>
-              <w:right w:val="single" w:sz="8" w:space="0" w:color="D9E2EC"/>
-            </w:tcBorders>
-            <w:vAlign w:val="center"/>
-          </w:tcPr>
-          <w:p>
-            <w:r>
-              <w:t xml:space="preserve">Original capacity was </w:t>
-            </w:r>
-            <w:r>
-              <w:lastRenderedPageBreak/>
-              <w:t>skipped</w:t>
-            </w:r>
-          </w:p>
-        </w:tc>
-        <w:tc>
-          <w:tcPr>
-            <w:tcW w:w="6660" w:type="dxa"/>
-            <w:tcBorders>
-              <w:top w:val="single" w:sz="8" w:space="0" w:color="D9E2EC"/>
-              <w:left w:val="single" w:sz="8" w:space="0" w:color="D9E2EC"/>
-              <w:bottom w:val="single" w:sz="8" w:space="0" w:color="D9E2EC"/>
-              <w:right w:val="single" w:sz="8" w:space="0" w:color="D9E2EC"/>
-            </w:tcBorders>
-            <w:vAlign w:val="center"/>
-          </w:tcPr>
-          <w:p>
-            <w:r>
-              <w:lastRenderedPageBreak/>
-              <w:t xml:space="preserve">Use the startup screen Add/Edit option later if you want the Pro </w:t>
-            </w:r>
-            <w:r>
-              <w:lastRenderedPageBreak/>
-              <w:t>estimate value color-coded against the phone's rated capacity.</w:t>
-            </w:r>
-          </w:p>
-        </w:tc>
-      </w:tr>
-      <w:tr>
-        <w:trPr>
-          <w:jc w:val="center"/>
-        </w:trPr>
-        <w:tc>
-          <w:tcPr>
-            <w:tcW w:w="2700" w:type="dxa"/>
-            <w:tcBorders>
-              <w:top w:val="single" w:sz="8" w:space="0" w:color="D9E2EC"/>
-              <w:left w:val="single" w:sz="8" w:space="0" w:color="D9E2EC"/>
-              <w:bottom w:val="single" w:sz="8" w:space="0" w:color="D9E2EC"/>
-              <w:right w:val="single" w:sz="8" w:space="0" w:color="D9E2EC"/>
-            </w:tcBorders>
-            <w:vAlign w:val="center"/>
-          </w:tcPr>
-          <w:p>
-            <w:r>
-              <w:lastRenderedPageBreak/>
-              <w:t>Graph-only view is missing buttons</w:t>
-            </w:r>
-          </w:p>
-        </w:tc>
-        <w:tc>
-          <w:tcPr>
-            <w:tcW w:w="6660" w:type="dxa"/>
-            <w:tcBorders>
-              <w:top w:val="single" w:sz="8" w:space="0" w:color="D9E2EC"/>
-              <w:left w:val="single" w:sz="8" w:space="0" w:color="D9E2EC"/>
-              <w:bottom w:val="single" w:sz="8" w:space="0" w:color="D9E2EC"/>
-              <w:right w:val="single" w:sz="8" w:space="0" w:color="D9E2EC"/>
-            </w:tcBorders>
-            <w:vAlign w:val="center"/>
-          </w:tcPr>
-          <w:p>
-            <w:r>
-              <w:t>Tap the small yellow down arrow below the graph to expand the hidden controls again.</w:t>
-            </w:r>
-          </w:p>
-        </w:tc>
-      </w:tr>
-      <w:tr>
-        <w:trPr>
-          <w:jc w:val="center"/>
-        </w:trPr>
-        <w:tc>
-          <w:tcPr>
-            <w:tcW w:w="2700" w:type="dxa"/>
-            <w:tcBorders>
-              <w:top w:val="single" w:sz="8" w:space="0" w:color="D9E2EC"/>
-              <w:left w:val="single" w:sz="8" w:space="0" w:color="D9E2EC"/>
-              <w:bottom w:val="single" w:sz="8" w:space="0" w:color="D9E2EC"/>
-              <w:right w:val="single" w:sz="8" w:space="0" w:color="D9E2EC"/>
-            </w:tcBorders>
-            <w:vAlign w:val="center"/>
-          </w:tcPr>
-          <w:p>
-            <w:r>
-              <w:t>Foreground display is hard to see</w:t>
-            </w:r>
-          </w:p>
-        </w:tc>
-        <w:tc>
-          <w:tcPr>
-            <w:tcW w:w="6660" w:type="dxa"/>
-            <w:tcBorders>
-              <w:top w:val="single" w:sz="8" w:space="0" w:color="D9E2EC"/>
-              <w:left w:val="single" w:sz="8" w:space="0" w:color="D9E2EC"/>
-              <w:bottom w:val="single" w:sz="8" w:space="0" w:color="D9E2EC"/>
-              <w:right w:val="single" w:sz="8" w:space="0" w:color="D9E2EC"/>
-            </w:tcBorders>
-            <w:vAlign w:val="center"/>
-          </w:tcPr>
-          <w:p>
-            <w:r>
-              <w:t>Return to the startup screen and toggle Light foreground background to choose the contrast mode that works best over the current app.</w:t>
-            </w:r>
-          </w:p>
-        </w:tc>
-      </w:tr>
-      <w:tr>
-        <w:trPr>
-          <w:jc w:val="center"/>
-        </w:trPr>
-        <w:tc>
-          <w:tcPr>
-            <w:tcW w:w="2700" w:type="dxa"/>
-            <w:tcBorders>
-              <w:top w:val="single" w:sz="8" w:space="0" w:color="D9E2EC"/>
-              <w:left w:val="single" w:sz="8" w:space="0" w:color="D9E2EC"/>
-              <w:bottom w:val="single" w:sz="8" w:space="0" w:color="D9E2EC"/>
-              <w:right w:val="single" w:sz="8" w:space="0" w:color="D9E2EC"/>
-            </w:tcBorders>
-            <w:vAlign w:val="center"/>
-          </w:tcPr>
-          <w:p>
-            <w:r>
-              <w:t>Capacity estimate seems noisy</w:t>
-            </w:r>
-          </w:p>
-        </w:tc>
-        <w:tc>
-          <w:tcPr>
-            <w:tcW w:w="6660" w:type="dxa"/>
-            <w:tcBorders>
-              <w:top w:val="single" w:sz="8" w:space="0" w:color="D9E2EC"/>
-              <w:left w:val="single" w:sz="8" w:space="0" w:color="D9E2EC"/>
-              <w:bottom w:val="single" w:sz="8" w:space="0" w:color="D9E2EC"/>
-              <w:right w:val="single" w:sz="8" w:space="0" w:color="D9E2EC"/>
-            </w:tcBorders>
-            <w:vAlign w:val="center"/>
-          </w:tcPr>
-          <w:p>
-            <w:r>
-              <w:t>Individual daily values can vary with load and temperature. The displayed estimate uses a rolling average, and long-term degradation checks use 100-reading moving-average snapshots.</w:t>
-            </w:r>
-          </w:p>
-        </w:tc>
-      </w:tr>
     </w:tbl>
     <w:p/>
     <w:p>
@@ -2656,16 +2735,16 @@
         <w:pStyle w:val="Heading1"/>
       </w:pPr>
       <w:r>
-        <w:t>11. Notes for This Draft</w:t>
+        <w:t>13. Notes for This Draft</w:t>
       </w:r>
     </w:p>
     <w:p>
       <w:r>
-        <w:t>This manual is preliminary. Before public release, update screenshots, confirm Free/Pro terminology, add Play Store installation notes, and verify any privacy wording against the final app behavior.</w:t>
+        <w:t>This manual is preliminary. Before public release, update screenshots, confirm terminology, add Play Store installation notes, and verify any privacy wording against the final app behavior.</w:t>
       </w:r>
     </w:p>
     <w:sectPr>
-      <w:footerReference w:type="default" r:id="rId11"/>
+      <w:footerReference w:type="default" r:id="rId8"/>
       <w:pgSz w:w="12240" w:h="15840"/>
       <w:pgMar w:top="1440" w:right="1440" w:bottom="1440" w:left="1440" w:header="708" w:footer="708" w:gutter="0"/>
       <w:cols w:space="720"/>
@@ -2712,21 +2791,7 @@
         <w:color w:val="777777"/>
         <w:sz w:val="18"/>
       </w:rPr>
-      <w:t>BatteryCurrent manual</w:t>
-    </w:r>
-    <w:r>
-      <w:rPr>
-        <w:color w:val="777777"/>
-        <w:sz w:val="18"/>
-      </w:rPr>
-      <w:t xml:space="preserve"> </w:t>
-    </w:r>
-    <w:r>
-      <w:rPr>
-        <w:color w:val="777777"/>
-        <w:sz w:val="18"/>
-      </w:rPr>
-      <w:t>v1.01</w:t>
+      <w:t>BatteryCurrent preliminary manual</w:t>
     </w:r>
   </w:p>
 </w:ftr>
@@ -2930,31 +2995,31 @@
       </w:rPr>
     </w:lvl>
   </w:abstractNum>
-  <w:num w:numId="1" w16cid:durableId="1447308170">
+  <w:num w:numId="1" w16cid:durableId="1434088874">
     <w:abstractNumId w:val="8"/>
   </w:num>
-  <w:num w:numId="2" w16cid:durableId="1541168641">
+  <w:num w:numId="2" w16cid:durableId="2095778407">
     <w:abstractNumId w:val="6"/>
   </w:num>
-  <w:num w:numId="3" w16cid:durableId="221328857">
+  <w:num w:numId="3" w16cid:durableId="469709147">
     <w:abstractNumId w:val="5"/>
   </w:num>
-  <w:num w:numId="4" w16cid:durableId="813330672">
+  <w:num w:numId="4" w16cid:durableId="1211383018">
     <w:abstractNumId w:val="4"/>
   </w:num>
-  <w:num w:numId="5" w16cid:durableId="934118">
+  <w:num w:numId="5" w16cid:durableId="2145846717">
     <w:abstractNumId w:val="7"/>
   </w:num>
-  <w:num w:numId="6" w16cid:durableId="334961963">
+  <w:num w:numId="6" w16cid:durableId="497303736">
     <w:abstractNumId w:val="3"/>
   </w:num>
-  <w:num w:numId="7" w16cid:durableId="967079628">
+  <w:num w:numId="7" w16cid:durableId="771973817">
     <w:abstractNumId w:val="2"/>
   </w:num>
-  <w:num w:numId="8" w16cid:durableId="2135057349">
+  <w:num w:numId="8" w16cid:durableId="1609507802">
     <w:abstractNumId w:val="1"/>
   </w:num>
-  <w:num w:numId="9" w16cid:durableId="163907368">
+  <w:num w:numId="9" w16cid:durableId="1677343340">
     <w:abstractNumId w:val="0"/>
   </w:num>
 </w:numbering>

</xml_diff>

<commit_message>
main v1.03 - Changed all calibration timers to 10minutes. Documents updated.
</commit_message>
<xml_diff>
--- a/docs/manual/BatteryCurrent_User_Manual_Preliminary.docx
+++ b/docs/manual/BatteryCurrent_User_Manual_Preliminary.docx
@@ -1890,7 +1890,7 @@
         <w:ind w:left="540" w:hanging="271"/>
       </w:pPr>
       <w:r>
-        <w:t>Leave the phone connected for 20 minutes after it reaches 100%.</w:t>
+        <w:t>Leave the phone connected for 10 minutes after it reaches 100%.</w:t>
       </w:r>
     </w:p>
     <w:p>
@@ -1910,7 +1910,7 @@
         <w:ind w:left="540" w:hanging="271"/>
       </w:pPr>
       <w:r>
-        <w:t>After the 20 minute wait, disconnect the charger, then press Start in the dialog.</w:t>
+        <w:t>After the 10 minute wait, disconnect the charger, then press Start in the dialog.</w:t>
       </w:r>
     </w:p>
     <w:p>
@@ -2025,7 +2025,7 @@
                 <w:color w:val="555555"/>
                 <w:sz w:val="20"/>
               </w:rPr>
-              <w:t>Insert a screenshot showing the calibration instructions with the 20 minute wait, disconnect reminder, Start button, and Cancel button.</w:t>
+              <w:t>Insert a screenshot showing the calibration instructions with the 10 minute wait, disconnect reminder, Start button, and Cancel button.</w:t>
             </w:r>
           </w:p>
         </w:tc>
@@ -2468,7 +2468,7 @@
           </w:tcPr>
           <w:p>
             <w:r>
-              <w:t>Charge to 100%, wait 20 minutes while still connected, disconnect the charger, then press Start in the calibration dialog. The app begins measuring automatically at 95%.</w:t>
+              <w:t>Charge to 100%, wait 10 minutes while still connected, disconnect the charger, then press Start in the calibration dialog. The app begins measuring automatically at 95%.</w:t>
             </w:r>
           </w:p>
         </w:tc>

</xml_diff>

<commit_message>
Changed CAL to wait to 99% level before starting calibration. Removed time element.
</commit_message>
<xml_diff>
--- a/docs/manual/BatteryCurrent_User_Manual_Preliminary.docx
+++ b/docs/manual/BatteryCurrent_User_Manual_Preliminary.docx
@@ -1890,7 +1890,7 @@
         <w:ind w:left="540" w:hanging="271"/>
       </w:pPr>
       <w:r>
-        <w:t>Leave the phone connected for 10 minutes after it reaches 100%.</w:t>
+        <w:t>Leave the phone connected for 5 minutes after it reaches 100%.</w:t>
       </w:r>
     </w:p>
     <w:p>
@@ -1910,7 +1910,7 @@
         <w:ind w:left="540" w:hanging="271"/>
       </w:pPr>
       <w:r>
-        <w:t>After the 10 minute wait, disconnect the charger, then press Start in the dialog.</w:t>
+        <w:t>After the disconnect prompt, disconnect the charger.</w:t>
       </w:r>
     </w:p>
     <w:p>
@@ -1930,7 +1930,7 @@
         <w:ind w:left="540" w:hanging="271"/>
       </w:pPr>
       <w:r>
-        <w:t>The app resets the graph/mAh reading and starts measuring automatically when the phone reaches 95%.</w:t>
+        <w:t>The app resets the graph/mAh reading and starts measuring automatically when the phone reaches 99%.</w:t>
       </w:r>
     </w:p>
     <w:p>
@@ -1950,7 +1950,7 @@
         <w:ind w:left="540" w:hanging="271"/>
       </w:pPr>
       <w:r>
-        <w:t>Calibration measures the 95% to 10% discharge range and computes capacity as discharged mAh divided by 0.85.</w:t>
+        <w:t>Calibration measures the 99% to 10% discharge range and computes capacity as discharged mAh divided by 0.89.</w:t>
       </w:r>
     </w:p>
     <w:p>
@@ -2025,7 +2025,7 @@
                 <w:color w:val="555555"/>
                 <w:sz w:val="20"/>
               </w:rPr>
-              <w:t>Insert a screenshot showing the calibration instructions with the 10 minute wait, disconnect reminder, Start button, and Cancel button.</w:t>
+              <w:t>Insert a screenshot showing the calibration instructions with the 5 minute wait, disconnect reminder, Start button, and Cancel button.</w:t>
             </w:r>
           </w:p>
         </w:tc>
@@ -2432,7 +2432,7 @@
           </w:tcPr>
           <w:p>
             <w:r>
-              <w:t>Run the guided calibration from 95% down to 10%. Until then, the chart uses the 25%-75% estimate when available.</w:t>
+              <w:t>Run the guided calibration from 99% down to 10%. Until then, the chart uses the 25%-75% estimate when available.</w:t>
             </w:r>
           </w:p>
         </w:tc>
@@ -2468,7 +2468,7 @@
           </w:tcPr>
           <w:p>
             <w:r>
-              <w:t>Charge to 100%, wait 10 minutes while still connected, disconnect the charger, then press Start in the calibration dialog. The app begins measuring automatically at 95%.</w:t>
+              <w:t>Charge to 100%, wait for the 5 minute float timer, disconnect the charger when prompted, and let the app begin measuring automatically at 99%.</w:t>
             </w:r>
           </w:p>
         </w:tc>

</xml_diff>

<commit_message>
main v1.03 -Changed lower threshold to 15% instead of 10% to reduce battery stress.
</commit_message>
<xml_diff>
--- a/docs/manual/BatteryCurrent_User_Manual_Preliminary.docx
+++ b/docs/manual/BatteryCurrent_User_Manual_Preliminary.docx
@@ -2255,7 +2255,7 @@
         <w:ind w:left="540" w:hanging="271"/>
       </w:pPr>
       <w:r>
-        <w:t>Leave monitoring running until the phone discharges to 10%. The app then records the completed calibration.</w:t>
+        <w:t>Leave monitoring running until the phone discharges to 15%. The app then records the completed calibration.</w:t>
       </w:r>
     </w:p>
     <w:p>
@@ -2265,7 +2265,7 @@
         <w:ind w:left="540" w:hanging="271"/>
       </w:pPr>
       <w:r>
-        <w:t>Calibration measures the 99% to 10% discharge range and computes capacity as discharged mAh divided by 0.89.</w:t>
+        <w:t>Calibration measures the 99% to 15% discharge range and computes capacity as discharged mAh divided by 0.84.</w:t>
       </w:r>
     </w:p>
     <w:p>
@@ -2877,7 +2877,7 @@
           </w:tcPr>
           <w:p>
             <w:r>
-              <w:t>Run the guided calibration from 99% down to 10%. Until then, the chart uses the 25%-75% estimate when available.</w:t>
+              <w:t>Run the guided calibration from 99% down to 15%. Until then, the chart uses the 25%-75% estimate when available.</w:t>
             </w:r>
           </w:p>
         </w:tc>

</xml_diff>

<commit_message>
main v1.03 Simplified Batt Cal to allow user Cal immed after reaching 100%. UI changes in the charts, print Bat Cal table if available. Manual updates.
</commit_message>
<xml_diff>
--- a/docs/manual/BatteryCurrent_User_Manual_Preliminary.docx
+++ b/docs/manual/BatteryCurrent_User_Manual_Preliminary.docx
@@ -1281,6 +1281,28 @@
         </w:tc>
       </w:tr>
       <w:tr>
+        <w:tc>
+          <w:tcPr>
+            <w:tcW w:type="dxa" w:w="2700"/>
+          </w:tcPr>
+          <w:p>
+            <w:r>
+              <w:t>25-75 Hist</w:t>
+            </w:r>
+          </w:p>
+        </w:tc>
+        <w:tc>
+          <w:tcPr>
+            <w:tcW w:type="dxa" w:w="6660"/>
+          </w:tcPr>
+          <w:p>
+            <w:r>
+              <w:t>Opens the recent 25%-75% capacity-estimate history. Tap a day in the table to view the events behind that daily value.</w:t>
+            </w:r>
+          </w:p>
+        </w:tc>
+      </w:tr>
+      <w:tr>
         <w:trPr>
           <w:jc w:val="center"/>
         </w:trPr>
@@ -1297,7 +1319,7 @@
           </w:tcPr>
           <w:p>
             <w:r>
-              <w:t>Reset</w:t>
+              <w:t>Clr Data</w:t>
             </w:r>
           </w:p>
         </w:tc>
@@ -1314,7 +1336,7 @@
           </w:tcPr>
           <w:p>
             <w:r>
-              <w:t>Resets the accumulated mAh or mWh value to zero and starts a new graph timeline.</w:t>
+              <w:t>Opens a confirmation prompt to reset the accumulated mAh or mWh value to zero and start a new graph timeline.</w:t>
             </w:r>
           </w:p>
         </w:tc>
@@ -1414,7 +1436,7 @@
           </w:tcPr>
           <w:p>
             <w:r>
-              <w:t>SOC Curve</w:t>
+              <w:t>SOC Lin</w:t>
             </w:r>
           </w:p>
         </w:tc>
@@ -2162,7 +2184,15 @@
         <w:ind w:left="540" w:hanging="271"/>
       </w:pPr>
       <w:r>
-        <w:t>The chart capacity line shows the raw calibration capacity and an adjusted value when a calibration result exists.</w:t>
+        <w:t>When a calibration result exists, the chart capacity line shows both the fixed calibration value and an adjusted value that reflects later trend movement.</w:t>
+      </w:r>
+    </w:p>
+    <w:p>
+      <w:pPr>
+        <w:pStyle w:val="ListBullet"/>
+      </w:pPr>
+      <w:r>
+        <w:t>Tap the 25-75 Hist button to review recent daily values. The list shows the most recent entries first and can be scrolled for older entries.</w:t>
       </w:r>
     </w:p>
     <w:p>
@@ -2205,7 +2235,7 @@
         <w:ind w:left="540" w:hanging="271"/>
       </w:pPr>
       <w:r>
-        <w:t>Leave the phone connected for 5 minutes after it reaches 100%.</w:t>
+        <w:t>Leave the phone connected long enough to fully top off.</w:t>
       </w:r>
     </w:p>
     <w:p>
@@ -2215,7 +2245,7 @@
         <w:ind w:left="540" w:hanging="271"/>
       </w:pPr>
       <w:r>
-        <w:t>Open BatteryCurrent and tap Calibration setup.</w:t>
+        <w:t>Disconnect the charger.</w:t>
       </w:r>
     </w:p>
     <w:p>
@@ -2225,7 +2255,7 @@
         <w:ind w:left="540" w:hanging="271"/>
       </w:pPr>
       <w:r>
-        <w:t>After the disconnect prompt, disconnect the charger.</w:t>
+        <w:t>Open BatteryCurrent and tap Calibration setup, then press Start while Android still reports 100%.</w:t>
       </w:r>
     </w:p>
     <w:p>
@@ -2295,10 +2325,17 @@
         <w:ind w:left="540" w:hanging="271"/>
       </w:pPr>
       <w:r>
-        <w:t>The chart shows Calibration battery capacity [date]: raw mAh and Adj: adjusted mAh. The adjusted value uses the stored 25%-75% trend to nudge the raw calibration anchor until the next calibration run.</w:t>
+        <w:t>The chart shows Calibration battery capacity [date]: raw mAh and Adj: adjusted mAh. The raw value is the fixed result from the last controlled calibration. The adjusted value is a trend-aware estimate that moves gradually as later everyday-use measurements indicate capacity drifting up or down.</w:t>
+        <w:br/>
       </w:r>
+      <w:r/>
+    </w:p>
+    <w:p>
+      <w:pPr>
+        <w:pStyle w:val="ListBullet"/>
+      </w:pPr>
       <w:r>
-        <w:br/>
+        <w:t>Tap the calibration capacity line in the chart to open a compact table of the latest calibration result.</w:t>
       </w:r>
     </w:p>
     <w:p>
@@ -2916,7 +2953,7 @@
           </w:tcPr>
           <w:p>
             <w:r>
-              <w:t>Charge to 100%, wait for the 5 minute float timer, disconnect the charger when prompted, and let the app begin measuring automatically at 99%.</w:t>
+              <w:t>Start only arms calibration when Android reports 100%. Charge fully, press Start while the battery still reads 100%, then disconnect the charger. The app begins measuring automatically at 99%.</w:t>
             </w:r>
           </w:p>
         </w:tc>

</xml_diff>

<commit_message>
main v1.03 Updated screenshots in the manual
</commit_message>
<xml_diff>
--- a/docs/manual/BatteryCurrent_User_Manual_Preliminary.docx
+++ b/docs/manual/BatteryCurrent_User_Manual_Preliminary.docx
@@ -488,6 +488,7 @@
             </w:r>
             <w:r>
               <w:rPr>
+                <w:noProof/>
                 <w:color w:val="555555"/>
                 <w:sz w:val="20"/>
               </w:rPr>
@@ -580,6 +581,7 @@
             </w:r>
             <w:r>
               <w:rPr>
+                <w:noProof/>
                 <w:color w:val="555555"/>
                 <w:sz w:val="20"/>
               </w:rPr>
@@ -1281,19 +1283,25 @@
         </w:tc>
       </w:tr>
       <w:tr>
+        <w:trPr>
+          <w:jc w:val="center"/>
+        </w:trPr>
         <w:tc>
           <w:tcPr>
-            <w:tcW w:type="dxa" w:w="2700"/>
+            <w:tcW w:w="2700" w:type="dxa"/>
           </w:tcPr>
           <w:p>
             <w:r>
-              <w:t>25-75 Hist</w:t>
+              <w:t>Chrg</w:t>
+            </w:r>
+            <w:r>
+              <w:t xml:space="preserve"> Hist</w:t>
             </w:r>
           </w:p>
         </w:tc>
         <w:tc>
           <w:tcPr>
-            <w:tcW w:type="dxa" w:w="6660"/>
+            <w:tcW w:w="6660" w:type="dxa"/>
           </w:tcPr>
           <w:p>
             <w:r>
@@ -1319,7 +1327,7 @@
           </w:tcPr>
           <w:p>
             <w:r>
-              <w:t>Clr Data</w:t>
+              <w:t>ClrData</w:t>
             </w:r>
           </w:p>
         </w:tc>
@@ -1542,15 +1550,11 @@
               <w:br/>
             </w:r>
             <w:r>
-              <w:rPr>
-                <w:color w:val="555555"/>
-                <w:sz w:val="20"/>
-              </w:rPr>
               <w:drawing>
-                <wp:inline distT="0" distB="0" distL="0" distR="0" wp14:anchorId="655813E3" wp14:editId="3C3B6B43">
-                  <wp:extent cx="2346960" cy="3869131"/>
-                  <wp:effectExtent l="0" t="0" r="0" b="0"/>
-                  <wp:docPr id="354858777" name="Picture 1"/>
+                <wp:inline distT="0" distB="0" distL="0" distR="0" wp14:anchorId="3A51DDFC" wp14:editId="2EA72F3F">
+                  <wp:extent cx="2186940" cy="3506333"/>
+                  <wp:effectExtent l="0" t="0" r="3810" b="0"/>
+                  <wp:docPr id="1029770058" name="Picture 1"/>
                   <wp:cNvGraphicFramePr>
                     <a:graphicFrameLocks xmlns:a="http://schemas.openxmlformats.org/drawingml/2006/main" noChangeAspect="1"/>
                   </wp:cNvGraphicFramePr>
@@ -1558,7 +1562,7 @@
                     <a:graphicData uri="http://schemas.openxmlformats.org/drawingml/2006/picture">
                       <pic:pic xmlns:pic="http://schemas.openxmlformats.org/drawingml/2006/picture">
                         <pic:nvPicPr>
-                          <pic:cNvPr id="354858777" name=""/>
+                          <pic:cNvPr id="1029770058" name=""/>
                           <pic:cNvPicPr/>
                         </pic:nvPicPr>
                         <pic:blipFill>
@@ -1570,7 +1574,7 @@
                         <pic:spPr>
                           <a:xfrm>
                             <a:off x="0" y="0"/>
-                            <a:ext cx="2349170" cy="3872774"/>
+                            <a:ext cx="2201062" cy="3528974"/>
                           </a:xfrm>
                           <a:prstGeom prst="rect">
                             <a:avLst/>
@@ -1630,7 +1634,6 @@
                 <w:sz w:val="28"/>
                 <w:szCs w:val="28"/>
               </w:rPr>
-              <w:lastRenderedPageBreak/>
               <w:t>Collapsed graph menu</w:t>
             </w:r>
             <w:r>
@@ -1638,6 +1641,7 @@
             </w:r>
             <w:r>
               <w:rPr>
+                <w:noProof/>
                 <w:color w:val="555555"/>
                 <w:sz w:val="20"/>
               </w:rPr>
@@ -1696,10 +1700,7 @@
               <w:t xml:space="preserve"> exactly</w:t>
             </w:r>
             <w:r>
-              <w:t xml:space="preserve"> - mAh and battery</w:t>
-            </w:r>
-            <w:r>
-              <w:t>%</w:t>
+              <w:t xml:space="preserve"> - mAh and battery%</w:t>
             </w:r>
           </w:p>
           <w:p>
@@ -1772,6 +1773,7 @@
         <w:ind w:left="540" w:hanging="271"/>
       </w:pPr>
       <w:r>
+        <w:lastRenderedPageBreak/>
         <w:t>When Batt % is selected, faint reference lines mark the 25% and 75% capacity-event thresholds.</w:t>
       </w:r>
     </w:p>
@@ -1780,7 +1782,6 @@
         <w:pStyle w:val="Heading1"/>
       </w:pPr>
       <w:r>
-        <w:lastRenderedPageBreak/>
         <w:t>6. Zooming and Moving the Graph</w:t>
       </w:r>
     </w:p>
@@ -2153,6 +2154,7 @@
         <w:ind w:left="540" w:hanging="271"/>
       </w:pPr>
       <w:r>
+        <w:lastRenderedPageBreak/>
         <w:t>A discharge event starts near 75% and completes when it reaches 25%.</w:t>
       </w:r>
     </w:p>
@@ -2163,7 +2165,6 @@
         <w:ind w:left="540" w:hanging="271"/>
       </w:pPr>
       <w:r>
-        <w:lastRenderedPageBreak/>
         <w:t>Plugging or unplugging during a qualifying session cancels that session and waits for the next threshold crossing.</w:t>
       </w:r>
     </w:p>
@@ -2326,9 +2327,10 @@
       </w:pPr>
       <w:r>
         <w:t>The chart shows Calibration battery capacity [date]: raw mAh and Adj: adjusted mAh. The raw value is the fixed result from the last controlled calibration. The adjusted value is a trend-aware estimate that moves gradually as later everyday-use measurements indicate capacity drifting up or down.</w:t>
+      </w:r>
+      <w:r>
         <w:br/>
       </w:r>
-      <w:r/>
     </w:p>
     <w:p>
       <w:pPr>
@@ -2337,21 +2339,6 @@
       <w:r>
         <w:t>Tap the calibration capacity line in the chart to open a compact table of the latest calibration result.</w:t>
       </w:r>
-    </w:p>
-    <w:p>
-      <w:pPr>
-        <w:spacing w:after="200" w:line="276" w:lineRule="auto"/>
-      </w:pPr>
-      <w:r>
-        <w:br w:type="page"/>
-      </w:r>
-    </w:p>
-    <w:p>
-      <w:pPr>
-        <w:pStyle w:val="ListBullet"/>
-        <w:spacing w:after="80"/>
-        <w:ind w:left="540" w:hanging="271"/>
-      </w:pPr>
     </w:p>
     <w:tbl>
       <w:tblPr>
@@ -2387,22 +2374,21 @@
               <w:rPr>
                 <w:b/>
                 <w:color w:val="1F4D78"/>
+                <w:sz w:val="28"/>
+                <w:szCs w:val="28"/>
               </w:rPr>
+              <w:lastRenderedPageBreak/>
               <w:t>Calibration setup dialog</w:t>
             </w:r>
             <w:r>
               <w:br/>
             </w:r>
             <w:r>
-              <w:rPr>
-                <w:color w:val="555555"/>
-                <w:sz w:val="20"/>
-              </w:rPr>
               <w:drawing>
-                <wp:inline distT="0" distB="0" distL="0" distR="0" wp14:anchorId="643D5DBB" wp14:editId="5D903B6E">
-                  <wp:extent cx="2498075" cy="3604260"/>
-                  <wp:effectExtent l="0" t="0" r="0" b="0"/>
-                  <wp:docPr id="125372166" name="Picture 1"/>
+                <wp:inline distT="0" distB="0" distL="0" distR="0" wp14:anchorId="1F4C3CE5" wp14:editId="4AC8D5C3">
+                  <wp:extent cx="2682472" cy="3543607"/>
+                  <wp:effectExtent l="0" t="0" r="3810" b="0"/>
+                  <wp:docPr id="754260737" name="Picture 1"/>
                   <wp:cNvGraphicFramePr>
                     <a:graphicFrameLocks xmlns:a="http://schemas.openxmlformats.org/drawingml/2006/main" noChangeAspect="1"/>
                   </wp:cNvGraphicFramePr>
@@ -2410,7 +2396,7 @@
                     <a:graphicData uri="http://schemas.openxmlformats.org/drawingml/2006/picture">
                       <pic:pic xmlns:pic="http://schemas.openxmlformats.org/drawingml/2006/picture">
                         <pic:nvPicPr>
-                          <pic:cNvPr id="125372166" name=""/>
+                          <pic:cNvPr id="754260737" name=""/>
                           <pic:cNvPicPr/>
                         </pic:nvPicPr>
                         <pic:blipFill>
@@ -2422,7 +2408,7 @@
                         <pic:spPr>
                           <a:xfrm>
                             <a:off x="0" y="0"/>
-                            <a:ext cx="2504437" cy="3613439"/>
+                            <a:ext cx="2682472" cy="3543607"/>
                           </a:xfrm>
                           <a:prstGeom prst="rect">
                             <a:avLst/>
@@ -2546,15 +2532,11 @@
               <w:br/>
             </w:r>
             <w:r>
-              <w:rPr>
-                <w:color w:val="555555"/>
-                <w:sz w:val="20"/>
-              </w:rPr>
               <w:drawing>
-                <wp:inline distT="0" distB="0" distL="0" distR="0" wp14:anchorId="4C3D5E61" wp14:editId="695A7D0D">
-                  <wp:extent cx="2674852" cy="3528366"/>
+                <wp:inline distT="0" distB="0" distL="0" distR="0" wp14:anchorId="26B7294A" wp14:editId="5BB7D02D">
+                  <wp:extent cx="2751058" cy="2941575"/>
                   <wp:effectExtent l="0" t="0" r="0" b="0"/>
-                  <wp:docPr id="1341935115" name="Picture 1"/>
+                  <wp:docPr id="901197039" name="Picture 1"/>
                   <wp:cNvGraphicFramePr>
                     <a:graphicFrameLocks xmlns:a="http://schemas.openxmlformats.org/drawingml/2006/main" noChangeAspect="1"/>
                   </wp:cNvGraphicFramePr>
@@ -2562,7 +2544,7 @@
                     <a:graphicData uri="http://schemas.openxmlformats.org/drawingml/2006/picture">
                       <pic:pic xmlns:pic="http://schemas.openxmlformats.org/drawingml/2006/picture">
                         <pic:nvPicPr>
-                          <pic:cNvPr id="1341935115" name=""/>
+                          <pic:cNvPr id="901197039" name=""/>
                           <pic:cNvPicPr/>
                         </pic:nvPicPr>
                         <pic:blipFill>
@@ -2574,7 +2556,7 @@
                         <pic:spPr>
                           <a:xfrm>
                             <a:off x="0" y="0"/>
-                            <a:ext cx="2674852" cy="3528366"/>
+                            <a:ext cx="2751058" cy="2941575"/>
                           </a:xfrm>
                           <a:prstGeom prst="rect">
                             <a:avLst/>

</xml_diff>

<commit_message>
main v1.03 Option to reset graph when battery% crosses 25% or 75%. Battery state % coloured based on level.
</commit_message>
<xml_diff>
--- a/docs/manual/BatteryCurrent_User_Manual_Preliminary.docx
+++ b/docs/manual/BatteryCurrent_User_Manual_Preliminary.docx
@@ -360,6 +360,28 @@
           <w:p>
             <w:r>
               <w:t>Switches the foreground overlay background for better contrast on different app backgrounds.</w:t>
+            </w:r>
+          </w:p>
+        </w:tc>
+      </w:tr>
+      <w:tr>
+        <w:tc>
+          <w:tcPr>
+            <w:tcW w:type="dxa" w:w="2700"/>
+          </w:tcPr>
+          <w:p>
+            <w:r>
+              <w:t>Reset graph at 25% / 75%</w:t>
+            </w:r>
+          </w:p>
+        </w:tc>
+        <w:tc>
+          <w:tcPr>
+            <w:tcW w:type="dxa" w:w="6660"/>
+          </w:tcPr>
+          <w:p>
+            <w:r>
+              <w:t>Automatically starts a fresh graph segment when battery state crosses 25% or 75%. This reset affects the graph display baseline, not the stored capacity history.</w:t>
             </w:r>
           </w:p>
         </w:tc>
@@ -933,7 +955,7 @@
           </w:tcPr>
           <w:p>
             <w:r>
-              <w:t>Battery state of charge as reported by Android.</w:t>
+              <w:t>Battery state of charge as reported by Android. Battery percent is green above 30%, amber from 15% to 30%, and red below 15%.</w:t>
             </w:r>
           </w:p>
         </w:tc>

</xml_diff>

<commit_message>
main v1.03 Light-theme added for graph displays and associated popups within it.
</commit_message>
<xml_diff>
--- a/docs/manual/BatteryCurrent_User_Manual_Preliminary.docx
+++ b/docs/manual/BatteryCurrent_User_Manual_Preliminary.docx
@@ -359,7 +359,7 @@
           </w:tcPr>
           <w:p>
             <w:r>
-              <w:t>Switches the foreground overlay background for better contrast on different app backgrounds.</w:t>
+              <w:t>Switches the foreground overlay and chart popups to a light beige theme with higher-contrast graph, table, button, and text colors.</w:t>
             </w:r>
           </w:p>
         </w:tc>
@@ -1051,6 +1051,12 @@
     <w:p>
       <w:r>
         <w:t>Tap the foreground display to open the graph popup. The popup shows the main accumulated mAh or mWh trace and an optional right-axis trace.</w:t>
+      </w:r>
+    </w:p>
+    <w:p>
+      <w:pPr/>
+      <w:r>
+        <w:t>If Light-theme foreground display is enabled on the startup page, the graph popup, SOC curve popup, 25%-75% history table, event details, and calibration summary use a light chart theme. The light theme keeps stronger text, button, axis, and trace colors so the chart remains readable on the beige background.</w:t>
       </w:r>
     </w:p>
     <w:tbl>

</xml_diff>

<commit_message>
main v1.03 Added user feature to set capacity thresholds in settings. Min is 40%.
</commit_message>
<xml_diff>
--- a/docs/manual/BatteryCurrent_User_Manual_Preliminary.docx
+++ b/docs/manual/BatteryCurrent_User_Manual_Preliminary.docx
@@ -371,7 +371,7 @@
           </w:tcPr>
           <w:p>
             <w:r>
-              <w:t>Reset graph at 25% / 75%</w:t>
+              <w:t>Reset graph at capacity window</w:t>
             </w:r>
           </w:p>
         </w:tc>
@@ -381,7 +381,7 @@
           </w:tcPr>
           <w:p>
             <w:r>
-              <w:t>Automatically starts a fresh graph segment when charging crosses up through 25% or discharging crosses down through 75%. This reset affects the graph display baseline, not the stored capacity history.</w:t>
+              <w:t>Automatically starts a fresh graph segment when charging crosses up through the low threshold or discharging crosses down through the high threshold. This reset affects the graph display baseline, not the stored capacity history.</w:t>
             </w:r>
           </w:p>
         </w:tc>
@@ -460,6 +460,28 @@
           <w:p>
             <w:r>
               <w:t>Starts or stops the normal monitoring service.</w:t>
+            </w:r>
+          </w:p>
+        </w:tc>
+      </w:tr>
+      <w:tr>
+        <w:tc>
+          <w:tcPr>
+            <w:tcW w:type="dxa" w:w="2700"/>
+          </w:tcPr>
+          <w:p>
+            <w:r>
+              <w:t>Capacity window</w:t>
+            </w:r>
+          </w:p>
+        </w:tc>
+        <w:tc>
+          <w:tcPr>
+            <w:tcW w:type="dxa" w:w="6660"/>
+          </w:tcPr>
+          <w:p>
+            <w:r>
+              <w:t>Sets the low and high battery percentages used for normal capacity estimates, status dots, graph reference lines, and optional graph reset points. The low threshold must be at least 20%, and the window must be at least 40% wide. For example, a 40% to 80% window uses measured mAh multiplied by 2.5.</w:t>
             </w:r>
           </w:p>
         </w:tc>
@@ -1056,7 +1078,7 @@
     <w:p>
       <w:pPr/>
       <w:r>
-        <w:t>If Light-theme foreground display is enabled on the startup page, the graph popup, SOC curve popup, 25%-75% history table, event details, and calibration summary use a light chart theme. The light theme keeps stronger text, button, axis, and trace colors so the chart remains readable on the beige background.</w:t>
+        <w:t>If Light-theme foreground display is enabled on the startup page, the graph popup, SOC curve popup, charge-history table, event details, and calibration summary use a light chart theme. The light theme keeps stronger text, button, axis, and trace colors so the chart remains readable on the beige background.</w:t>
       </w:r>
     </w:p>
     <w:tbl>
@@ -1333,7 +1355,7 @@
           </w:tcPr>
           <w:p>
             <w:r>
-              <w:t>Opens the recent 25%-75% capacity-estimate history. Tap a day in the table to view the events behind that daily value.</w:t>
+              <w:t>Opens the recent capacity-estimate history. Tap a day in the table to view the events behind that daily value.</w:t>
             </w:r>
           </w:p>
         </w:tc>
@@ -1801,8 +1823,7 @@
         <w:ind w:left="540" w:hanging="271"/>
       </w:pPr>
       <w:r>
-        <w:lastRenderedPageBreak/>
-        <w:t>When Batt % is selected, faint reference lines mark the 25% and 75% capacity-event thresholds.</w:t>
+        <w:t>When Batt % is selected, faint reference lines mark the configured low and high capacity-event thresholds.</w:t>
       </w:r>
     </w:p>
     <w:p>
@@ -2162,7 +2183,7 @@
     </w:p>
     <w:p>
       <w:r>
-        <w:t>BatteryCurrent records qualifying charge and discharge sessions in the app private folder. Normal capacity estimates use completed sessions that span the useful 25% to 75% battery range. These estimates are stored and used as trend data, but they play a secondary role once a calibration result exists.</w:t>
+        <w:t>BatteryCurrent records qualifying charge and discharge sessions in the app private folder. Normal capacity estimates use completed sessions that span the user-selected capacity window. The default window is 25% to 75%, but it can be changed on the startup page. These estimates are stored and used as trend data, but they play a secondary role once a calibration result exists.</w:t>
       </w:r>
     </w:p>
     <w:p>
@@ -2172,7 +2193,7 @@
         <w:ind w:left="540" w:hanging="271"/>
       </w:pPr>
       <w:r>
-        <w:t>A charge event starts near 25% and completes when it reaches 75%.</w:t>
+        <w:t>A charge event starts near the low threshold and completes when it reaches the high threshold.</w:t>
       </w:r>
     </w:p>
     <w:p>
@@ -2182,8 +2203,7 @@
         <w:ind w:left="540" w:hanging="271"/>
       </w:pPr>
       <w:r>
-        <w:lastRenderedPageBreak/>
-        <w:t>A discharge event starts near 75% and completes when it reaches 25%.</w:t>
+        <w:t>A discharge event starts near the high threshold and completes when it reaches the low threshold.</w:t>
       </w:r>
     </w:p>
     <w:p>
@@ -2221,7 +2241,7 @@
         <w:pStyle w:val="ListBullet"/>
       </w:pPr>
       <w:r>
-        <w:t>Tap the 25-75 Hist button to review recent daily values. The list shows the most recent entries first and can be scrolled for older entries.</w:t>
+        <w:t>Tap the Chrg Hist button to review recent daily values. The list shows the most recent entries first and can be scrolled for older entries.</w:t>
       </w:r>
     </w:p>
     <w:p>
@@ -2231,7 +2251,7 @@
         <w:ind w:left="540" w:hanging="271"/>
       </w:pPr>
       <w:r>
-        <w:t>If no calibration result exists yet, the chart falls back to showing the 25%-75% extrapolated estimate.</w:t>
+        <w:t>If no calibration result exists yet, the chart falls back to showing the configured-window extrapolated estimate.</w:t>
       </w:r>
     </w:p>
     <w:p>
@@ -2354,7 +2374,7 @@
         <w:ind w:left="540" w:hanging="271"/>
       </w:pPr>
       <w:r>
-        <w:t>The chart shows Calibration battery capacity [date]: raw mAh and Adj: adjusted mAh. The raw value is the fixed result from the last controlled calibration. The adjusted value is a trend-aware estimate that moves gradually as later everyday-use measurements indicate capacity drifting up or down.</w:t>
+        <w:t>The chart shows Calibration battery capacity [date]: raw mAh and Adj: adjusted mAh. When the rated/original capacity is entered, the adjusted value also shows the percent difference from that rating. The raw value is the fixed result from the last controlled calibration. The adjusted value is a trend-aware estimate that moves gradually as later everyday-use measurements indicate capacity drifting up or down.</w:t>
       </w:r>
       <w:r>
         <w:br/>
@@ -2924,7 +2944,7 @@
           </w:tcPr>
           <w:p>
             <w:r>
-              <w:t>Run the guided calibration from 99% down to 15%. Until then, the chart uses the 25%-75% estimate when available.</w:t>
+              <w:t>Run the guided calibration from 99% down to 15%. Until then, the chart uses the configured-window estimate when available.</w:t>
             </w:r>
           </w:p>
         </w:tc>

</xml_diff>

<commit_message>
main v1.03 User feature - have elapsed vs actual clock time. Moved some info into Stats page.
</commit_message>
<xml_diff>
--- a/docs/manual/BatteryCurrent_User_Manual_Preliminary.docx
+++ b/docs/manual/BatteryCurrent_User_Manual_Preliminary.docx
@@ -1339,34 +1339,6 @@
         <w:tc>
           <w:tcPr>
             <w:tcW w:w="2700" w:type="dxa"/>
-          </w:tcPr>
-          <w:p>
-            <w:r>
-              <w:t>Chrg</w:t>
-            </w:r>
-            <w:r>
-              <w:t xml:space="preserve"> Hist</w:t>
-            </w:r>
-          </w:p>
-        </w:tc>
-        <w:tc>
-          <w:tcPr>
-            <w:tcW w:w="6660" w:type="dxa"/>
-          </w:tcPr>
-          <w:p>
-            <w:r>
-              <w:t>Opens the recent capacity-estimate history. Tap a day in the table to view the events behind that daily value.</w:t>
-            </w:r>
-          </w:p>
-        </w:tc>
-      </w:tr>
-      <w:tr>
-        <w:trPr>
-          <w:jc w:val="center"/>
-        </w:trPr>
-        <w:tc>
-          <w:tcPr>
-            <w:tcW w:w="2700" w:type="dxa"/>
             <w:tcBorders>
               <w:top w:val="single" w:sz="8" w:space="0" w:color="D9E2EC"/>
               <w:left w:val="single" w:sz="8" w:space="0" w:color="D9E2EC"/>
@@ -1494,45 +1466,6 @@
           </w:tcPr>
           <w:p>
             <w:r>
-              <w:t>SOC Lin</w:t>
-            </w:r>
-          </w:p>
-        </w:tc>
-        <w:tc>
-          <w:tcPr>
-            <w:tcW w:w="6660" w:type="dxa"/>
-            <w:tcBorders>
-              <w:top w:val="single" w:sz="8" w:space="0" w:color="D9E2EC"/>
-              <w:left w:val="single" w:sz="8" w:space="0" w:color="D9E2EC"/>
-              <w:bottom w:val="single" w:sz="8" w:space="0" w:color="D9E2EC"/>
-              <w:right w:val="single" w:sz="8" w:space="0" w:color="D9E2EC"/>
-            </w:tcBorders>
-            <w:vAlign w:val="center"/>
-          </w:tcPr>
-          <w:p>
-            <w:r>
-              <w:t>Opens the learned state-of-charge linearity view.</w:t>
-            </w:r>
-          </w:p>
-        </w:tc>
-      </w:tr>
-      <w:tr>
-        <w:trPr>
-          <w:jc w:val="center"/>
-        </w:trPr>
-        <w:tc>
-          <w:tcPr>
-            <w:tcW w:w="2700" w:type="dxa"/>
-            <w:tcBorders>
-              <w:top w:val="single" w:sz="8" w:space="0" w:color="D9E2EC"/>
-              <w:left w:val="single" w:sz="8" w:space="0" w:color="D9E2EC"/>
-              <w:bottom w:val="single" w:sz="8" w:space="0" w:color="D9E2EC"/>
-              <w:right w:val="single" w:sz="8" w:space="0" w:color="D9E2EC"/>
-            </w:tcBorders>
-            <w:vAlign w:val="center"/>
-          </w:tcPr>
-          <w:p>
-            <w:r>
               <w:t>Collapse arrow</w:t>
             </w:r>
           </w:p>
@@ -1551,6 +1484,50 @@
           <w:p>
             <w:r>
               <w:t>Collapses or expands the menu buttons so the user can leave only the graph visible.</w:t>
+            </w:r>
+          </w:p>
+        </w:tc>
+      </w:tr>
+      <w:tr>
+        <w:tc>
+          <w:tcPr>
+            <w:tcW w:type="dxa" w:w="2700"/>
+          </w:tcPr>
+          <w:p>
+            <w:r>
+              <w:t>Stats</w:t>
+            </w:r>
+          </w:p>
+        </w:tc>
+        <w:tc>
+          <w:tcPr>
+            <w:tcW w:type="dxa" w:w="6660"/>
+          </w:tcPr>
+          <w:p>
+            <w:r>
+              <w:t>Opens a separate statistics page with equivalent charge/discharge cycles, average C-rate, raw capacity, capacity normalized to a 0.2C reference current, and shortcuts to Charge History and SOC Linearity.</w:t>
+            </w:r>
+          </w:p>
+        </w:tc>
+      </w:tr>
+      <w:tr>
+        <w:tc>
+          <w:tcPr>
+            <w:tcW w:type="dxa" w:w="2700"/>
+          </w:tcPr>
+          <w:p>
+            <w:r>
+              <w:t>12h / 24h</w:t>
+            </w:r>
+          </w:p>
+        </w:tc>
+        <w:tc>
+          <w:tcPr>
+            <w:tcW w:type="dxa" w:w="6660"/>
+          </w:tcPr>
+          <w:p>
+            <w:r>
+              <w:t>Switches clock-time x-axis labels between 12-hour and 24-hour format. Long-press the x-axis to switch between elapsed time and clock time.</w:t>
             </w:r>
           </w:p>
         </w:tc>
@@ -1823,7 +1800,7 @@
         <w:ind w:left="540" w:hanging="271"/>
       </w:pPr>
       <w:r>
-        <w:t>When Batt % is selected, faint reference lines mark the configured low and high capacity-event thresholds.</w:t>
+        <w:t>When Batt % is selected, faint reference lines mark the configured low and high capacity-event thresholds. Long-press the x-axis labels to switch between elapsed time and actual clock time. The 12h/24h button controls clock label format.</w:t>
       </w:r>
     </w:p>
     <w:p>
@@ -2241,7 +2218,7 @@
         <w:pStyle w:val="ListBullet"/>
       </w:pPr>
       <w:r>
-        <w:t>Tap the Chrg Hist button to review recent daily values. The list shows the most recent entries first and can be scrolled for older entries.</w:t>
+        <w:t>Tap the Stats button to review equivalent full cycles and capacity statistics. The 0.2C-normalized capacity uses the battery capacity reference and learned load sensitivity so low-current discharge is not treated as directly equivalent to higher-current discharge. The Stats page also contains shortcuts for Charge History and SOC Linearity, keeping the main graph controls less crowded.</w:t>
       </w:r>
     </w:p>
     <w:p>

</xml_diff>

<commit_message>
main dev-1.05 user manual updated for v1.05, + user manual link in settings, release script
</commit_message>
<xml_diff>
--- a/docs/manual/BatteryCurrent_User_Manual_Preliminary.docx
+++ b/docs/manual/BatteryCurrent_User_Manual_Preliminary.docx
@@ -365,9 +365,12 @@
         </w:tc>
       </w:tr>
       <w:tr>
+        <w:trPr>
+          <w:jc w:val="center"/>
+        </w:trPr>
         <w:tc>
           <w:tcPr>
-            <w:tcW w:type="dxa" w:w="2700"/>
+            <w:tcW w:w="2700" w:type="dxa"/>
           </w:tcPr>
           <w:p>
             <w:r>
@@ -377,7 +380,7 @@
         </w:tc>
         <w:tc>
           <w:tcPr>
-            <w:tcW w:type="dxa" w:w="6660"/>
+            <w:tcW w:w="6660" w:type="dxa"/>
           </w:tcPr>
           <w:p>
             <w:r>
@@ -465,9 +468,12 @@
         </w:tc>
       </w:tr>
       <w:tr>
+        <w:trPr>
+          <w:jc w:val="center"/>
+        </w:trPr>
         <w:tc>
           <w:tcPr>
-            <w:tcW w:type="dxa" w:w="2700"/>
+            <w:tcW w:w="2700" w:type="dxa"/>
           </w:tcPr>
           <w:p>
             <w:r>
@@ -477,7 +483,7 @@
         </w:tc>
         <w:tc>
           <w:tcPr>
-            <w:tcW w:type="dxa" w:w="6660"/>
+            <w:tcW w:w="6660" w:type="dxa"/>
           </w:tcPr>
           <w:p>
             <w:r>
@@ -614,6 +620,7 @@
                 <w:sz w:val="28"/>
                 <w:szCs w:val="28"/>
               </w:rPr>
+              <w:lastRenderedPageBreak/>
               <w:t>Foreground display</w:t>
             </w:r>
             <w:r>
@@ -1067,6 +1074,7 @@
         <w:pStyle w:val="Heading1"/>
       </w:pPr>
       <w:r>
+        <w:lastRenderedPageBreak/>
         <w:t>4. Graph Popup</w:t>
       </w:r>
     </w:p>
@@ -1076,7 +1084,6 @@
       </w:r>
     </w:p>
     <w:p>
-      <w:pPr/>
       <w:r>
         <w:t>If Light-theme foreground display is enabled on the startup page, the graph popup, SOC curve popup, charge-history table, event details, and calibration summary use a light chart theme. The light theme keeps stronger text, button, axis, and trace colors so the chart remains readable on the beige background.</w:t>
       </w:r>
@@ -1270,7 +1277,6 @@
           </w:tcPr>
           <w:p>
             <w:r>
-              <w:lastRenderedPageBreak/>
               <w:t>Lock / Unlock</w:t>
             </w:r>
           </w:p>
@@ -1348,9 +1354,11 @@
             <w:vAlign w:val="center"/>
           </w:tcPr>
           <w:p>
+            <w:proofErr w:type="spellStart"/>
             <w:r>
               <w:t>ClrData</w:t>
             </w:r>
+            <w:proofErr w:type="spellEnd"/>
           </w:p>
         </w:tc>
         <w:tc>
@@ -1489,9 +1497,12 @@
         </w:tc>
       </w:tr>
       <w:tr>
+        <w:trPr>
+          <w:jc w:val="center"/>
+        </w:trPr>
         <w:tc>
           <w:tcPr>
-            <w:tcW w:type="dxa" w:w="2700"/>
+            <w:tcW w:w="2700" w:type="dxa"/>
           </w:tcPr>
           <w:p>
             <w:r>
@@ -1501,7 +1512,7 @@
         </w:tc>
         <w:tc>
           <w:tcPr>
-            <w:tcW w:type="dxa" w:w="6660"/>
+            <w:tcW w:w="6660" w:type="dxa"/>
           </w:tcPr>
           <w:p>
             <w:r>
@@ -1511,9 +1522,12 @@
         </w:tc>
       </w:tr>
       <w:tr>
+        <w:trPr>
+          <w:jc w:val="center"/>
+        </w:trPr>
         <w:tc>
           <w:tcPr>
-            <w:tcW w:type="dxa" w:w="2700"/>
+            <w:tcW w:w="2700" w:type="dxa"/>
           </w:tcPr>
           <w:p>
             <w:r>
@@ -1523,13 +1537,14 @@
         </w:tc>
         <w:tc>
           <w:tcPr>
-            <w:tcW w:type="dxa" w:w="6660"/>
+            <w:tcW w:w="6660" w:type="dxa"/>
           </w:tcPr>
           <w:p>
             <w:r>
               <w:t>Switches clock-time x-axis labels between 12-hour and 24-hour format. Long-press the x-axis to switch between elapsed time and clock time.</w:t>
             </w:r>
           </w:p>
+          <w:p/>
         </w:tc>
       </w:tr>
     </w:tbl>
@@ -1545,6 +1560,7 @@
       </w:tblGrid>
       <w:tr>
         <w:trPr>
+          <w:trHeight w:val="9043"/>
           <w:jc w:val="center"/>
         </w:trPr>
         <w:tc>
@@ -1571,16 +1587,20 @@
                 <w:sz w:val="28"/>
                 <w:szCs w:val="28"/>
               </w:rPr>
+              <w:lastRenderedPageBreak/>
               <w:t>Graph popup</w:t>
             </w:r>
             <w:r>
               <w:br/>
             </w:r>
             <w:r>
+              <w:rPr>
+                <w:noProof/>
+              </w:rPr>
               <w:drawing>
-                <wp:inline distT="0" distB="0" distL="0" distR="0" wp14:anchorId="3A51DDFC" wp14:editId="2EA72F3F">
-                  <wp:extent cx="2186940" cy="3506333"/>
-                  <wp:effectExtent l="0" t="0" r="3810" b="0"/>
+                <wp:inline distT="0" distB="0" distL="0" distR="0" wp14:anchorId="3A51DDFC" wp14:editId="7162E922">
+                  <wp:extent cx="2827020" cy="4532576"/>
+                  <wp:effectExtent l="0" t="0" r="0" b="1905"/>
                   <wp:docPr id="1029770058" name="Picture 1"/>
                   <wp:cNvGraphicFramePr>
                     <a:graphicFrameLocks xmlns:a="http://schemas.openxmlformats.org/drawingml/2006/main" noChangeAspect="1"/>
@@ -1601,7 +1621,7 @@
                         <pic:spPr>
                           <a:xfrm>
                             <a:off x="0" y="0"/>
-                            <a:ext cx="2201062" cy="3528974"/>
+                            <a:ext cx="2847918" cy="4566081"/>
                           </a:xfrm>
                           <a:prstGeom prst="rect">
                             <a:avLst/>
@@ -1617,6 +1637,17 @@
         </w:tc>
       </w:tr>
     </w:tbl>
+    <w:p/>
+    <w:p/>
+    <w:p/>
+    <w:p/>
+    <w:p/>
+    <w:p/>
+    <w:p/>
+    <w:p/>
+    <w:p/>
+    <w:p/>
+    <w:p/>
     <w:p/>
     <w:tbl>
       <w:tblPr>
@@ -1780,6 +1811,7 @@
         <w:ind w:left="540" w:hanging="271"/>
       </w:pPr>
       <w:r>
+        <w:lastRenderedPageBreak/>
         <w:t>For mA mode, positive current is light green and negative current is orange, with a dashed zero-current reference line.</w:t>
       </w:r>
     </w:p>
@@ -2155,6 +2187,7 @@
         <w:pStyle w:val="Heading1"/>
       </w:pPr>
       <w:r>
+        <w:lastRenderedPageBreak/>
         <w:t>8. Battery Capacity Event Logging</w:t>
       </w:r>
     </w:p>
@@ -2331,6 +2364,7 @@
         <w:ind w:left="540" w:hanging="271"/>
       </w:pPr>
       <w:r>
+        <w:lastRenderedPageBreak/>
         <w:t>If the charger is connected after measurement begins, the service is stopped, or the measurement is interrupted, the calibration is stopped and no incomplete row is written.</w:t>
       </w:r>
     </w:p>
@@ -2351,7 +2385,15 @@
         <w:ind w:left="540" w:hanging="271"/>
       </w:pPr>
       <w:r>
-        <w:t>The chart shows Calibration battery capacity [date]: raw mAh and Adj: adjusted mAh. When the rated/original capacity is entered, the adjusted value also shows the percent difference from that rating. The raw value is the fixed result from the last controlled calibration. The adjusted value is a trend-aware estimate that moves gradually as later everyday-use measurements indicate capacity drifting up or down.</w:t>
+        <w:t xml:space="preserve">The chart shows Calibration battery capacity [date]: raw mAh and Adj: adjusted mAh. When the rated/original capacity is entered, the adjusted value also shows the percent difference from that rating. The raw value is the fixed result from the last controlled calibration. The adjusted value is a trend-aware estimate that moves gradually as later </w:t>
+      </w:r>
+      <w:proofErr w:type="spellStart"/>
+      <w:r>
+        <w:t>everyday</w:t>
+      </w:r>
+      <w:proofErr w:type="spellEnd"/>
+      <w:r>
+        <w:t>-use measurements indicate capacity drifting up or down.</w:t>
       </w:r>
       <w:r>
         <w:br/>
@@ -2402,13 +2444,15 @@
                 <w:sz w:val="28"/>
                 <w:szCs w:val="28"/>
               </w:rPr>
-              <w:lastRenderedPageBreak/>
               <w:t>Calibration setup dialog</w:t>
             </w:r>
             <w:r>
               <w:br/>
             </w:r>
             <w:r>
+              <w:rPr>
+                <w:noProof/>
+              </w:rPr>
               <w:drawing>
                 <wp:inline distT="0" distB="0" distL="0" distR="0" wp14:anchorId="1F4C3CE5" wp14:editId="4AC8D5C3">
                   <wp:extent cx="2682472" cy="3543607"/>
@@ -2470,6 +2514,7 @@
         <w:ind w:left="540" w:hanging="271"/>
       </w:pPr>
       <w:r>
+        <w:lastRenderedPageBreak/>
         <w:t>SOC bucket data is collected during normal discharge, including during calibration.</w:t>
       </w:r>
     </w:p>
@@ -2510,7 +2555,15 @@
         <w:ind w:left="540" w:hanging="271"/>
       </w:pPr>
       <w:r>
-        <w:t>This load-sensitivity value is best treated as a phone-specific load sensitivity index, not a laboratory Peukert constant.</w:t>
+        <w:t xml:space="preserve">This load-sensitivity value is best treated as a phone-specific load sensitivity index, not a laboratory </w:t>
+      </w:r>
+      <w:proofErr w:type="spellStart"/>
+      <w:r>
+        <w:t>Peukert</w:t>
+      </w:r>
+      <w:proofErr w:type="spellEnd"/>
+      <w:r>
+        <w:t xml:space="preserve"> constant.</w:t>
       </w:r>
     </w:p>
     <w:tbl>
@@ -2550,13 +2603,15 @@
                 <w:sz w:val="28"/>
                 <w:szCs w:val="28"/>
               </w:rPr>
-              <w:lastRenderedPageBreak/>
               <w:t>SOC curve popup</w:t>
             </w:r>
             <w:r>
               <w:br/>
             </w:r>
             <w:r>
+              <w:rPr>
+                <w:noProof/>
+              </w:rPr>
               <w:drawing>
                 <wp:inline distT="0" distB="0" distL="0" distR="0" wp14:anchorId="26B7294A" wp14:editId="5BB7D02D">
                   <wp:extent cx="2751058" cy="2941575"/>
@@ -2638,7 +2693,16 @@
         <w:ind w:left="540" w:hanging="271"/>
       </w:pPr>
       <w:r>
-        <w:t>Private app data should survive normal in-place app updates, but uninstalling the app or installing with a mismatched signing key can remove the stored data.</w:t>
+        <w:lastRenderedPageBreak/>
+        <w:t xml:space="preserve">Private app data should survive normal in-place app updates, but </w:t>
+      </w:r>
+      <w:proofErr w:type="gramStart"/>
+      <w:r>
+        <w:t>uninstalling</w:t>
+      </w:r>
+      <w:proofErr w:type="gramEnd"/>
+      <w:r>
+        <w:t xml:space="preserve"> the app or installing with a mismatched signing key can remove the stored data.</w:t>
       </w:r>
     </w:p>
     <w:p>
@@ -2804,7 +2868,15 @@
           </w:tcPr>
           <w:p>
             <w:r>
-              <w:t>Use Reset foreground display to centre from the startup page, or open the graph popup and tap Unlock if the overlay is locked.</w:t>
+              <w:t xml:space="preserve">Use Reset foreground display to </w:t>
+            </w:r>
+            <w:proofErr w:type="spellStart"/>
+            <w:r>
+              <w:t>centre</w:t>
+            </w:r>
+            <w:proofErr w:type="spellEnd"/>
+            <w:r>
+              <w:t xml:space="preserve"> from the startup page, or open the graph popup and tap Unlock if the overlay is locked.</w:t>
             </w:r>
           </w:p>
         </w:tc>
@@ -2865,7 +2937,15 @@
           </w:tcPr>
           <w:p>
             <w:r>
-              <w:t>No capacity estimate yet</w:t>
+              <w:t xml:space="preserve">No capacity </w:t>
+            </w:r>
+            <w:proofErr w:type="gramStart"/>
+            <w:r>
+              <w:t>estimate</w:t>
+            </w:r>
+            <w:proofErr w:type="gramEnd"/>
+            <w:r>
+              <w:t xml:space="preserve"> yet</w:t>
             </w:r>
           </w:p>
         </w:tc>
@@ -2904,7 +2984,15 @@
           </w:tcPr>
           <w:p>
             <w:r>
-              <w:t>No calibration result yet</w:t>
+              <w:t xml:space="preserve">No calibration </w:t>
+            </w:r>
+            <w:proofErr w:type="gramStart"/>
+            <w:r>
+              <w:t>result</w:t>
+            </w:r>
+            <w:proofErr w:type="gramEnd"/>
+            <w:r>
+              <w:t xml:space="preserve"> yet</w:t>
             </w:r>
           </w:p>
         </w:tc>
@@ -3056,6 +3144,52 @@
     <w:p>
       <w:r>
         <w:t>This manual is preliminary. Before public release, update screenshots, confirm terminology, add Play Store installation notes, and verify any privacy wording against the final app behavior.</w:t>
+      </w:r>
+    </w:p>
+    <w:p>
+      <w:pPr>
+        <w:pStyle w:val="Heading1"/>
+      </w:pPr>
+      <w:r>
+        <w:t>14. Recent Updates</w:t>
+      </w:r>
+    </w:p>
+    <w:p>
+      <w:r>
+        <w:t>The startup page now includes a User manual link that opens https://www.analogwings.com/batterycurrent/BC_userman.pdf.</w:t>
+      </w:r>
+    </w:p>
+    <w:p>
+      <w:pPr>
+        <w:pStyle w:val="ListBullet"/>
+      </w:pPr>
+      <w:r>
+        <w:t>Charge History event details allow dubious programmable-window capacity events to be excluded from averages and later restored without deleting the raw event record.</w:t>
+      </w:r>
+    </w:p>
+    <w:p>
+      <w:pPr>
+        <w:pStyle w:val="ListBullet"/>
+      </w:pPr>
+      <w:r>
+        <w:lastRenderedPageBreak/>
+        <w:t>Excluded events are ignored by daily averages, moving averages, and load-sensitivity calculations, but remain visible for audit.</w:t>
+      </w:r>
+    </w:p>
+    <w:p>
+      <w:pPr>
+        <w:pStyle w:val="ListBullet"/>
+      </w:pPr>
+      <w:r>
+        <w:t>The SOC curve keeps the graph readable by displaying a balanced sample of recent points while preserving bucket averages across the full SOC range.</w:t>
+      </w:r>
+    </w:p>
+    <w:p>
+      <w:pPr>
+        <w:pStyle w:val="ListBullet"/>
+      </w:pPr>
+      <w:r>
+        <w:t>The 90% to 100% SOC bucket is deliberately strict and is learned only from discharge segments that start at a reported 100% and complete to 90%, because saturation time at 100% can distort this region.</w:t>
       </w:r>
     </w:p>
     <w:sectPr>

</xml_diff>